<commit_message>
Update on Task1 result
</commit_message>
<xml_diff>
--- a/FTEC4003 Project Report.docx
+++ b/FTEC4003 Project Report.docx
@@ -42,7 +42,7 @@
                     <pic:cNvPicPr/>
                   </pic:nvPicPr>
                   <pic:blipFill>
-                    <a:blip r:embed="rId5">
+                    <a:blip r:embed="rId7">
                       <a:extLst>
                         <a:ext uri="{28A0092B-C50C-407E-A947-70E740481C1C}">
                           <a14:useLocalDpi xmlns:a14="http://schemas.microsoft.com/office/drawing/2010/main" val="0"/>
@@ -128,18 +128,1989 @@
     <w:p>
       <w:pPr>
         <w:pStyle w:val="Heading1"/>
+        <w:rPr>
+          <w:b/>
+          <w:bCs/>
+        </w:rPr>
+      </w:pPr>
+      <w:r>
+        <w:rPr>
+          <w:b/>
+          <w:bCs/>
+        </w:rPr>
+        <w:lastRenderedPageBreak/>
+        <w:t>Introduction</w:t>
+      </w:r>
+    </w:p>
+    <w:p>
+      <w:pPr>
+        <w:spacing w:before="120" w:after="120" w:line="240" w:lineRule="auto"/>
+        <w:rPr>
+          <w:rFonts w:eastAsia="Times New Roman" w:cs="Times New Roman"/>
+          <w:color w:val="000000"/>
+          <w:kern w:val="0"/>
+          <w14:ligatures w14:val="none"/>
+        </w:rPr>
+      </w:pPr>
+      <w:r>
+        <w:rPr>
+          <w:rFonts w:eastAsia="Times New Roman" w:cs="Times New Roman"/>
+          <w:color w:val="000000"/>
+          <w:kern w:val="0"/>
+          <w14:ligatures w14:val="none"/>
+        </w:rPr>
+        <w:t>This report presents the outcomes of a two-task machine learning project focused on financial risk assessment using data mining techniques. The project demonstrates the application of supervised classification methods to address two distinct but complementary challenges in the FinTech domain: identifying anomalous transactions and modeling marketplace risk.</w:t>
+      </w:r>
+    </w:p>
+    <w:p>
+      <w:pPr>
+        <w:spacing w:before="120" w:after="120" w:line="240" w:lineRule="auto"/>
+        <w:rPr>
+          <w:rFonts w:eastAsia="Times New Roman" w:cs="Times New Roman"/>
+          <w:color w:val="000000"/>
+          <w:kern w:val="0"/>
+          <w14:ligatures w14:val="none"/>
+        </w:rPr>
+      </w:pPr>
+      <w:r>
+        <w:rPr>
+          <w:rFonts w:eastAsia="Times New Roman" w:cs="Times New Roman"/>
+          <w:color w:val="000000"/>
+          <w:kern w:val="0"/>
+          <w14:ligatures w14:val="none"/>
+        </w:rPr>
+        <w:t>The primary objective is to develop robust machine learning models that can effectively identify fraudulent or anomalous patterns in financial transactions while maintaining interpretability and practical deployment feasibility. This foundational work establishes the basis for more advanced risk modeling techniques</w:t>
+      </w:r>
+    </w:p>
+    <w:p/>
+    <w:p>
+      <w:pPr>
+        <w:rPr>
+          <w:rFonts w:asciiTheme="majorHAnsi" w:eastAsiaTheme="majorEastAsia" w:hAnsiTheme="majorHAnsi" w:cstheme="majorBidi"/>
+          <w:color w:val="0F4761" w:themeColor="accent1" w:themeShade="BF"/>
+          <w:sz w:val="40"/>
+          <w:szCs w:val="40"/>
+        </w:rPr>
+      </w:pPr>
+      <w:r>
+        <w:br w:type="page"/>
+      </w:r>
+    </w:p>
+    <w:p>
+      <w:pPr>
+        <w:pStyle w:val="Heading1"/>
         <w:numPr>
           <w:ilvl w:val="0"/>
           <w:numId w:val="1"/>
         </w:numPr>
-      </w:pPr>
-      <w:r>
+        <w:ind w:left="426" w:hanging="437"/>
+        <w:rPr>
+          <w:b/>
+          <w:bCs/>
+        </w:rPr>
+      </w:pPr>
+      <w:r>
+        <w:rPr>
+          <w:b/>
+          <w:bCs/>
+        </w:rPr>
         <w:lastRenderedPageBreak/>
         <w:t>Task 1</w:t>
       </w:r>
-    </w:p>
+      <w:r>
+        <w:rPr>
+          <w:b/>
+          <w:bCs/>
+        </w:rPr>
+        <w:t>: Anomalous Transaction Identification</w:t>
+      </w:r>
+    </w:p>
+    <w:p>
+      <w:pPr>
+        <w:pStyle w:val="Heading2"/>
+        <w:numPr>
+          <w:ilvl w:val="0"/>
+          <w:numId w:val="2"/>
+        </w:numPr>
+        <w:rPr>
+          <w:b/>
+          <w:bCs/>
+        </w:rPr>
+      </w:pPr>
+      <w:r>
+        <w:rPr>
+          <w:b/>
+          <w:bCs/>
+        </w:rPr>
+        <w:t>Overview</w:t>
+      </w:r>
+    </w:p>
+    <w:p>
+      <w:pPr>
+        <w:spacing w:before="120" w:after="120" w:line="240" w:lineRule="auto"/>
+        <w:rPr>
+          <w:rFonts w:eastAsia="Times New Roman" w:cs="Times New Roman"/>
+          <w:color w:val="000000"/>
+          <w:kern w:val="0"/>
+          <w14:ligatures w14:val="none"/>
+        </w:rPr>
+      </w:pPr>
+      <w:r>
+        <w:rPr>
+          <w:rFonts w:eastAsia="Times New Roman" w:cs="Times New Roman"/>
+          <w:color w:val="000000"/>
+          <w:kern w:val="0"/>
+          <w14:ligatures w14:val="none"/>
+        </w:rPr>
+        <w:t>FinSecure, an emerging FinTech company providing digital wallet and online payment services, requires a preliminary machine learning model to identify potentially anomalous transactions for further review. The core challenge is to build a binary classifier capable of distinguishing between normal (class 0) and anomalous (class 1) transactions.</w:t>
+      </w:r>
+    </w:p>
+    <w:p>
+      <w:pPr>
+        <w:spacing w:before="120" w:after="120" w:line="240" w:lineRule="auto"/>
+        <w:rPr>
+          <w:rFonts w:eastAsia="Times New Roman" w:cs="Times New Roman"/>
+          <w:color w:val="000000"/>
+          <w:kern w:val="0"/>
+          <w14:ligatures w14:val="none"/>
+        </w:rPr>
+      </w:pPr>
+      <w:r>
+        <w:rPr>
+          <w:rFonts w:eastAsia="Times New Roman" w:cs="Times New Roman"/>
+          <w:b/>
+          <w:bCs/>
+          <w:color w:val="000000"/>
+          <w:kern w:val="0"/>
+          <w14:ligatures w14:val="none"/>
+        </w:rPr>
+        <w:t>Key Characteristics</w:t>
+      </w:r>
+      <w:r>
+        <w:rPr>
+          <w:rFonts w:eastAsia="Times New Roman" w:cs="Times New Roman"/>
+          <w:color w:val="000000"/>
+          <w:kern w:val="0"/>
+          <w14:ligatures w14:val="none"/>
+        </w:rPr>
+        <w:t>:</w:t>
+      </w:r>
+    </w:p>
+    <w:p>
+      <w:pPr>
+        <w:numPr>
+          <w:ilvl w:val="0"/>
+          <w:numId w:val="3"/>
+        </w:numPr>
+        <w:spacing w:after="0" w:line="240" w:lineRule="auto"/>
+        <w:textAlignment w:val="baseline"/>
+        <w:rPr>
+          <w:rFonts w:eastAsia="Times New Roman" w:cs="Times New Roman"/>
+          <w:color w:val="000000"/>
+          <w:kern w:val="0"/>
+          <w14:ligatures w14:val="none"/>
+        </w:rPr>
+      </w:pPr>
+      <w:r>
+        <w:rPr>
+          <w:rFonts w:eastAsia="Times New Roman" w:cs="Times New Roman"/>
+          <w:color w:val="000000"/>
+          <w:kern w:val="0"/>
+          <w14:ligatures w14:val="none"/>
+        </w:rPr>
+        <w:t>Binary classification problem (normal vs. anomalous)</w:t>
+      </w:r>
+    </w:p>
+    <w:p>
+      <w:pPr>
+        <w:numPr>
+          <w:ilvl w:val="0"/>
+          <w:numId w:val="3"/>
+        </w:numPr>
+        <w:spacing w:after="0" w:line="240" w:lineRule="auto"/>
+        <w:textAlignment w:val="baseline"/>
+        <w:rPr>
+          <w:rFonts w:eastAsia="Times New Roman" w:cs="Times New Roman"/>
+          <w:color w:val="000000"/>
+          <w:kern w:val="0"/>
+          <w14:ligatures w14:val="none"/>
+        </w:rPr>
+      </w:pPr>
+      <w:r>
+        <w:rPr>
+          <w:rFonts w:eastAsia="Times New Roman" w:cs="Times New Roman"/>
+          <w:color w:val="000000"/>
+          <w:kern w:val="0"/>
+          <w14:ligatures w14:val="none"/>
+        </w:rPr>
+        <w:t>Imbalanced dataset with minority anomalous class</w:t>
+      </w:r>
+    </w:p>
+    <w:p>
+      <w:pPr>
+        <w:numPr>
+          <w:ilvl w:val="0"/>
+          <w:numId w:val="3"/>
+        </w:numPr>
+        <w:spacing w:after="0" w:line="240" w:lineRule="auto"/>
+        <w:textAlignment w:val="baseline"/>
+        <w:rPr>
+          <w:rFonts w:eastAsia="Times New Roman" w:cs="Times New Roman"/>
+          <w:color w:val="000000"/>
+          <w:kern w:val="0"/>
+          <w14:ligatures w14:val="none"/>
+        </w:rPr>
+      </w:pPr>
+      <w:r>
+        <w:rPr>
+          <w:rFonts w:eastAsia="Times New Roman" w:cs="Times New Roman"/>
+          <w:color w:val="000000"/>
+          <w:kern w:val="0"/>
+          <w14:ligatures w14:val="none"/>
+        </w:rPr>
+        <w:t>30 numerical features (TimeElapsed, F1-F28, Amount)</w:t>
+      </w:r>
+    </w:p>
+    <w:p>
+      <w:pPr>
+        <w:numPr>
+          <w:ilvl w:val="0"/>
+          <w:numId w:val="3"/>
+        </w:numPr>
+        <w:spacing w:after="0" w:line="240" w:lineRule="auto"/>
+        <w:textAlignment w:val="baseline"/>
+        <w:rPr>
+          <w:rFonts w:eastAsia="Times New Roman" w:cs="Times New Roman"/>
+          <w:color w:val="000000"/>
+          <w:kern w:val="0"/>
+          <w14:ligatures w14:val="none"/>
+        </w:rPr>
+      </w:pPr>
+      <w:r>
+        <w:rPr>
+          <w:rFonts w:eastAsia="Times New Roman" w:cs="Times New Roman"/>
+          <w:color w:val="000000"/>
+          <w:kern w:val="0"/>
+          <w14:ligatures w14:val="none"/>
+        </w:rPr>
+        <w:t>Training set: 9</w:t>
+      </w:r>
+      <w:r>
+        <w:rPr>
+          <w:rFonts w:eastAsia="Times New Roman" w:cs="Times New Roman"/>
+          <w:color w:val="000000"/>
+          <w:kern w:val="0"/>
+          <w14:ligatures w14:val="none"/>
+        </w:rPr>
+        <w:t>,</w:t>
+      </w:r>
+      <w:r>
+        <w:rPr>
+          <w:rFonts w:eastAsia="Times New Roman" w:cs="Times New Roman"/>
+          <w:color w:val="000000"/>
+          <w:kern w:val="0"/>
+          <w14:ligatures w14:val="none"/>
+        </w:rPr>
+        <w:t>840 transactions (9</w:t>
+      </w:r>
+      <w:r>
+        <w:rPr>
+          <w:rFonts w:eastAsia="Times New Roman" w:cs="Times New Roman"/>
+          <w:color w:val="000000"/>
+          <w:kern w:val="0"/>
+          <w14:ligatures w14:val="none"/>
+        </w:rPr>
+        <w:t>7</w:t>
+      </w:r>
+      <w:r>
+        <w:rPr>
+          <w:rFonts w:eastAsia="Times New Roman" w:cs="Times New Roman"/>
+          <w:color w:val="000000"/>
+          <w:kern w:val="0"/>
+          <w14:ligatures w14:val="none"/>
+        </w:rPr>
+        <w:t>% normal, 3% anomalous)</w:t>
+      </w:r>
+    </w:p>
+    <w:p>
+      <w:pPr>
+        <w:numPr>
+          <w:ilvl w:val="0"/>
+          <w:numId w:val="3"/>
+        </w:numPr>
+        <w:spacing w:after="0" w:line="240" w:lineRule="auto"/>
+        <w:textAlignment w:val="baseline"/>
+        <w:rPr>
+          <w:rFonts w:eastAsia="Times New Roman" w:cs="Times New Roman"/>
+          <w:color w:val="000000"/>
+          <w:kern w:val="0"/>
+          <w14:ligatures w14:val="none"/>
+        </w:rPr>
+      </w:pPr>
+      <w:r>
+        <w:rPr>
+          <w:rFonts w:eastAsia="Times New Roman" w:cs="Times New Roman"/>
+          <w:color w:val="000000"/>
+          <w:kern w:val="0"/>
+          <w14:ligatures w14:val="none"/>
+        </w:rPr>
+        <w:t>Test set: 6</w:t>
+      </w:r>
+      <w:r>
+        <w:rPr>
+          <w:rFonts w:eastAsia="Times New Roman" w:cs="Times New Roman"/>
+          <w:color w:val="000000"/>
+          <w:kern w:val="0"/>
+          <w14:ligatures w14:val="none"/>
+        </w:rPr>
+        <w:t>,</w:t>
+      </w:r>
+      <w:r>
+        <w:rPr>
+          <w:rFonts w:eastAsia="Times New Roman" w:cs="Times New Roman"/>
+          <w:color w:val="000000"/>
+          <w:kern w:val="0"/>
+          <w14:ligatures w14:val="none"/>
+        </w:rPr>
+        <w:t>560 transactions (predictions required)</w:t>
+      </w:r>
+    </w:p>
+    <w:p>
+      <w:pPr>
+        <w:spacing w:before="120" w:after="120" w:line="240" w:lineRule="auto"/>
+        <w:rPr>
+          <w:rFonts w:eastAsia="Times New Roman" w:cs="Times New Roman"/>
+          <w:color w:val="000000"/>
+          <w:kern w:val="0"/>
+          <w14:ligatures w14:val="none"/>
+        </w:rPr>
+      </w:pPr>
+      <w:r>
+        <w:rPr>
+          <w:rFonts w:eastAsia="Times New Roman" w:cs="Times New Roman"/>
+          <w:b/>
+          <w:bCs/>
+          <w:color w:val="000000"/>
+          <w:kern w:val="0"/>
+          <w14:ligatures w14:val="none"/>
+        </w:rPr>
+        <w:t>Critical Consideration</w:t>
+      </w:r>
+      <w:r>
+        <w:rPr>
+          <w:rFonts w:eastAsia="Times New Roman" w:cs="Times New Roman"/>
+          <w:color w:val="000000"/>
+          <w:kern w:val="0"/>
+          <w14:ligatures w14:val="none"/>
+        </w:rPr>
+        <w:t>: The imbalanced nature of the dataset necessitates evaluation metrics beyond simple accuracy, particularly the F1 score for the positive class (anomalous transactions).</w:t>
+      </w:r>
+    </w:p>
+    <w:p>
+      <w:pPr>
+        <w:spacing w:before="120" w:after="120" w:line="240" w:lineRule="auto"/>
+        <w:rPr>
+          <w:rFonts w:eastAsia="Times New Roman" w:cs="Times New Roman"/>
+          <w:color w:val="000000"/>
+          <w:kern w:val="0"/>
+          <w14:ligatures w14:val="none"/>
+        </w:rPr>
+      </w:pPr>
+    </w:p>
+    <w:p>
+      <w:pPr>
+        <w:pStyle w:val="Heading2"/>
+        <w:numPr>
+          <w:ilvl w:val="0"/>
+          <w:numId w:val="2"/>
+        </w:numPr>
+        <w:rPr>
+          <w:b/>
+          <w:bCs/>
+        </w:rPr>
+      </w:pPr>
+      <w:r>
+        <w:rPr>
+          <w:b/>
+          <w:bCs/>
+        </w:rPr>
+        <w:t>Methodology</w:t>
+      </w:r>
+    </w:p>
+    <w:p>
+      <w:pPr>
+        <w:pStyle w:val="Heading3"/>
+        <w:numPr>
+          <w:ilvl w:val="1"/>
+          <w:numId w:val="2"/>
+        </w:numPr>
+      </w:pPr>
+      <w:r>
+        <w:t xml:space="preserve">Data </w:t>
+      </w:r>
+      <w:r>
+        <w:t>Prep</w:t>
+      </w:r>
+      <w:r>
+        <w:t xml:space="preserve">rocessing </w:t>
+      </w:r>
+    </w:p>
+    <w:p>
+      <w:pPr>
+        <w:pStyle w:val="NormalWeb"/>
+        <w:spacing w:before="120" w:beforeAutospacing="0" w:after="120" w:afterAutospacing="0"/>
+        <w:rPr>
+          <w:rFonts w:asciiTheme="minorHAnsi" w:hAnsiTheme="minorHAnsi"/>
+          <w:color w:val="000000"/>
+        </w:rPr>
+      </w:pPr>
+      <w:r>
+        <w:rPr>
+          <w:rFonts w:asciiTheme="minorHAnsi" w:hAnsiTheme="minorHAnsi"/>
+          <w:color w:val="000000"/>
+        </w:rPr>
+        <w:t>The dataset underwent systematic preprocessing to prepare for machine learning models:</w:t>
+      </w:r>
+    </w:p>
+    <w:p>
+      <w:pPr>
+        <w:pStyle w:val="NormalWeb"/>
+        <w:numPr>
+          <w:ilvl w:val="0"/>
+          <w:numId w:val="6"/>
+        </w:numPr>
+        <w:spacing w:before="0" w:beforeAutospacing="0" w:after="0" w:afterAutospacing="0"/>
+        <w:textAlignment w:val="baseline"/>
+        <w:rPr>
+          <w:rFonts w:asciiTheme="minorHAnsi" w:hAnsiTheme="minorHAnsi"/>
+          <w:color w:val="000000"/>
+        </w:rPr>
+      </w:pPr>
+      <w:r>
+        <w:rPr>
+          <w:rFonts w:asciiTheme="minorHAnsi" w:hAnsiTheme="minorHAnsi"/>
+          <w:b/>
+          <w:bCs/>
+          <w:color w:val="000000"/>
+        </w:rPr>
+        <w:t>Feature Extraction</w:t>
+      </w:r>
+      <w:r>
+        <w:rPr>
+          <w:rFonts w:asciiTheme="minorHAnsi" w:hAnsiTheme="minorHAnsi"/>
+          <w:color w:val="000000"/>
+        </w:rPr>
+        <w:t>: 30 features were selected (excluding Index and Status columns)</w:t>
+      </w:r>
+    </w:p>
+    <w:p>
+      <w:pPr>
+        <w:pStyle w:val="NormalWeb"/>
+        <w:numPr>
+          <w:ilvl w:val="0"/>
+          <w:numId w:val="6"/>
+        </w:numPr>
+        <w:spacing w:before="0" w:beforeAutospacing="0" w:after="0" w:afterAutospacing="0"/>
+        <w:textAlignment w:val="baseline"/>
+        <w:rPr>
+          <w:rFonts w:asciiTheme="minorHAnsi" w:hAnsiTheme="minorHAnsi"/>
+          <w:color w:val="000000"/>
+        </w:rPr>
+      </w:pPr>
+      <w:r>
+        <w:rPr>
+          <w:rFonts w:asciiTheme="minorHAnsi" w:hAnsiTheme="minorHAnsi"/>
+          <w:b/>
+          <w:bCs/>
+          <w:color w:val="000000"/>
+        </w:rPr>
+        <w:t>Standardization</w:t>
+      </w:r>
+      <w:r>
+        <w:rPr>
+          <w:rFonts w:asciiTheme="minorHAnsi" w:hAnsiTheme="minorHAnsi"/>
+          <w:color w:val="000000"/>
+        </w:rPr>
+        <w:t>: StandardScaler normalization was applied to all features</w:t>
+      </w:r>
+    </w:p>
+    <w:p>
+      <w:pPr>
+        <w:pStyle w:val="NormalWeb"/>
+        <w:numPr>
+          <w:ilvl w:val="1"/>
+          <w:numId w:val="7"/>
+        </w:numPr>
+        <w:spacing w:before="0" w:beforeAutospacing="0" w:after="0" w:afterAutospacing="0"/>
+        <w:textAlignment w:val="baseline"/>
+        <w:rPr>
+          <w:rFonts w:asciiTheme="minorHAnsi" w:hAnsiTheme="minorHAnsi"/>
+          <w:color w:val="000000"/>
+        </w:rPr>
+      </w:pPr>
+      <w:r>
+        <w:rPr>
+          <w:rFonts w:asciiTheme="minorHAnsi" w:hAnsiTheme="minorHAnsi"/>
+          <w:color w:val="000000"/>
+        </w:rPr>
+        <w:t>Training data fitted and transformed: shape (9,840 × 30)</w:t>
+      </w:r>
+    </w:p>
+    <w:p>
+      <w:pPr>
+        <w:pStyle w:val="NormalWeb"/>
+        <w:numPr>
+          <w:ilvl w:val="1"/>
+          <w:numId w:val="8"/>
+        </w:numPr>
+        <w:spacing w:before="0" w:beforeAutospacing="0" w:after="0" w:afterAutospacing="0"/>
+        <w:textAlignment w:val="baseline"/>
+        <w:rPr>
+          <w:rFonts w:asciiTheme="minorHAnsi" w:hAnsiTheme="minorHAnsi"/>
+          <w:color w:val="000000"/>
+        </w:rPr>
+      </w:pPr>
+      <w:r>
+        <w:rPr>
+          <w:rFonts w:asciiTheme="minorHAnsi" w:hAnsiTheme="minorHAnsi"/>
+          <w:color w:val="000000"/>
+        </w:rPr>
+        <w:t>Test data transformed using training statistics</w:t>
+      </w:r>
+    </w:p>
+    <w:p>
+      <w:pPr>
+        <w:pStyle w:val="NormalWeb"/>
+        <w:numPr>
+          <w:ilvl w:val="0"/>
+          <w:numId w:val="6"/>
+        </w:numPr>
+        <w:spacing w:before="0" w:beforeAutospacing="0" w:after="0" w:afterAutospacing="0"/>
+        <w:textAlignment w:val="baseline"/>
+        <w:rPr>
+          <w:rFonts w:asciiTheme="minorHAnsi" w:hAnsiTheme="minorHAnsi"/>
+          <w:color w:val="000000"/>
+        </w:rPr>
+      </w:pPr>
+      <w:r>
+        <w:rPr>
+          <w:rFonts w:asciiTheme="minorHAnsi" w:hAnsiTheme="minorHAnsi"/>
+          <w:b/>
+          <w:bCs/>
+          <w:color w:val="000000"/>
+        </w:rPr>
+        <w:t>No Missing Values</w:t>
+      </w:r>
+      <w:r>
+        <w:rPr>
+          <w:rFonts w:asciiTheme="minorHAnsi" w:hAnsiTheme="minorHAnsi"/>
+          <w:color w:val="000000"/>
+        </w:rPr>
+        <w:t>: Data validation confirmed zero missing values</w:t>
+      </w:r>
+    </w:p>
+    <w:p/>
+    <w:p>
+      <w:pPr>
+        <w:pStyle w:val="Heading2"/>
+        <w:numPr>
+          <w:ilvl w:val="1"/>
+          <w:numId w:val="2"/>
+        </w:numPr>
+      </w:pPr>
+      <w:r>
+        <w:t>Train-Validation Split</w:t>
+      </w:r>
+    </w:p>
+    <w:p>
+      <w:pPr>
+        <w:pStyle w:val="NormalWeb"/>
+        <w:spacing w:before="0" w:beforeAutospacing="0" w:after="0" w:afterAutospacing="0"/>
+        <w:textAlignment w:val="baseline"/>
+        <w:rPr>
+          <w:rFonts w:asciiTheme="minorHAnsi" w:hAnsiTheme="minorHAnsi"/>
+          <w:color w:val="000000"/>
+        </w:rPr>
+      </w:pPr>
+      <w:r>
+        <w:rPr>
+          <w:rFonts w:asciiTheme="minorHAnsi" w:hAnsiTheme="minorHAnsi"/>
+          <w:b/>
+          <w:bCs/>
+          <w:color w:val="000000"/>
+        </w:rPr>
+        <w:t>Training set (80%):</w:t>
+      </w:r>
+      <w:r>
+        <w:rPr>
+          <w:rFonts w:asciiTheme="minorHAnsi" w:hAnsiTheme="minorHAnsi"/>
+          <w:color w:val="000000"/>
+        </w:rPr>
+        <w:t xml:space="preserve"> 7,872 samples</w:t>
+      </w:r>
+    </w:p>
+    <w:p>
+      <w:pPr>
+        <w:pStyle w:val="NormalWeb"/>
+        <w:spacing w:before="0" w:beforeAutospacing="0" w:after="0" w:afterAutospacing="0"/>
+        <w:textAlignment w:val="baseline"/>
+        <w:rPr>
+          <w:rFonts w:asciiTheme="minorHAnsi" w:hAnsiTheme="minorHAnsi"/>
+          <w:color w:val="000000"/>
+        </w:rPr>
+      </w:pPr>
+      <w:r>
+        <w:rPr>
+          <w:rFonts w:asciiTheme="minorHAnsi" w:hAnsiTheme="minorHAnsi"/>
+          <w:b/>
+          <w:bCs/>
+          <w:color w:val="000000"/>
+        </w:rPr>
+        <w:t>Validation set (20%):</w:t>
+      </w:r>
+      <w:r>
+        <w:rPr>
+          <w:rFonts w:asciiTheme="minorHAnsi" w:hAnsiTheme="minorHAnsi"/>
+          <w:color w:val="000000"/>
+        </w:rPr>
+        <w:t xml:space="preserve"> 1,968 samples</w:t>
+      </w:r>
+    </w:p>
+    <w:p>
+      <w:pPr>
+        <w:pStyle w:val="NormalWeb"/>
+        <w:spacing w:before="0" w:beforeAutospacing="0" w:after="0" w:afterAutospacing="0"/>
+        <w:textAlignment w:val="baseline"/>
+        <w:rPr>
+          <w:rFonts w:asciiTheme="minorHAnsi" w:hAnsiTheme="minorHAnsi"/>
+          <w:color w:val="000000"/>
+        </w:rPr>
+      </w:pPr>
+      <w:r>
+        <w:rPr>
+          <w:rFonts w:asciiTheme="minorHAnsi" w:hAnsiTheme="minorHAnsi"/>
+          <w:color w:val="000000"/>
+        </w:rPr>
+        <w:t>Stratified split to maintain class distribution</w:t>
+      </w:r>
+    </w:p>
+    <w:p>
+      <w:pPr>
+        <w:pStyle w:val="NormalWeb"/>
+        <w:spacing w:before="0" w:beforeAutospacing="0" w:after="0" w:afterAutospacing="0"/>
+        <w:textAlignment w:val="baseline"/>
+        <w:rPr>
+          <w:rFonts w:asciiTheme="minorHAnsi" w:hAnsiTheme="minorHAnsi"/>
+          <w:color w:val="000000"/>
+        </w:rPr>
+      </w:pPr>
+      <w:r>
+        <w:rPr>
+          <w:rFonts w:asciiTheme="minorHAnsi" w:hAnsiTheme="minorHAnsi"/>
+          <w:color w:val="000000"/>
+        </w:rPr>
+        <w:t>Random state: 42 (reproducibility)</w:t>
+      </w:r>
+    </w:p>
+    <w:p>
+      <w:pPr>
+        <w:pStyle w:val="NormalWeb"/>
+        <w:spacing w:before="0" w:beforeAutospacing="0" w:after="0" w:afterAutospacing="0"/>
+        <w:textAlignment w:val="baseline"/>
+        <w:rPr>
+          <w:rFonts w:asciiTheme="minorHAnsi" w:hAnsiTheme="minorHAnsi"/>
+          <w:color w:val="000000"/>
+        </w:rPr>
+      </w:pPr>
+    </w:p>
+    <w:p>
+      <w:pPr>
+        <w:pStyle w:val="Heading2"/>
+        <w:numPr>
+          <w:ilvl w:val="1"/>
+          <w:numId w:val="2"/>
+        </w:numPr>
+      </w:pPr>
+      <w:r>
+        <w:t>Initial Model Evaluation</w:t>
+      </w:r>
+    </w:p>
+    <w:p>
+      <w:pPr>
+        <w:pStyle w:val="NormalWeb"/>
+        <w:spacing w:before="120" w:beforeAutospacing="0" w:after="120" w:afterAutospacing="0"/>
+        <w:rPr>
+          <w:rFonts w:asciiTheme="minorHAnsi" w:hAnsiTheme="minorHAnsi"/>
+          <w:color w:val="000000"/>
+        </w:rPr>
+      </w:pPr>
+      <w:r>
+        <w:rPr>
+          <w:rFonts w:asciiTheme="minorHAnsi" w:hAnsiTheme="minorHAnsi"/>
+          <w:color w:val="000000"/>
+        </w:rPr>
+        <w:t>Preliminary validation results indicated two leading models:</w:t>
+      </w:r>
+    </w:p>
+    <w:p>
+      <w:pPr>
+        <w:pStyle w:val="NormalWeb"/>
+        <w:spacing w:before="120" w:beforeAutospacing="0" w:after="120" w:afterAutospacing="0"/>
+        <w:rPr>
+          <w:rFonts w:asciiTheme="minorHAnsi" w:hAnsiTheme="minorHAnsi"/>
+          <w:color w:val="000000"/>
+        </w:rPr>
+      </w:pPr>
+      <w:r>
+        <w:rPr>
+          <w:rFonts w:asciiTheme="minorHAnsi" w:hAnsiTheme="minorHAnsi"/>
+          <w:color w:val="000000"/>
+        </w:rPr>
+        <w:lastRenderedPageBreak/>
+        <w:t>Initial Ranking (F1 Score for Anomalous Class):</w:t>
+      </w:r>
+    </w:p>
+    <w:p>
+      <w:pPr>
+        <w:pStyle w:val="NormalWeb"/>
+        <w:numPr>
+          <w:ilvl w:val="0"/>
+          <w:numId w:val="11"/>
+        </w:numPr>
+        <w:spacing w:before="120" w:beforeAutospacing="0" w:after="120" w:afterAutospacing="0"/>
+        <w:rPr>
+          <w:rFonts w:asciiTheme="minorHAnsi" w:hAnsiTheme="minorHAnsi"/>
+          <w:color w:val="000000"/>
+        </w:rPr>
+      </w:pPr>
+      <w:r>
+        <w:rPr>
+          <w:rFonts w:asciiTheme="minorHAnsi" w:hAnsiTheme="minorHAnsi"/>
+          <w:b/>
+          <w:bCs/>
+          <w:color w:val="000000"/>
+        </w:rPr>
+        <w:t>Random Forest</w:t>
+      </w:r>
+      <w:r>
+        <w:rPr>
+          <w:rFonts w:asciiTheme="minorHAnsi" w:hAnsiTheme="minorHAnsi"/>
+          <w:color w:val="000000"/>
+        </w:rPr>
+        <w:t>: F1 = 0.88 (Precision: 0.94, Recall: 0.83)</w:t>
+      </w:r>
+    </w:p>
+    <w:p>
+      <w:pPr>
+        <w:pStyle w:val="NormalWeb"/>
+        <w:numPr>
+          <w:ilvl w:val="0"/>
+          <w:numId w:val="11"/>
+        </w:numPr>
+        <w:spacing w:before="120" w:beforeAutospacing="0" w:after="120" w:afterAutospacing="0"/>
+        <w:rPr>
+          <w:rFonts w:asciiTheme="minorHAnsi" w:hAnsiTheme="minorHAnsi"/>
+          <w:color w:val="000000"/>
+        </w:rPr>
+      </w:pPr>
+      <w:r>
+        <w:rPr>
+          <w:rFonts w:asciiTheme="minorHAnsi" w:hAnsiTheme="minorHAnsi"/>
+          <w:b/>
+          <w:bCs/>
+          <w:color w:val="000000"/>
+        </w:rPr>
+        <w:t>Bagging</w:t>
+      </w:r>
+      <w:r>
+        <w:rPr>
+          <w:rFonts w:asciiTheme="minorHAnsi" w:hAnsiTheme="minorHAnsi"/>
+          <w:color w:val="000000"/>
+        </w:rPr>
+        <w:t>: F1 = 0.88 (Precision: 0.92, Recall: 0.83)</w:t>
+      </w:r>
+    </w:p>
+    <w:p>
+      <w:pPr>
+        <w:pStyle w:val="NormalWeb"/>
+        <w:numPr>
+          <w:ilvl w:val="0"/>
+          <w:numId w:val="11"/>
+        </w:numPr>
+        <w:spacing w:before="120" w:beforeAutospacing="0" w:after="120" w:afterAutospacing="0"/>
+        <w:rPr>
+          <w:rFonts w:asciiTheme="minorHAnsi" w:hAnsiTheme="minorHAnsi"/>
+          <w:color w:val="000000"/>
+        </w:rPr>
+      </w:pPr>
+      <w:r>
+        <w:rPr>
+          <w:rFonts w:asciiTheme="minorHAnsi" w:hAnsiTheme="minorHAnsi"/>
+          <w:b/>
+          <w:bCs/>
+          <w:color w:val="000000"/>
+        </w:rPr>
+        <w:t>AdaBoost</w:t>
+      </w:r>
+      <w:r>
+        <w:rPr>
+          <w:rFonts w:asciiTheme="minorHAnsi" w:hAnsiTheme="minorHAnsi"/>
+          <w:color w:val="000000"/>
+        </w:rPr>
+        <w:t>: F1 = 0.84 (Precision: 0.87, Recall: 0.81)</w:t>
+      </w:r>
+    </w:p>
+    <w:p>
+      <w:pPr>
+        <w:pStyle w:val="NormalWeb"/>
+        <w:numPr>
+          <w:ilvl w:val="0"/>
+          <w:numId w:val="11"/>
+        </w:numPr>
+        <w:spacing w:before="120" w:beforeAutospacing="0" w:after="120" w:afterAutospacing="0"/>
+        <w:rPr>
+          <w:rFonts w:asciiTheme="minorHAnsi" w:hAnsiTheme="minorHAnsi"/>
+          <w:color w:val="000000"/>
+        </w:rPr>
+      </w:pPr>
+      <w:r>
+        <w:rPr>
+          <w:rFonts w:asciiTheme="minorHAnsi" w:hAnsiTheme="minorHAnsi"/>
+          <w:b/>
+          <w:bCs/>
+          <w:color w:val="000000"/>
+        </w:rPr>
+        <w:t>SVM</w:t>
+      </w:r>
+      <w:r>
+        <w:rPr>
+          <w:rFonts w:asciiTheme="minorHAnsi" w:hAnsiTheme="minorHAnsi"/>
+          <w:color w:val="000000"/>
+        </w:rPr>
+        <w:t>: F1 = 0.80 (Precision: 0.95, Recall: 0.69)</w:t>
+      </w:r>
+    </w:p>
+    <w:p>
+      <w:pPr>
+        <w:pStyle w:val="NormalWeb"/>
+        <w:numPr>
+          <w:ilvl w:val="0"/>
+          <w:numId w:val="11"/>
+        </w:numPr>
+        <w:spacing w:before="120" w:beforeAutospacing="0" w:after="120" w:afterAutospacing="0"/>
+        <w:rPr>
+          <w:rFonts w:asciiTheme="minorHAnsi" w:hAnsiTheme="minorHAnsi"/>
+          <w:color w:val="000000"/>
+        </w:rPr>
+      </w:pPr>
+      <w:r>
+        <w:rPr>
+          <w:rFonts w:asciiTheme="minorHAnsi" w:hAnsiTheme="minorHAnsi"/>
+          <w:b/>
+          <w:bCs/>
+          <w:color w:val="000000"/>
+        </w:rPr>
+        <w:t>k-NN</w:t>
+      </w:r>
+      <w:r>
+        <w:rPr>
+          <w:rFonts w:asciiTheme="minorHAnsi" w:hAnsiTheme="minorHAnsi"/>
+          <w:color w:val="000000"/>
+        </w:rPr>
+        <w:t>: F1 = 0.83 (Precision: 0.96, Recall: 0.73)</w:t>
+      </w:r>
+    </w:p>
+    <w:p>
+      <w:pPr>
+        <w:pStyle w:val="NormalWeb"/>
+        <w:numPr>
+          <w:ilvl w:val="0"/>
+          <w:numId w:val="11"/>
+        </w:numPr>
+        <w:spacing w:before="120" w:beforeAutospacing="0" w:after="120" w:afterAutospacing="0"/>
+        <w:rPr>
+          <w:rFonts w:asciiTheme="minorHAnsi" w:hAnsiTheme="minorHAnsi"/>
+          <w:color w:val="000000"/>
+        </w:rPr>
+      </w:pPr>
+      <w:r>
+        <w:rPr>
+          <w:rFonts w:asciiTheme="minorHAnsi" w:hAnsiTheme="minorHAnsi"/>
+          <w:b/>
+          <w:bCs/>
+          <w:color w:val="000000"/>
+        </w:rPr>
+        <w:t>Decision Tree</w:t>
+      </w:r>
+      <w:r>
+        <w:rPr>
+          <w:rFonts w:asciiTheme="minorHAnsi" w:hAnsiTheme="minorHAnsi"/>
+          <w:color w:val="000000"/>
+        </w:rPr>
+        <w:t>: F1 = 0.85 (Precision: 0.85, Recall: 0.85)</w:t>
+      </w:r>
+    </w:p>
+    <w:p>
+      <w:pPr>
+        <w:pStyle w:val="NormalWeb"/>
+        <w:numPr>
+          <w:ilvl w:val="0"/>
+          <w:numId w:val="11"/>
+        </w:numPr>
+        <w:spacing w:before="120" w:beforeAutospacing="0" w:after="120" w:afterAutospacing="0"/>
+        <w:rPr>
+          <w:rFonts w:asciiTheme="minorHAnsi" w:hAnsiTheme="minorHAnsi"/>
+          <w:color w:val="000000"/>
+        </w:rPr>
+      </w:pPr>
+      <w:r>
+        <w:rPr>
+          <w:rFonts w:asciiTheme="minorHAnsi" w:hAnsiTheme="minorHAnsi"/>
+          <w:b/>
+          <w:bCs/>
+          <w:color w:val="000000"/>
+        </w:rPr>
+        <w:t>Gaussian NB</w:t>
+      </w:r>
+      <w:r>
+        <w:rPr>
+          <w:rFonts w:asciiTheme="minorHAnsi" w:hAnsiTheme="minorHAnsi"/>
+          <w:color w:val="000000"/>
+        </w:rPr>
+        <w:t>: F1 = 0.58 (Precision: 0.46, Recall: 0.80)</w:t>
+      </w:r>
+    </w:p>
+    <w:p>
+      <w:r>
+        <w:rPr>
+          <w:rFonts w:cs="Times New Roman"/>
+          <w:shd w:val="clear" w:color="auto" w:fill="FFFFFF"/>
+        </w:rPr>
+        <w:t xml:space="preserve">We observer that 2 best models providing the best balance of precisions and recall for the prediction of 1 and resulting in the highest F1-score are </w:t>
+      </w:r>
+      <w:r>
+        <w:rPr>
+          <w:rFonts w:cs="Times New Roman"/>
+          <w:b/>
+          <w:bCs/>
+          <w:shd w:val="clear" w:color="auto" w:fill="FFFFFF"/>
+        </w:rPr>
+        <w:t>Random Forest</w:t>
+      </w:r>
+      <w:r>
+        <w:rPr>
+          <w:rFonts w:cs="Times New Roman"/>
+          <w:shd w:val="clear" w:color="auto" w:fill="FFFFFF"/>
+        </w:rPr>
+        <w:t xml:space="preserve"> and </w:t>
+      </w:r>
+      <w:r>
+        <w:rPr>
+          <w:rFonts w:cs="Times New Roman"/>
+          <w:b/>
+          <w:bCs/>
+          <w:shd w:val="clear" w:color="auto" w:fill="FFFFFF"/>
+        </w:rPr>
+        <w:t>Bagging</w:t>
+      </w:r>
+      <w:r>
+        <w:rPr>
+          <w:b/>
+          <w:bCs/>
+          <w:shd w:val="clear" w:color="auto" w:fill="FFFFFF"/>
+        </w:rPr>
+        <w:t xml:space="preserve"> </w:t>
+      </w:r>
+      <w:r>
+        <w:rPr>
+          <w:shd w:val="clear" w:color="auto" w:fill="FFFFFF"/>
+        </w:rPr>
+        <w:t>methods</w:t>
+      </w:r>
+    </w:p>
+    <w:p/>
+    <w:p>
+      <w:pPr>
+        <w:pStyle w:val="Heading2"/>
+        <w:numPr>
+          <w:ilvl w:val="1"/>
+          <w:numId w:val="2"/>
+        </w:numPr>
+      </w:pPr>
+      <w:r>
+        <w:t>Hyper</w:t>
+      </w:r>
+      <w:r>
+        <w:t>parameter Tuning</w:t>
+      </w:r>
+    </w:p>
+    <w:p>
+      <w:pPr>
+        <w:pStyle w:val="Heading3"/>
+        <w:numPr>
+          <w:ilvl w:val="2"/>
+          <w:numId w:val="2"/>
+        </w:numPr>
+      </w:pPr>
+      <w:r>
+        <w:t>Random Forest Optimization</w:t>
+      </w:r>
+    </w:p>
+    <w:p>
+      <w:pPr>
+        <w:pStyle w:val="NormalWeb"/>
+        <w:spacing w:before="120" w:beforeAutospacing="0" w:after="120" w:afterAutospacing="0"/>
+        <w:rPr>
+          <w:rFonts w:asciiTheme="minorHAnsi" w:hAnsiTheme="minorHAnsi"/>
+          <w:color w:val="000000"/>
+        </w:rPr>
+      </w:pPr>
+      <w:r>
+        <w:rPr>
+          <w:rFonts w:asciiTheme="minorHAnsi" w:hAnsiTheme="minorHAnsi"/>
+          <w:color w:val="000000"/>
+        </w:rPr>
+        <w:t>Parameter Grid:</w:t>
+      </w:r>
+    </w:p>
+    <w:p>
+      <w:pPr>
+        <w:pStyle w:val="NormalWeb"/>
+        <w:numPr>
+          <w:ilvl w:val="0"/>
+          <w:numId w:val="15"/>
+        </w:numPr>
+        <w:spacing w:before="0" w:beforeAutospacing="0" w:after="0" w:afterAutospacing="0"/>
+        <w:textAlignment w:val="baseline"/>
+        <w:rPr>
+          <w:rFonts w:asciiTheme="minorHAnsi" w:hAnsiTheme="minorHAnsi"/>
+          <w:color w:val="000000"/>
+        </w:rPr>
+      </w:pPr>
+      <w:r>
+        <w:rPr>
+          <w:rFonts w:asciiTheme="minorHAnsi" w:hAnsiTheme="minorHAnsi"/>
+          <w:color w:val="000000"/>
+        </w:rPr>
+        <w:t>n_estimators: [100, 200]</w:t>
+      </w:r>
+    </w:p>
+    <w:p>
+      <w:pPr>
+        <w:pStyle w:val="NormalWeb"/>
+        <w:numPr>
+          <w:ilvl w:val="0"/>
+          <w:numId w:val="15"/>
+        </w:numPr>
+        <w:spacing w:before="0" w:beforeAutospacing="0" w:after="0" w:afterAutospacing="0"/>
+        <w:textAlignment w:val="baseline"/>
+        <w:rPr>
+          <w:rFonts w:asciiTheme="minorHAnsi" w:hAnsiTheme="minorHAnsi"/>
+          <w:color w:val="000000"/>
+        </w:rPr>
+      </w:pPr>
+      <w:r>
+        <w:rPr>
+          <w:rFonts w:asciiTheme="minorHAnsi" w:hAnsiTheme="minorHAnsi"/>
+          <w:color w:val="000000"/>
+        </w:rPr>
+        <w:t>max_depth: [10, 20, None]</w:t>
+      </w:r>
+    </w:p>
+    <w:p>
+      <w:pPr>
+        <w:pStyle w:val="NormalWeb"/>
+        <w:numPr>
+          <w:ilvl w:val="0"/>
+          <w:numId w:val="15"/>
+        </w:numPr>
+        <w:spacing w:before="0" w:beforeAutospacing="0" w:after="0" w:afterAutospacing="0"/>
+        <w:textAlignment w:val="baseline"/>
+        <w:rPr>
+          <w:rFonts w:asciiTheme="minorHAnsi" w:hAnsiTheme="minorHAnsi"/>
+          <w:color w:val="000000"/>
+        </w:rPr>
+      </w:pPr>
+      <w:r>
+        <w:rPr>
+          <w:rFonts w:asciiTheme="minorHAnsi" w:hAnsiTheme="minorHAnsi"/>
+          <w:color w:val="000000"/>
+        </w:rPr>
+        <w:t>min_samples_split: [2, 5]</w:t>
+      </w:r>
+    </w:p>
+    <w:p>
+      <w:pPr>
+        <w:pStyle w:val="NormalWeb"/>
+        <w:numPr>
+          <w:ilvl w:val="0"/>
+          <w:numId w:val="15"/>
+        </w:numPr>
+        <w:spacing w:before="0" w:beforeAutospacing="0" w:after="0" w:afterAutospacing="0"/>
+        <w:textAlignment w:val="baseline"/>
+        <w:rPr>
+          <w:rFonts w:asciiTheme="minorHAnsi" w:hAnsiTheme="minorHAnsi"/>
+          <w:color w:val="000000"/>
+        </w:rPr>
+      </w:pPr>
+      <w:r>
+        <w:rPr>
+          <w:rFonts w:asciiTheme="minorHAnsi" w:hAnsiTheme="minorHAnsi"/>
+          <w:color w:val="000000"/>
+        </w:rPr>
+        <w:t>min_samples_leaf: [1, 2]</w:t>
+      </w:r>
+    </w:p>
+    <w:p>
+      <w:pPr>
+        <w:pStyle w:val="NormalWeb"/>
+        <w:spacing w:before="120" w:beforeAutospacing="0" w:after="120" w:afterAutospacing="0"/>
+        <w:rPr>
+          <w:rFonts w:asciiTheme="minorHAnsi" w:hAnsiTheme="minorHAnsi"/>
+          <w:color w:val="000000"/>
+        </w:rPr>
+      </w:pPr>
+      <w:r>
+        <w:rPr>
+          <w:rFonts w:asciiTheme="minorHAnsi" w:hAnsiTheme="minorHAnsi"/>
+          <w:color w:val="000000"/>
+        </w:rPr>
+        <w:t>Best Parameters Found:</w:t>
+      </w:r>
+    </w:p>
+    <w:p>
+      <w:pPr>
+        <w:pStyle w:val="NormalWeb"/>
+        <w:numPr>
+          <w:ilvl w:val="0"/>
+          <w:numId w:val="15"/>
+        </w:numPr>
+        <w:spacing w:before="0" w:beforeAutospacing="0" w:after="0" w:afterAutospacing="0"/>
+        <w:textAlignment w:val="baseline"/>
+        <w:rPr>
+          <w:rFonts w:asciiTheme="minorHAnsi" w:hAnsiTheme="minorHAnsi"/>
+          <w:color w:val="000000"/>
+        </w:rPr>
+      </w:pPr>
+      <w:r>
+        <w:rPr>
+          <w:rFonts w:asciiTheme="minorHAnsi" w:hAnsiTheme="minorHAnsi"/>
+          <w:color w:val="000000"/>
+        </w:rPr>
+        <w:t>n_estimators: 200</w:t>
+      </w:r>
+    </w:p>
+    <w:p>
+      <w:pPr>
+        <w:pStyle w:val="NormalWeb"/>
+        <w:numPr>
+          <w:ilvl w:val="0"/>
+          <w:numId w:val="15"/>
+        </w:numPr>
+        <w:spacing w:before="0" w:beforeAutospacing="0" w:after="0" w:afterAutospacing="0"/>
+        <w:textAlignment w:val="baseline"/>
+        <w:rPr>
+          <w:rFonts w:asciiTheme="minorHAnsi" w:hAnsiTheme="minorHAnsi"/>
+          <w:color w:val="000000"/>
+        </w:rPr>
+      </w:pPr>
+      <w:r>
+        <w:rPr>
+          <w:rFonts w:asciiTheme="minorHAnsi" w:hAnsiTheme="minorHAnsi"/>
+          <w:color w:val="000000"/>
+        </w:rPr>
+        <w:t>max_depth: 10</w:t>
+      </w:r>
+    </w:p>
+    <w:p>
+      <w:pPr>
+        <w:pStyle w:val="NormalWeb"/>
+        <w:numPr>
+          <w:ilvl w:val="0"/>
+          <w:numId w:val="15"/>
+        </w:numPr>
+        <w:spacing w:before="0" w:beforeAutospacing="0" w:after="0" w:afterAutospacing="0"/>
+        <w:textAlignment w:val="baseline"/>
+        <w:rPr>
+          <w:rFonts w:asciiTheme="minorHAnsi" w:hAnsiTheme="minorHAnsi"/>
+          <w:color w:val="000000"/>
+        </w:rPr>
+      </w:pPr>
+      <w:r>
+        <w:rPr>
+          <w:rFonts w:asciiTheme="minorHAnsi" w:hAnsiTheme="minorHAnsi"/>
+          <w:color w:val="000000"/>
+        </w:rPr>
+        <w:t>min_samples_split: 2</w:t>
+      </w:r>
+    </w:p>
+    <w:p>
+      <w:pPr>
+        <w:pStyle w:val="NormalWeb"/>
+        <w:numPr>
+          <w:ilvl w:val="0"/>
+          <w:numId w:val="15"/>
+        </w:numPr>
+        <w:spacing w:before="0" w:beforeAutospacing="0" w:after="0" w:afterAutospacing="0"/>
+        <w:textAlignment w:val="baseline"/>
+        <w:rPr>
+          <w:rFonts w:asciiTheme="minorHAnsi" w:hAnsiTheme="minorHAnsi"/>
+          <w:color w:val="000000"/>
+        </w:rPr>
+      </w:pPr>
+      <w:r>
+        <w:rPr>
+          <w:rFonts w:asciiTheme="minorHAnsi" w:hAnsiTheme="minorHAnsi"/>
+          <w:color w:val="000000"/>
+        </w:rPr>
+        <w:t>min_samples_leaf: 2</w:t>
+      </w:r>
+    </w:p>
+    <w:p>
+      <w:pPr>
+        <w:pStyle w:val="NormalWeb"/>
+        <w:spacing w:before="120" w:beforeAutospacing="0" w:after="120" w:afterAutospacing="0"/>
+        <w:rPr>
+          <w:rFonts w:asciiTheme="minorHAnsi" w:hAnsiTheme="minorHAnsi"/>
+          <w:color w:val="000000"/>
+        </w:rPr>
+      </w:pPr>
+      <w:r>
+        <w:rPr>
+          <w:rFonts w:asciiTheme="minorHAnsi" w:hAnsiTheme="minorHAnsi"/>
+          <w:color w:val="000000"/>
+        </w:rPr>
+        <w:t>Tuned Performance (Validation):</w:t>
+      </w:r>
+    </w:p>
+    <w:p>
+      <w:pPr>
+        <w:pStyle w:val="NormalWeb"/>
+        <w:numPr>
+          <w:ilvl w:val="0"/>
+          <w:numId w:val="15"/>
+        </w:numPr>
+        <w:spacing w:before="0" w:beforeAutospacing="0" w:after="0" w:afterAutospacing="0"/>
+        <w:textAlignment w:val="baseline"/>
+        <w:rPr>
+          <w:rFonts w:asciiTheme="minorHAnsi" w:hAnsiTheme="minorHAnsi"/>
+          <w:color w:val="000000"/>
+        </w:rPr>
+      </w:pPr>
+      <w:r>
+        <w:rPr>
+          <w:rFonts w:asciiTheme="minorHAnsi" w:hAnsiTheme="minorHAnsi"/>
+          <w:color w:val="000000"/>
+        </w:rPr>
+        <w:t>F1 Score (Anomalous): 0.88</w:t>
+      </w:r>
+    </w:p>
+    <w:p>
+      <w:pPr>
+        <w:pStyle w:val="NormalWeb"/>
+        <w:numPr>
+          <w:ilvl w:val="0"/>
+          <w:numId w:val="15"/>
+        </w:numPr>
+        <w:spacing w:before="0" w:beforeAutospacing="0" w:after="0" w:afterAutospacing="0"/>
+        <w:textAlignment w:val="baseline"/>
+        <w:rPr>
+          <w:rFonts w:asciiTheme="minorHAnsi" w:hAnsiTheme="minorHAnsi"/>
+          <w:color w:val="000000"/>
+        </w:rPr>
+      </w:pPr>
+      <w:r>
+        <w:rPr>
+          <w:rFonts w:asciiTheme="minorHAnsi" w:hAnsiTheme="minorHAnsi"/>
+          <w:color w:val="000000"/>
+        </w:rPr>
+        <w:t>Precision: 0.94</w:t>
+      </w:r>
+    </w:p>
+    <w:p>
+      <w:pPr>
+        <w:pStyle w:val="NormalWeb"/>
+        <w:numPr>
+          <w:ilvl w:val="0"/>
+          <w:numId w:val="15"/>
+        </w:numPr>
+        <w:spacing w:before="0" w:beforeAutospacing="0" w:after="0" w:afterAutospacing="0"/>
+        <w:textAlignment w:val="baseline"/>
+        <w:rPr>
+          <w:rFonts w:asciiTheme="minorHAnsi" w:hAnsiTheme="minorHAnsi"/>
+          <w:color w:val="000000"/>
+        </w:rPr>
+      </w:pPr>
+      <w:r>
+        <w:rPr>
+          <w:rFonts w:asciiTheme="minorHAnsi" w:hAnsiTheme="minorHAnsi"/>
+          <w:color w:val="000000"/>
+        </w:rPr>
+        <w:t>Recall: 0.83</w:t>
+      </w:r>
+    </w:p>
+    <w:p>
+      <w:pPr>
+        <w:pStyle w:val="NormalWeb"/>
+        <w:numPr>
+          <w:ilvl w:val="0"/>
+          <w:numId w:val="15"/>
+        </w:numPr>
+        <w:spacing w:before="0" w:beforeAutospacing="0" w:after="0" w:afterAutospacing="0"/>
+        <w:textAlignment w:val="baseline"/>
+        <w:rPr>
+          <w:rFonts w:asciiTheme="minorHAnsi" w:hAnsiTheme="minorHAnsi"/>
+          <w:color w:val="000000"/>
+        </w:rPr>
+      </w:pPr>
+      <w:r>
+        <w:rPr>
+          <w:rFonts w:asciiTheme="minorHAnsi" w:hAnsiTheme="minorHAnsi"/>
+          <w:color w:val="000000"/>
+        </w:rPr>
+        <w:t>Overall Accuracy: 0.99</w:t>
+      </w:r>
+    </w:p>
+    <w:p>
+      <w:pPr>
+        <w:pStyle w:val="NormalWeb"/>
+        <w:spacing w:before="0" w:beforeAutospacing="0" w:after="0" w:afterAutospacing="0"/>
+        <w:textAlignment w:val="baseline"/>
+        <w:rPr>
+          <w:rFonts w:asciiTheme="minorHAnsi" w:hAnsiTheme="minorHAnsi"/>
+          <w:color w:val="000000"/>
+        </w:rPr>
+      </w:pPr>
+    </w:p>
+    <w:p>
+      <w:pPr>
+        <w:pStyle w:val="Heading3"/>
+        <w:numPr>
+          <w:ilvl w:val="2"/>
+          <w:numId w:val="2"/>
+        </w:numPr>
+      </w:pPr>
+      <w:r>
+        <w:t>Bagging Optimization</w:t>
+      </w:r>
+    </w:p>
+    <w:p>
+      <w:pPr>
+        <w:pStyle w:val="NormalWeb"/>
+        <w:spacing w:before="120" w:beforeAutospacing="0" w:after="120" w:afterAutospacing="0"/>
+        <w:rPr>
+          <w:rFonts w:asciiTheme="minorHAnsi" w:hAnsiTheme="minorHAnsi"/>
+          <w:color w:val="000000"/>
+        </w:rPr>
+      </w:pPr>
+      <w:r>
+        <w:rPr>
+          <w:rFonts w:asciiTheme="minorHAnsi" w:hAnsiTheme="minorHAnsi"/>
+          <w:color w:val="000000"/>
+        </w:rPr>
+        <w:t>Parameter Grid:</w:t>
+      </w:r>
+    </w:p>
+    <w:p>
+      <w:pPr>
+        <w:pStyle w:val="NormalWeb"/>
+        <w:numPr>
+          <w:ilvl w:val="0"/>
+          <w:numId w:val="16"/>
+        </w:numPr>
+        <w:spacing w:before="0" w:beforeAutospacing="0" w:after="0" w:afterAutospacing="0"/>
+        <w:textAlignment w:val="baseline"/>
+        <w:rPr>
+          <w:rFonts w:asciiTheme="minorHAnsi" w:hAnsiTheme="minorHAnsi"/>
+          <w:color w:val="000000"/>
+        </w:rPr>
+      </w:pPr>
+      <w:r>
+        <w:rPr>
+          <w:rFonts w:asciiTheme="minorHAnsi" w:hAnsiTheme="minorHAnsi"/>
+          <w:color w:val="000000"/>
+        </w:rPr>
+        <w:t>n_estimators: [50, 100, 200]</w:t>
+      </w:r>
+    </w:p>
+    <w:p>
+      <w:pPr>
+        <w:pStyle w:val="NormalWeb"/>
+        <w:numPr>
+          <w:ilvl w:val="0"/>
+          <w:numId w:val="16"/>
+        </w:numPr>
+        <w:spacing w:before="0" w:beforeAutospacing="0" w:after="0" w:afterAutospacing="0"/>
+        <w:textAlignment w:val="baseline"/>
+        <w:rPr>
+          <w:rFonts w:asciiTheme="minorHAnsi" w:hAnsiTheme="minorHAnsi"/>
+          <w:color w:val="000000"/>
+        </w:rPr>
+      </w:pPr>
+      <w:r>
+        <w:rPr>
+          <w:rFonts w:asciiTheme="minorHAnsi" w:hAnsiTheme="minorHAnsi"/>
+          <w:color w:val="000000"/>
+        </w:rPr>
+        <w:lastRenderedPageBreak/>
+        <w:t>max_samples: [0.5, 0.7, 1.0]</w:t>
+      </w:r>
+    </w:p>
+    <w:p>
+      <w:pPr>
+        <w:pStyle w:val="NormalWeb"/>
+        <w:numPr>
+          <w:ilvl w:val="0"/>
+          <w:numId w:val="16"/>
+        </w:numPr>
+        <w:spacing w:before="0" w:beforeAutospacing="0" w:after="0" w:afterAutospacing="0"/>
+        <w:textAlignment w:val="baseline"/>
+        <w:rPr>
+          <w:rFonts w:asciiTheme="minorHAnsi" w:hAnsiTheme="minorHAnsi"/>
+          <w:color w:val="000000"/>
+        </w:rPr>
+      </w:pPr>
+      <w:r>
+        <w:rPr>
+          <w:rFonts w:asciiTheme="minorHAnsi" w:hAnsiTheme="minorHAnsi"/>
+          <w:color w:val="000000"/>
+        </w:rPr>
+        <w:t>max_features: [0.5, 0.7, 1.0]</w:t>
+      </w:r>
+    </w:p>
+    <w:p>
+      <w:pPr>
+        <w:pStyle w:val="NormalWeb"/>
+        <w:spacing w:before="120" w:beforeAutospacing="0" w:after="120" w:afterAutospacing="0"/>
+        <w:rPr>
+          <w:rFonts w:asciiTheme="minorHAnsi" w:hAnsiTheme="minorHAnsi"/>
+          <w:color w:val="000000"/>
+        </w:rPr>
+      </w:pPr>
+      <w:r>
+        <w:rPr>
+          <w:rFonts w:asciiTheme="minorHAnsi" w:hAnsiTheme="minorHAnsi"/>
+          <w:color w:val="000000"/>
+        </w:rPr>
+        <w:t>Best Parameters Found:</w:t>
+      </w:r>
+    </w:p>
+    <w:p>
+      <w:pPr>
+        <w:pStyle w:val="NormalWeb"/>
+        <w:numPr>
+          <w:ilvl w:val="0"/>
+          <w:numId w:val="17"/>
+        </w:numPr>
+        <w:spacing w:before="0" w:beforeAutospacing="0" w:after="0" w:afterAutospacing="0"/>
+        <w:textAlignment w:val="baseline"/>
+        <w:rPr>
+          <w:rFonts w:asciiTheme="minorHAnsi" w:hAnsiTheme="minorHAnsi"/>
+          <w:color w:val="000000"/>
+        </w:rPr>
+      </w:pPr>
+      <w:r>
+        <w:rPr>
+          <w:rFonts w:asciiTheme="minorHAnsi" w:hAnsiTheme="minorHAnsi"/>
+          <w:color w:val="000000"/>
+        </w:rPr>
+        <w:t>n_estimators: 50</w:t>
+      </w:r>
+    </w:p>
+    <w:p>
+      <w:pPr>
+        <w:pStyle w:val="NormalWeb"/>
+        <w:numPr>
+          <w:ilvl w:val="0"/>
+          <w:numId w:val="17"/>
+        </w:numPr>
+        <w:spacing w:before="0" w:beforeAutospacing="0" w:after="0" w:afterAutospacing="0"/>
+        <w:textAlignment w:val="baseline"/>
+        <w:rPr>
+          <w:rFonts w:asciiTheme="minorHAnsi" w:hAnsiTheme="minorHAnsi"/>
+          <w:color w:val="000000"/>
+        </w:rPr>
+      </w:pPr>
+      <w:r>
+        <w:rPr>
+          <w:rFonts w:asciiTheme="minorHAnsi" w:hAnsiTheme="minorHAnsi"/>
+          <w:color w:val="000000"/>
+        </w:rPr>
+        <w:t>max_samples: 0.5</w:t>
+      </w:r>
+    </w:p>
+    <w:p>
+      <w:pPr>
+        <w:pStyle w:val="NormalWeb"/>
+        <w:numPr>
+          <w:ilvl w:val="0"/>
+          <w:numId w:val="17"/>
+        </w:numPr>
+        <w:spacing w:before="0" w:beforeAutospacing="0" w:after="0" w:afterAutospacing="0"/>
+        <w:textAlignment w:val="baseline"/>
+        <w:rPr>
+          <w:rFonts w:asciiTheme="minorHAnsi" w:hAnsiTheme="minorHAnsi"/>
+          <w:color w:val="000000"/>
+        </w:rPr>
+      </w:pPr>
+      <w:r>
+        <w:rPr>
+          <w:rFonts w:asciiTheme="minorHAnsi" w:hAnsiTheme="minorHAnsi"/>
+          <w:color w:val="000000"/>
+        </w:rPr>
+        <w:t>max_features: 0.5</w:t>
+      </w:r>
+    </w:p>
+    <w:p>
+      <w:pPr>
+        <w:pStyle w:val="NormalWeb"/>
+        <w:spacing w:before="120" w:beforeAutospacing="0" w:after="120" w:afterAutospacing="0"/>
+        <w:rPr>
+          <w:rFonts w:asciiTheme="minorHAnsi" w:hAnsiTheme="minorHAnsi"/>
+          <w:color w:val="000000"/>
+        </w:rPr>
+      </w:pPr>
+      <w:r>
+        <w:rPr>
+          <w:rFonts w:asciiTheme="minorHAnsi" w:hAnsiTheme="minorHAnsi"/>
+          <w:color w:val="000000"/>
+        </w:rPr>
+        <w:t>Tuned Performance (Validation):</w:t>
+      </w:r>
+    </w:p>
+    <w:p>
+      <w:pPr>
+        <w:pStyle w:val="NormalWeb"/>
+        <w:numPr>
+          <w:ilvl w:val="0"/>
+          <w:numId w:val="18"/>
+        </w:numPr>
+        <w:spacing w:before="0" w:beforeAutospacing="0" w:after="0" w:afterAutospacing="0"/>
+        <w:textAlignment w:val="baseline"/>
+        <w:rPr>
+          <w:rFonts w:asciiTheme="minorHAnsi" w:hAnsiTheme="minorHAnsi"/>
+          <w:color w:val="000000"/>
+        </w:rPr>
+      </w:pPr>
+      <w:r>
+        <w:rPr>
+          <w:rFonts w:asciiTheme="minorHAnsi" w:hAnsiTheme="minorHAnsi"/>
+          <w:color w:val="000000"/>
+        </w:rPr>
+        <w:t>F1 Score (Anomalous): 0.88</w:t>
+      </w:r>
+    </w:p>
+    <w:p>
+      <w:pPr>
+        <w:pStyle w:val="NormalWeb"/>
+        <w:numPr>
+          <w:ilvl w:val="0"/>
+          <w:numId w:val="18"/>
+        </w:numPr>
+        <w:spacing w:before="0" w:beforeAutospacing="0" w:after="0" w:afterAutospacing="0"/>
+        <w:textAlignment w:val="baseline"/>
+        <w:rPr>
+          <w:rFonts w:asciiTheme="minorHAnsi" w:hAnsiTheme="minorHAnsi"/>
+          <w:color w:val="000000"/>
+        </w:rPr>
+      </w:pPr>
+      <w:r>
+        <w:rPr>
+          <w:rFonts w:asciiTheme="minorHAnsi" w:hAnsiTheme="minorHAnsi"/>
+          <w:color w:val="000000"/>
+        </w:rPr>
+        <w:t>Precision: 0.94</w:t>
+      </w:r>
+    </w:p>
+    <w:p>
+      <w:pPr>
+        <w:pStyle w:val="NormalWeb"/>
+        <w:numPr>
+          <w:ilvl w:val="0"/>
+          <w:numId w:val="18"/>
+        </w:numPr>
+        <w:spacing w:before="0" w:beforeAutospacing="0" w:after="0" w:afterAutospacing="0"/>
+        <w:textAlignment w:val="baseline"/>
+        <w:rPr>
+          <w:rFonts w:asciiTheme="minorHAnsi" w:hAnsiTheme="minorHAnsi"/>
+          <w:color w:val="000000"/>
+        </w:rPr>
+      </w:pPr>
+      <w:r>
+        <w:rPr>
+          <w:rFonts w:asciiTheme="minorHAnsi" w:hAnsiTheme="minorHAnsi"/>
+          <w:color w:val="000000"/>
+        </w:rPr>
+        <w:t>Recall: 0.83</w:t>
+      </w:r>
+    </w:p>
+    <w:p>
+      <w:pPr>
+        <w:pStyle w:val="NormalWeb"/>
+        <w:numPr>
+          <w:ilvl w:val="0"/>
+          <w:numId w:val="18"/>
+        </w:numPr>
+        <w:spacing w:before="0" w:beforeAutospacing="0" w:after="0" w:afterAutospacing="0"/>
+        <w:textAlignment w:val="baseline"/>
+        <w:rPr>
+          <w:rFonts w:asciiTheme="minorHAnsi" w:hAnsiTheme="minorHAnsi"/>
+          <w:color w:val="000000"/>
+        </w:rPr>
+      </w:pPr>
+      <w:r>
+        <w:rPr>
+          <w:rFonts w:asciiTheme="minorHAnsi" w:hAnsiTheme="minorHAnsi"/>
+          <w:color w:val="000000"/>
+        </w:rPr>
+        <w:t>Overall Accuracy: 0.99</w:t>
+      </w:r>
+    </w:p>
+    <w:p/>
+    <w:p>
+      <w:pPr>
+        <w:pStyle w:val="Heading2"/>
+        <w:numPr>
+          <w:ilvl w:val="1"/>
+          <w:numId w:val="2"/>
+        </w:numPr>
+      </w:pPr>
+      <w:r>
+        <w:t>Final Model Evaluation</w:t>
+      </w:r>
+    </w:p>
+    <w:p>
+      <w:pPr>
+        <w:rPr>
+          <w:rFonts w:cs="Segoe UI"/>
+          <w:spacing w:val="1"/>
+        </w:rPr>
+      </w:pPr>
+      <w:r>
+        <w:rPr>
+          <w:rFonts w:cs="Segoe UI"/>
+          <w:spacing w:val="1"/>
+        </w:rPr>
+        <w:t>Both Random Forest and Bagging demonstrated comparable performance. Final models were retrained on the complete scaled dataset to maximize learning capacity:</w:t>
+      </w:r>
+    </w:p>
+    <w:tbl>
+      <w:tblPr>
+        <w:tblStyle w:val="TableGrid"/>
+        <w:tblW w:w="0" w:type="auto"/>
+        <w:jc w:val="center"/>
+        <w:tblLook w:val="04A0" w:firstRow="1" w:lastRow="0" w:firstColumn="1" w:lastColumn="0" w:noHBand="0" w:noVBand="1"/>
+      </w:tblPr>
+      <w:tblGrid>
+        <w:gridCol w:w="1555"/>
+        <w:gridCol w:w="3260"/>
+        <w:gridCol w:w="3402"/>
+      </w:tblGrid>
+      <w:tr>
+        <w:trPr>
+          <w:trHeight w:val="509"/>
+          <w:jc w:val="center"/>
+        </w:trPr>
+        <w:tc>
+          <w:tcPr>
+            <w:tcW w:w="1555" w:type="dxa"/>
+          </w:tcPr>
+          <w:p>
+            <w:pPr>
+              <w:rPr>
+                <w:rFonts w:cs="Segoe UI"/>
+                <w:b/>
+                <w:bCs/>
+                <w:spacing w:val="1"/>
+              </w:rPr>
+            </w:pPr>
+            <w:r>
+              <w:rPr>
+                <w:rFonts w:cs="Segoe UI"/>
+                <w:b/>
+                <w:bCs/>
+                <w:spacing w:val="1"/>
+              </w:rPr>
+              <w:t>Metric</w:t>
+            </w:r>
+          </w:p>
+        </w:tc>
+        <w:tc>
+          <w:tcPr>
+            <w:tcW w:w="3260" w:type="dxa"/>
+          </w:tcPr>
+          <w:p>
+            <w:pPr>
+              <w:rPr>
+                <w:rFonts w:cs="Segoe UI"/>
+                <w:b/>
+                <w:bCs/>
+                <w:spacing w:val="1"/>
+              </w:rPr>
+            </w:pPr>
+            <w:r>
+              <w:rPr>
+                <w:rFonts w:cs="Segoe UI"/>
+                <w:b/>
+                <w:bCs/>
+                <w:spacing w:val="1"/>
+              </w:rPr>
+              <w:t>Random Forrest</w:t>
+            </w:r>
+          </w:p>
+        </w:tc>
+        <w:tc>
+          <w:tcPr>
+            <w:tcW w:w="3402" w:type="dxa"/>
+          </w:tcPr>
+          <w:p>
+            <w:pPr>
+              <w:rPr>
+                <w:rFonts w:cs="Segoe UI"/>
+                <w:b/>
+                <w:bCs/>
+                <w:spacing w:val="1"/>
+              </w:rPr>
+            </w:pPr>
+            <w:r>
+              <w:rPr>
+                <w:rFonts w:cs="Segoe UI"/>
+                <w:b/>
+                <w:bCs/>
+                <w:spacing w:val="1"/>
+              </w:rPr>
+              <w:t>Bagging</w:t>
+            </w:r>
+          </w:p>
+        </w:tc>
+      </w:tr>
+      <w:tr>
+        <w:trPr>
+          <w:trHeight w:val="484"/>
+          <w:jc w:val="center"/>
+        </w:trPr>
+        <w:tc>
+          <w:tcPr>
+            <w:tcW w:w="1555" w:type="dxa"/>
+          </w:tcPr>
+          <w:p>
+            <w:pPr>
+              <w:rPr>
+                <w:rFonts w:cs="Segoe UI"/>
+                <w:spacing w:val="1"/>
+              </w:rPr>
+            </w:pPr>
+            <w:r>
+              <w:rPr>
+                <w:rFonts w:cs="Segoe UI"/>
+                <w:spacing w:val="1"/>
+              </w:rPr>
+              <w:t>F1</w:t>
+            </w:r>
+            <w:r>
+              <w:rPr>
+                <w:rFonts w:cs="Segoe UI"/>
+                <w:spacing w:val="1"/>
+              </w:rPr>
+              <w:t>-score</w:t>
+            </w:r>
+          </w:p>
+        </w:tc>
+        <w:tc>
+          <w:tcPr>
+            <w:tcW w:w="3260" w:type="dxa"/>
+          </w:tcPr>
+          <w:p>
+            <w:pPr>
+              <w:rPr>
+                <w:rFonts w:cs="Segoe UI"/>
+                <w:spacing w:val="1"/>
+              </w:rPr>
+            </w:pPr>
+            <w:r>
+              <w:rPr>
+                <w:rFonts w:cs="Segoe UI"/>
+                <w:spacing w:val="1"/>
+              </w:rPr>
+              <w:t>0.9071</w:t>
+            </w:r>
+          </w:p>
+        </w:tc>
+        <w:tc>
+          <w:tcPr>
+            <w:tcW w:w="3402" w:type="dxa"/>
+          </w:tcPr>
+          <w:p>
+            <w:pPr>
+              <w:rPr>
+                <w:rFonts w:cs="Segoe UI"/>
+                <w:spacing w:val="1"/>
+              </w:rPr>
+            </w:pPr>
+            <w:r>
+              <w:rPr>
+                <w:rFonts w:cs="Segoe UI"/>
+                <w:spacing w:val="1"/>
+              </w:rPr>
+              <w:t>0.9011</w:t>
+            </w:r>
+          </w:p>
+        </w:tc>
+      </w:tr>
+    </w:tbl>
+    <w:p>
+      <w:pPr>
+        <w:rPr>
+          <w:rFonts w:cs="Segoe UI"/>
+          <w:spacing w:val="1"/>
+        </w:rPr>
+      </w:pPr>
+    </w:p>
+    <w:p>
+      <w:pPr>
+        <w:pStyle w:val="Heading2"/>
+        <w:numPr>
+          <w:ilvl w:val="1"/>
+          <w:numId w:val="2"/>
+        </w:numPr>
+      </w:pPr>
+      <w:r>
+        <w:t>Key Findings and Insights</w:t>
+      </w:r>
+    </w:p>
+    <w:p/>
+    <w:p>
+      <w:pPr>
+        <w:rPr>
+          <w:rFonts w:asciiTheme="majorHAnsi" w:eastAsiaTheme="majorEastAsia" w:hAnsiTheme="majorHAnsi" w:cstheme="majorBidi"/>
+          <w:b/>
+          <w:bCs/>
+          <w:color w:val="0F4761" w:themeColor="accent1" w:themeShade="BF"/>
+          <w:sz w:val="40"/>
+          <w:szCs w:val="40"/>
+        </w:rPr>
+      </w:pPr>
+      <w:r>
+        <w:rPr>
+          <w:b/>
+          <w:bCs/>
+        </w:rPr>
+        <w:br w:type="page"/>
+      </w:r>
+    </w:p>
+    <w:p>
+      <w:pPr>
+        <w:pStyle w:val="Heading1"/>
+        <w:numPr>
+          <w:ilvl w:val="0"/>
+          <w:numId w:val="1"/>
+        </w:numPr>
+        <w:ind w:left="426" w:hanging="426"/>
+        <w:rPr>
+          <w:b/>
+          <w:bCs/>
+        </w:rPr>
+      </w:pPr>
+      <w:r>
+        <w:rPr>
+          <w:b/>
+          <w:bCs/>
+        </w:rPr>
+        <w:lastRenderedPageBreak/>
+        <w:t>Task 2</w:t>
+      </w:r>
+      <w:r>
+        <w:rPr>
+          <w:b/>
+          <w:bCs/>
+        </w:rPr>
+        <w:t>: Risk Modeling for Online Marketplaces</w:t>
+      </w:r>
+    </w:p>
+    <w:p>
+      <w:pPr>
+        <w:pStyle w:val="Heading2"/>
+        <w:numPr>
+          <w:ilvl w:val="0"/>
+          <w:numId w:val="5"/>
+        </w:numPr>
+        <w:rPr>
+          <w:b/>
+          <w:bCs/>
+        </w:rPr>
+      </w:pPr>
+      <w:r>
+        <w:rPr>
+          <w:b/>
+          <w:bCs/>
+        </w:rPr>
+        <w:t>Overview</w:t>
+      </w:r>
+    </w:p>
+    <w:p/>
+    <w:p>
+      <w:pPr>
+        <w:pStyle w:val="Heading2"/>
+        <w:numPr>
+          <w:ilvl w:val="0"/>
+          <w:numId w:val="5"/>
+        </w:numPr>
+        <w:rPr>
+          <w:b/>
+          <w:bCs/>
+        </w:rPr>
+      </w:pPr>
+      <w:r>
+        <w:rPr>
+          <w:b/>
+          <w:bCs/>
+        </w:rPr>
+        <w:t>Methodology</w:t>
+      </w:r>
+    </w:p>
+    <w:p>
+      <w:pPr>
+        <w:rPr>
+          <w:rFonts w:asciiTheme="majorHAnsi" w:eastAsiaTheme="majorEastAsia" w:hAnsiTheme="majorHAnsi" w:cstheme="majorBidi"/>
+          <w:color w:val="0F4761" w:themeColor="accent1" w:themeShade="BF"/>
+          <w:sz w:val="40"/>
+          <w:szCs w:val="40"/>
+        </w:rPr>
+      </w:pPr>
+      <w:r>
+        <w:br w:type="page"/>
+      </w:r>
+    </w:p>
+    <w:p>
+      <w:pPr>
+        <w:pStyle w:val="Heading1"/>
+      </w:pPr>
+      <w:r>
+        <w:lastRenderedPageBreak/>
+        <w:t>Appendix</w:t>
+      </w:r>
+    </w:p>
+    <w:p>
+      <w:r>
+        <w:t xml:space="preserve">Source code: </w:t>
+      </w:r>
+      <w:hyperlink r:id="rId8" w:history="1">
+        <w:r>
+          <w:rPr>
+            <w:rStyle w:val="Hyperlink"/>
+          </w:rPr>
+          <w:t>https://github.com/minhng1305/FTEC4003-DataMining</w:t>
+        </w:r>
+      </w:hyperlink>
+      <w:r>
+        <w:t xml:space="preserve"> </w:t>
+      </w:r>
+    </w:p>
+    <w:p/>
     <w:p/>
     <w:sectPr>
+      <w:footerReference w:type="even" r:id="rId9"/>
+      <w:footerReference w:type="default" r:id="rId10"/>
       <w:pgSz w:w="12240" w:h="15840"/>
       <w:pgMar w:top="1440" w:right="1440" w:bottom="1440" w:left="1440" w:header="708" w:footer="708" w:gutter="0"/>
       <w:cols w:space="708"/>
@@ -149,19 +2120,1533 @@
 </w:document>
 </file>
 
+<file path=word/endnotes.xml><?xml version="1.0" encoding="utf-8"?>
+<w:endnotes xmlns:wpc="http://schemas.microsoft.com/office/word/2010/wordprocessingCanvas" xmlns:cx="http://schemas.microsoft.com/office/drawing/2014/chartex" xmlns:cx1="http://schemas.microsoft.com/office/drawing/2015/9/8/chartex" xmlns:cx2="http://schemas.microsoft.com/office/drawing/2015/10/21/chartex" xmlns:cx3="http://schemas.microsoft.com/office/drawing/2016/5/9/chartex" xmlns:cx4="http://schemas.microsoft.com/office/drawing/2016/5/10/chartex" xmlns:cx5="http://schemas.microsoft.com/office/drawing/2016/5/11/chartex" xmlns:cx6="http://schemas.microsoft.com/office/drawing/2016/5/12/chartex" xmlns:cx7="http://schemas.microsoft.com/office/drawing/2016/5/13/chartex" xmlns:cx8="http://schemas.microsoft.com/office/drawing/2016/5/14/chartex" xmlns:mc="http://schemas.openxmlformats.org/markup-compatibility/2006" xmlns:aink="http://schemas.microsoft.com/office/drawing/2016/ink" xmlns:am3d="http://schemas.microsoft.com/office/drawing/2017/model3d" xmlns:o="urn:schemas-microsoft-com:office:office" xmlns:oel="http://schemas.microsoft.com/office/2019/extlst" xmlns:r="http://schemas.openxmlformats.org/officeDocument/2006/relationships" xmlns:m="http://schemas.openxmlformats.org/officeDocument/2006/math" xmlns:v="urn:schemas-microsoft-com:vml" xmlns:wp14="http://schemas.microsoft.com/office/word/2010/wordprocessingDrawing" xmlns:wp="http://schemas.openxmlformats.org/drawingml/2006/wordprocessingDrawing" xmlns:w10="urn:schemas-microsoft-com:office:word" xmlns:w="http://schemas.openxmlformats.org/wordprocessingml/2006/main" xmlns:w14="http://schemas.microsoft.com/office/word/2010/wordml" xmlns:w15="http://schemas.microsoft.com/office/word/2012/wordml" xmlns:w16cex="http://schemas.microsoft.com/office/word/2018/wordml/cex" xmlns:w16cid="http://schemas.microsoft.com/office/word/2016/wordml/cid" xmlns:w16="http://schemas.microsoft.com/office/word/2018/wordml" xmlns:w16du="http://schemas.microsoft.com/office/word/2023/wordml/word16du" xmlns:w16sdtdh="http://schemas.microsoft.com/office/word/2020/wordml/sdtdatahash" xmlns:w16sdtfl="http://schemas.microsoft.com/office/word/2024/wordml/sdtformatlock" xmlns:w16se="http://schemas.microsoft.com/office/word/2015/wordml/symex" xmlns:wpg="http://schemas.microsoft.com/office/word/2010/wordprocessingGroup" xmlns:wpi="http://schemas.microsoft.com/office/word/2010/wordprocessingInk" xmlns:wne="http://schemas.microsoft.com/office/word/2006/wordml" xmlns:wps="http://schemas.microsoft.com/office/word/2010/wordprocessingShape" mc:Ignorable="w14 w15 w16se w16cid w16 w16cex w16sdtdh w16sdtfl w16du wp14">
+  <w:endnote w:type="separator" w:id="-1">
+    <w:p>
+      <w:pPr>
+        <w:spacing w:after="0" w:line="240" w:lineRule="auto"/>
+      </w:pPr>
+      <w:r>
+        <w:separator/>
+      </w:r>
+    </w:p>
+  </w:endnote>
+  <w:endnote w:type="continuationSeparator" w:id="0">
+    <w:p>
+      <w:pPr>
+        <w:spacing w:after="0" w:line="240" w:lineRule="auto"/>
+      </w:pPr>
+      <w:r>
+        <w:continuationSeparator/>
+      </w:r>
+    </w:p>
+  </w:endnote>
+</w:endnotes>
+</file>
+
+<file path=word/footer1.xml><?xml version="1.0" encoding="utf-8"?>
+<w:ftr xmlns:wpc="http://schemas.microsoft.com/office/word/2010/wordprocessingCanvas" xmlns:cx="http://schemas.microsoft.com/office/drawing/2014/chartex" xmlns:cx1="http://schemas.microsoft.com/office/drawing/2015/9/8/chartex" xmlns:cx2="http://schemas.microsoft.com/office/drawing/2015/10/21/chartex" xmlns:cx3="http://schemas.microsoft.com/office/drawing/2016/5/9/chartex" xmlns:cx4="http://schemas.microsoft.com/office/drawing/2016/5/10/chartex" xmlns:cx5="http://schemas.microsoft.com/office/drawing/2016/5/11/chartex" xmlns:cx6="http://schemas.microsoft.com/office/drawing/2016/5/12/chartex" xmlns:cx7="http://schemas.microsoft.com/office/drawing/2016/5/13/chartex" xmlns:cx8="http://schemas.microsoft.com/office/drawing/2016/5/14/chartex" xmlns:mc="http://schemas.openxmlformats.org/markup-compatibility/2006" xmlns:aink="http://schemas.microsoft.com/office/drawing/2016/ink" xmlns:am3d="http://schemas.microsoft.com/office/drawing/2017/model3d" xmlns:o="urn:schemas-microsoft-com:office:office" xmlns:oel="http://schemas.microsoft.com/office/2019/extlst" xmlns:r="http://schemas.openxmlformats.org/officeDocument/2006/relationships" xmlns:m="http://schemas.openxmlformats.org/officeDocument/2006/math" xmlns:v="urn:schemas-microsoft-com:vml" xmlns:wp14="http://schemas.microsoft.com/office/word/2010/wordprocessingDrawing" xmlns:wp="http://schemas.openxmlformats.org/drawingml/2006/wordprocessingDrawing" xmlns:w10="urn:schemas-microsoft-com:office:word" xmlns:w="http://schemas.openxmlformats.org/wordprocessingml/2006/main" xmlns:w14="http://schemas.microsoft.com/office/word/2010/wordml" xmlns:w15="http://schemas.microsoft.com/office/word/2012/wordml" xmlns:w16cex="http://schemas.microsoft.com/office/word/2018/wordml/cex" xmlns:w16cid="http://schemas.microsoft.com/office/word/2016/wordml/cid" xmlns:w16="http://schemas.microsoft.com/office/word/2018/wordml" xmlns:w16du="http://schemas.microsoft.com/office/word/2023/wordml/word16du" xmlns:w16sdtdh="http://schemas.microsoft.com/office/word/2020/wordml/sdtdatahash" xmlns:w16sdtfl="http://schemas.microsoft.com/office/word/2024/wordml/sdtformatlock" xmlns:w16se="http://schemas.microsoft.com/office/word/2015/wordml/symex" xmlns:wpg="http://schemas.microsoft.com/office/word/2010/wordprocessingGroup" xmlns:wpi="http://schemas.microsoft.com/office/word/2010/wordprocessingInk" xmlns:wne="http://schemas.microsoft.com/office/word/2006/wordml" xmlns:wps="http://schemas.microsoft.com/office/word/2010/wordprocessingShape" mc:Ignorable="w14 w15 w16se w16cid w16 w16cex w16sdtdh w16sdtfl w16du wp14">
+  <w:sdt>
+    <w:sdtPr>
+      <w:rPr>
+        <w:rStyle w:val="PageNumber"/>
+      </w:rPr>
+      <w:id w:val="1369411464"/>
+      <w:docPartObj>
+        <w:docPartGallery w:val="Page Numbers (Bottom of Page)"/>
+        <w:docPartUnique/>
+      </w:docPartObj>
+    </w:sdtPr>
+    <w:sdtContent>
+      <w:p>
+        <w:pPr>
+          <w:pStyle w:val="Footer"/>
+          <w:framePr w:wrap="none" w:vAnchor="text" w:hAnchor="margin" w:xAlign="center" w:y="1"/>
+          <w:rPr>
+            <w:rStyle w:val="PageNumber"/>
+          </w:rPr>
+        </w:pPr>
+        <w:r>
+          <w:rPr>
+            <w:rStyle w:val="PageNumber"/>
+          </w:rPr>
+          <w:fldChar w:fldCharType="begin"/>
+        </w:r>
+        <w:r>
+          <w:rPr>
+            <w:rStyle w:val="PageNumber"/>
+          </w:rPr>
+          <w:instrText xml:space="preserve"> PAGE </w:instrText>
+        </w:r>
+        <w:r>
+          <w:rPr>
+            <w:rStyle w:val="PageNumber"/>
+          </w:rPr>
+          <w:fldChar w:fldCharType="separate"/>
+        </w:r>
+        <w:r>
+          <w:rPr>
+            <w:rStyle w:val="PageNumber"/>
+          </w:rPr>
+          <w:fldChar w:fldCharType="end"/>
+        </w:r>
+      </w:p>
+    </w:sdtContent>
+  </w:sdt>
+  <w:p>
+    <w:pPr>
+      <w:pStyle w:val="Footer"/>
+    </w:pPr>
+  </w:p>
+</w:ftr>
+</file>
+
+<file path=word/footer2.xml><?xml version="1.0" encoding="utf-8"?>
+<w:ftr xmlns:wpc="http://schemas.microsoft.com/office/word/2010/wordprocessingCanvas" xmlns:cx="http://schemas.microsoft.com/office/drawing/2014/chartex" xmlns:cx1="http://schemas.microsoft.com/office/drawing/2015/9/8/chartex" xmlns:cx2="http://schemas.microsoft.com/office/drawing/2015/10/21/chartex" xmlns:cx3="http://schemas.microsoft.com/office/drawing/2016/5/9/chartex" xmlns:cx4="http://schemas.microsoft.com/office/drawing/2016/5/10/chartex" xmlns:cx5="http://schemas.microsoft.com/office/drawing/2016/5/11/chartex" xmlns:cx6="http://schemas.microsoft.com/office/drawing/2016/5/12/chartex" xmlns:cx7="http://schemas.microsoft.com/office/drawing/2016/5/13/chartex" xmlns:cx8="http://schemas.microsoft.com/office/drawing/2016/5/14/chartex" xmlns:mc="http://schemas.openxmlformats.org/markup-compatibility/2006" xmlns:aink="http://schemas.microsoft.com/office/drawing/2016/ink" xmlns:am3d="http://schemas.microsoft.com/office/drawing/2017/model3d" xmlns:o="urn:schemas-microsoft-com:office:office" xmlns:oel="http://schemas.microsoft.com/office/2019/extlst" xmlns:r="http://schemas.openxmlformats.org/officeDocument/2006/relationships" xmlns:m="http://schemas.openxmlformats.org/officeDocument/2006/math" xmlns:v="urn:schemas-microsoft-com:vml" xmlns:wp14="http://schemas.microsoft.com/office/word/2010/wordprocessingDrawing" xmlns:wp="http://schemas.openxmlformats.org/drawingml/2006/wordprocessingDrawing" xmlns:w10="urn:schemas-microsoft-com:office:word" xmlns:w="http://schemas.openxmlformats.org/wordprocessingml/2006/main" xmlns:w14="http://schemas.microsoft.com/office/word/2010/wordml" xmlns:w15="http://schemas.microsoft.com/office/word/2012/wordml" xmlns:w16cex="http://schemas.microsoft.com/office/word/2018/wordml/cex" xmlns:w16cid="http://schemas.microsoft.com/office/word/2016/wordml/cid" xmlns:w16="http://schemas.microsoft.com/office/word/2018/wordml" xmlns:w16du="http://schemas.microsoft.com/office/word/2023/wordml/word16du" xmlns:w16sdtdh="http://schemas.microsoft.com/office/word/2020/wordml/sdtdatahash" xmlns:w16sdtfl="http://schemas.microsoft.com/office/word/2024/wordml/sdtformatlock" xmlns:w16se="http://schemas.microsoft.com/office/word/2015/wordml/symex" xmlns:wpg="http://schemas.microsoft.com/office/word/2010/wordprocessingGroup" xmlns:wpi="http://schemas.microsoft.com/office/word/2010/wordprocessingInk" xmlns:wne="http://schemas.microsoft.com/office/word/2006/wordml" xmlns:wps="http://schemas.microsoft.com/office/word/2010/wordprocessingShape" mc:Ignorable="w14 w15 w16se w16cid w16 w16cex w16sdtdh w16sdtfl w16du wp14">
+  <w:sdt>
+    <w:sdtPr>
+      <w:rPr>
+        <w:rStyle w:val="PageNumber"/>
+      </w:rPr>
+      <w:id w:val="1799646915"/>
+      <w:docPartObj>
+        <w:docPartGallery w:val="Page Numbers (Bottom of Page)"/>
+        <w:docPartUnique/>
+      </w:docPartObj>
+    </w:sdtPr>
+    <w:sdtContent>
+      <w:p>
+        <w:pPr>
+          <w:pStyle w:val="Footer"/>
+          <w:framePr w:wrap="none" w:vAnchor="text" w:hAnchor="margin" w:xAlign="center" w:y="1"/>
+          <w:rPr>
+            <w:rStyle w:val="PageNumber"/>
+          </w:rPr>
+        </w:pPr>
+        <w:r>
+          <w:rPr>
+            <w:rStyle w:val="PageNumber"/>
+          </w:rPr>
+          <w:fldChar w:fldCharType="begin"/>
+        </w:r>
+        <w:r>
+          <w:rPr>
+            <w:rStyle w:val="PageNumber"/>
+          </w:rPr>
+          <w:instrText xml:space="preserve"> PAGE </w:instrText>
+        </w:r>
+        <w:r>
+          <w:rPr>
+            <w:rStyle w:val="PageNumber"/>
+          </w:rPr>
+          <w:fldChar w:fldCharType="separate"/>
+        </w:r>
+        <w:r>
+          <w:rPr>
+            <w:rStyle w:val="PageNumber"/>
+            <w:noProof/>
+          </w:rPr>
+          <w:t>1</w:t>
+        </w:r>
+        <w:r>
+          <w:rPr>
+            <w:rStyle w:val="PageNumber"/>
+          </w:rPr>
+          <w:fldChar w:fldCharType="end"/>
+        </w:r>
+      </w:p>
+    </w:sdtContent>
+  </w:sdt>
+  <w:p>
+    <w:pPr>
+      <w:pStyle w:val="Footer"/>
+    </w:pPr>
+  </w:p>
+</w:ftr>
+</file>
+
+<file path=word/footnotes.xml><?xml version="1.0" encoding="utf-8"?>
+<w:footnotes xmlns:wpc="http://schemas.microsoft.com/office/word/2010/wordprocessingCanvas" xmlns:cx="http://schemas.microsoft.com/office/drawing/2014/chartex" xmlns:cx1="http://schemas.microsoft.com/office/drawing/2015/9/8/chartex" xmlns:cx2="http://schemas.microsoft.com/office/drawing/2015/10/21/chartex" xmlns:cx3="http://schemas.microsoft.com/office/drawing/2016/5/9/chartex" xmlns:cx4="http://schemas.microsoft.com/office/drawing/2016/5/10/chartex" xmlns:cx5="http://schemas.microsoft.com/office/drawing/2016/5/11/chartex" xmlns:cx6="http://schemas.microsoft.com/office/drawing/2016/5/12/chartex" xmlns:cx7="http://schemas.microsoft.com/office/drawing/2016/5/13/chartex" xmlns:cx8="http://schemas.microsoft.com/office/drawing/2016/5/14/chartex" xmlns:mc="http://schemas.openxmlformats.org/markup-compatibility/2006" xmlns:aink="http://schemas.microsoft.com/office/drawing/2016/ink" xmlns:am3d="http://schemas.microsoft.com/office/drawing/2017/model3d" xmlns:o="urn:schemas-microsoft-com:office:office" xmlns:oel="http://schemas.microsoft.com/office/2019/extlst" xmlns:r="http://schemas.openxmlformats.org/officeDocument/2006/relationships" xmlns:m="http://schemas.openxmlformats.org/officeDocument/2006/math" xmlns:v="urn:schemas-microsoft-com:vml" xmlns:wp14="http://schemas.microsoft.com/office/word/2010/wordprocessingDrawing" xmlns:wp="http://schemas.openxmlformats.org/drawingml/2006/wordprocessingDrawing" xmlns:w10="urn:schemas-microsoft-com:office:word" xmlns:w="http://schemas.openxmlformats.org/wordprocessingml/2006/main" xmlns:w14="http://schemas.microsoft.com/office/word/2010/wordml" xmlns:w15="http://schemas.microsoft.com/office/word/2012/wordml" xmlns:w16cex="http://schemas.microsoft.com/office/word/2018/wordml/cex" xmlns:w16cid="http://schemas.microsoft.com/office/word/2016/wordml/cid" xmlns:w16="http://schemas.microsoft.com/office/word/2018/wordml" xmlns:w16du="http://schemas.microsoft.com/office/word/2023/wordml/word16du" xmlns:w16sdtdh="http://schemas.microsoft.com/office/word/2020/wordml/sdtdatahash" xmlns:w16sdtfl="http://schemas.microsoft.com/office/word/2024/wordml/sdtformatlock" xmlns:w16se="http://schemas.microsoft.com/office/word/2015/wordml/symex" xmlns:wpg="http://schemas.microsoft.com/office/word/2010/wordprocessingGroup" xmlns:wpi="http://schemas.microsoft.com/office/word/2010/wordprocessingInk" xmlns:wne="http://schemas.microsoft.com/office/word/2006/wordml" xmlns:wps="http://schemas.microsoft.com/office/word/2010/wordprocessingShape" mc:Ignorable="w14 w15 w16se w16cid w16 w16cex w16sdtdh w16sdtfl w16du wp14">
+  <w:footnote w:type="separator" w:id="-1">
+    <w:p>
+      <w:pPr>
+        <w:spacing w:after="0" w:line="240" w:lineRule="auto"/>
+      </w:pPr>
+      <w:r>
+        <w:separator/>
+      </w:r>
+    </w:p>
+  </w:footnote>
+  <w:footnote w:type="continuationSeparator" w:id="0">
+    <w:p>
+      <w:pPr>
+        <w:spacing w:after="0" w:line="240" w:lineRule="auto"/>
+      </w:pPr>
+      <w:r>
+        <w:continuationSeparator/>
+      </w:r>
+    </w:p>
+  </w:footnote>
+</w:footnotes>
+</file>
+
 <file path=word/numbering.xml><?xml version="1.0" encoding="utf-8"?>
 <w:numbering xmlns:wpc="http://schemas.microsoft.com/office/word/2010/wordprocessingCanvas" xmlns:cx="http://schemas.microsoft.com/office/drawing/2014/chartex" xmlns:cx1="http://schemas.microsoft.com/office/drawing/2015/9/8/chartex" xmlns:cx2="http://schemas.microsoft.com/office/drawing/2015/10/21/chartex" xmlns:cx3="http://schemas.microsoft.com/office/drawing/2016/5/9/chartex" xmlns:cx4="http://schemas.microsoft.com/office/drawing/2016/5/10/chartex" xmlns:cx5="http://schemas.microsoft.com/office/drawing/2016/5/11/chartex" xmlns:cx6="http://schemas.microsoft.com/office/drawing/2016/5/12/chartex" xmlns:cx7="http://schemas.microsoft.com/office/drawing/2016/5/13/chartex" xmlns:cx8="http://schemas.microsoft.com/office/drawing/2016/5/14/chartex" xmlns:mc="http://schemas.openxmlformats.org/markup-compatibility/2006" xmlns:aink="http://schemas.microsoft.com/office/drawing/2016/ink" xmlns:am3d="http://schemas.microsoft.com/office/drawing/2017/model3d" xmlns:o="urn:schemas-microsoft-com:office:office" xmlns:oel="http://schemas.microsoft.com/office/2019/extlst" xmlns:r="http://schemas.openxmlformats.org/officeDocument/2006/relationships" xmlns:m="http://schemas.openxmlformats.org/officeDocument/2006/math" xmlns:v="urn:schemas-microsoft-com:vml" xmlns:wp14="http://schemas.microsoft.com/office/word/2010/wordprocessingDrawing" xmlns:wp="http://schemas.openxmlformats.org/drawingml/2006/wordprocessingDrawing" xmlns:w10="urn:schemas-microsoft-com:office:word" xmlns:w="http://schemas.openxmlformats.org/wordprocessingml/2006/main" xmlns:w14="http://schemas.microsoft.com/office/word/2010/wordml" xmlns:w15="http://schemas.microsoft.com/office/word/2012/wordml" xmlns:w16cex="http://schemas.microsoft.com/office/word/2018/wordml/cex" xmlns:w16cid="http://schemas.microsoft.com/office/word/2016/wordml/cid" xmlns:w16="http://schemas.microsoft.com/office/word/2018/wordml" xmlns:w16du="http://schemas.microsoft.com/office/word/2023/wordml/word16du" xmlns:w16sdtdh="http://schemas.microsoft.com/office/word/2020/wordml/sdtdatahash" xmlns:w16sdtfl="http://schemas.microsoft.com/office/word/2024/wordml/sdtformatlock" xmlns:w16se="http://schemas.microsoft.com/office/word/2015/wordml/symex" xmlns:wpg="http://schemas.microsoft.com/office/word/2010/wordprocessingGroup" xmlns:wpi="http://schemas.microsoft.com/office/word/2010/wordprocessingInk" xmlns:wne="http://schemas.microsoft.com/office/word/2006/wordml" xmlns:wps="http://schemas.microsoft.com/office/word/2010/wordprocessingShape" mc:Ignorable="w14 w15 w16se w16cid w16 w16cex w16sdtdh w16sdtfl w16du wp14">
   <w:abstractNum w:abstractNumId="0" w15:restartNumberingAfterBreak="0">
+    <w:nsid w:val="0CFB3524"/>
+    <w:multiLevelType w:val="multilevel"/>
+    <w:tmpl w:val="938865F6"/>
+    <w:lvl w:ilvl="0">
+      <w:start w:val="1"/>
+      <w:numFmt w:val="decimal"/>
+      <w:lvlText w:val="%1."/>
+      <w:lvlJc w:val="left"/>
+      <w:pPr>
+        <w:ind w:left="360" w:hanging="360"/>
+      </w:pPr>
+      <w:rPr>
+        <w:rFonts w:hint="default"/>
+      </w:rPr>
+    </w:lvl>
+    <w:lvl w:ilvl="1">
+      <w:start w:val="1"/>
+      <w:numFmt w:val="decimal"/>
+      <w:isLgl/>
+      <w:lvlText w:val="%1.%2."/>
+      <w:lvlJc w:val="left"/>
+      <w:pPr>
+        <w:ind w:left="720" w:hanging="720"/>
+      </w:pPr>
+      <w:rPr>
+        <w:rFonts w:hint="default"/>
+      </w:rPr>
+    </w:lvl>
+    <w:lvl w:ilvl="2">
+      <w:start w:val="1"/>
+      <w:numFmt w:val="decimal"/>
+      <w:isLgl/>
+      <w:lvlText w:val="%1.%2.%3."/>
+      <w:lvlJc w:val="left"/>
+      <w:pPr>
+        <w:ind w:left="720" w:hanging="720"/>
+      </w:pPr>
+      <w:rPr>
+        <w:rFonts w:hint="default"/>
+      </w:rPr>
+    </w:lvl>
+    <w:lvl w:ilvl="3">
+      <w:start w:val="1"/>
+      <w:numFmt w:val="decimal"/>
+      <w:isLgl/>
+      <w:lvlText w:val="%1.%2.%3.%4."/>
+      <w:lvlJc w:val="left"/>
+      <w:pPr>
+        <w:ind w:left="1080" w:hanging="1080"/>
+      </w:pPr>
+      <w:rPr>
+        <w:rFonts w:hint="default"/>
+      </w:rPr>
+    </w:lvl>
+    <w:lvl w:ilvl="4">
+      <w:start w:val="1"/>
+      <w:numFmt w:val="decimal"/>
+      <w:isLgl/>
+      <w:lvlText w:val="%1.%2.%3.%4.%5."/>
+      <w:lvlJc w:val="left"/>
+      <w:pPr>
+        <w:ind w:left="1440" w:hanging="1440"/>
+      </w:pPr>
+      <w:rPr>
+        <w:rFonts w:hint="default"/>
+      </w:rPr>
+    </w:lvl>
+    <w:lvl w:ilvl="5">
+      <w:start w:val="1"/>
+      <w:numFmt w:val="decimal"/>
+      <w:isLgl/>
+      <w:lvlText w:val="%1.%2.%3.%4.%5.%6."/>
+      <w:lvlJc w:val="left"/>
+      <w:pPr>
+        <w:ind w:left="1440" w:hanging="1440"/>
+      </w:pPr>
+      <w:rPr>
+        <w:rFonts w:hint="default"/>
+      </w:rPr>
+    </w:lvl>
+    <w:lvl w:ilvl="6">
+      <w:start w:val="1"/>
+      <w:numFmt w:val="decimal"/>
+      <w:isLgl/>
+      <w:lvlText w:val="%1.%2.%3.%4.%5.%6.%7."/>
+      <w:lvlJc w:val="left"/>
+      <w:pPr>
+        <w:ind w:left="1800" w:hanging="1800"/>
+      </w:pPr>
+      <w:rPr>
+        <w:rFonts w:hint="default"/>
+      </w:rPr>
+    </w:lvl>
+    <w:lvl w:ilvl="7">
+      <w:start w:val="1"/>
+      <w:numFmt w:val="decimal"/>
+      <w:isLgl/>
+      <w:lvlText w:val="%1.%2.%3.%4.%5.%6.%7.%8."/>
+      <w:lvlJc w:val="left"/>
+      <w:pPr>
+        <w:ind w:left="2160" w:hanging="2160"/>
+      </w:pPr>
+      <w:rPr>
+        <w:rFonts w:hint="default"/>
+      </w:rPr>
+    </w:lvl>
+    <w:lvl w:ilvl="8">
+      <w:start w:val="1"/>
+      <w:numFmt w:val="decimal"/>
+      <w:isLgl/>
+      <w:lvlText w:val="%1.%2.%3.%4.%5.%6.%7.%8.%9."/>
+      <w:lvlJc w:val="left"/>
+      <w:pPr>
+        <w:ind w:left="2160" w:hanging="2160"/>
+      </w:pPr>
+      <w:rPr>
+        <w:rFonts w:hint="default"/>
+      </w:rPr>
+    </w:lvl>
+  </w:abstractNum>
+  <w:abstractNum w:abstractNumId="1" w15:restartNumberingAfterBreak="0">
+    <w:nsid w:val="14E54F93"/>
+    <w:multiLevelType w:val="multilevel"/>
+    <w:tmpl w:val="F5D20354"/>
+    <w:lvl w:ilvl="0">
+      <w:start w:val="1"/>
+      <w:numFmt w:val="bullet"/>
+      <w:lvlText w:val=""/>
+      <w:lvlJc w:val="left"/>
+      <w:pPr>
+        <w:tabs>
+          <w:tab w:val="num" w:pos="720"/>
+        </w:tabs>
+        <w:ind w:left="720" w:hanging="360"/>
+      </w:pPr>
+      <w:rPr>
+        <w:rFonts w:ascii="Symbol" w:hAnsi="Symbol" w:hint="default"/>
+        <w:sz w:val="20"/>
+      </w:rPr>
+    </w:lvl>
+    <w:lvl w:ilvl="1" w:tentative="1">
+      <w:start w:val="1"/>
+      <w:numFmt w:val="bullet"/>
+      <w:lvlText w:val="o"/>
+      <w:lvlJc w:val="left"/>
+      <w:pPr>
+        <w:tabs>
+          <w:tab w:val="num" w:pos="1440"/>
+        </w:tabs>
+        <w:ind w:left="1440" w:hanging="360"/>
+      </w:pPr>
+      <w:rPr>
+        <w:rFonts w:ascii="Courier New" w:hAnsi="Courier New" w:hint="default"/>
+        <w:sz w:val="20"/>
+      </w:rPr>
+    </w:lvl>
+    <w:lvl w:ilvl="2" w:tentative="1">
+      <w:start w:val="1"/>
+      <w:numFmt w:val="bullet"/>
+      <w:lvlText w:val=""/>
+      <w:lvlJc w:val="left"/>
+      <w:pPr>
+        <w:tabs>
+          <w:tab w:val="num" w:pos="2160"/>
+        </w:tabs>
+        <w:ind w:left="2160" w:hanging="360"/>
+      </w:pPr>
+      <w:rPr>
+        <w:rFonts w:ascii="Wingdings" w:hAnsi="Wingdings" w:hint="default"/>
+        <w:sz w:val="20"/>
+      </w:rPr>
+    </w:lvl>
+    <w:lvl w:ilvl="3" w:tentative="1">
+      <w:start w:val="1"/>
+      <w:numFmt w:val="bullet"/>
+      <w:lvlText w:val=""/>
+      <w:lvlJc w:val="left"/>
+      <w:pPr>
+        <w:tabs>
+          <w:tab w:val="num" w:pos="2880"/>
+        </w:tabs>
+        <w:ind w:left="2880" w:hanging="360"/>
+      </w:pPr>
+      <w:rPr>
+        <w:rFonts w:ascii="Wingdings" w:hAnsi="Wingdings" w:hint="default"/>
+        <w:sz w:val="20"/>
+      </w:rPr>
+    </w:lvl>
+    <w:lvl w:ilvl="4" w:tentative="1">
+      <w:start w:val="1"/>
+      <w:numFmt w:val="bullet"/>
+      <w:lvlText w:val=""/>
+      <w:lvlJc w:val="left"/>
+      <w:pPr>
+        <w:tabs>
+          <w:tab w:val="num" w:pos="3600"/>
+        </w:tabs>
+        <w:ind w:left="3600" w:hanging="360"/>
+      </w:pPr>
+      <w:rPr>
+        <w:rFonts w:ascii="Wingdings" w:hAnsi="Wingdings" w:hint="default"/>
+        <w:sz w:val="20"/>
+      </w:rPr>
+    </w:lvl>
+    <w:lvl w:ilvl="5" w:tentative="1">
+      <w:start w:val="1"/>
+      <w:numFmt w:val="bullet"/>
+      <w:lvlText w:val=""/>
+      <w:lvlJc w:val="left"/>
+      <w:pPr>
+        <w:tabs>
+          <w:tab w:val="num" w:pos="4320"/>
+        </w:tabs>
+        <w:ind w:left="4320" w:hanging="360"/>
+      </w:pPr>
+      <w:rPr>
+        <w:rFonts w:ascii="Wingdings" w:hAnsi="Wingdings" w:hint="default"/>
+        <w:sz w:val="20"/>
+      </w:rPr>
+    </w:lvl>
+    <w:lvl w:ilvl="6" w:tentative="1">
+      <w:start w:val="1"/>
+      <w:numFmt w:val="bullet"/>
+      <w:lvlText w:val=""/>
+      <w:lvlJc w:val="left"/>
+      <w:pPr>
+        <w:tabs>
+          <w:tab w:val="num" w:pos="5040"/>
+        </w:tabs>
+        <w:ind w:left="5040" w:hanging="360"/>
+      </w:pPr>
+      <w:rPr>
+        <w:rFonts w:ascii="Wingdings" w:hAnsi="Wingdings" w:hint="default"/>
+        <w:sz w:val="20"/>
+      </w:rPr>
+    </w:lvl>
+    <w:lvl w:ilvl="7" w:tentative="1">
+      <w:start w:val="1"/>
+      <w:numFmt w:val="bullet"/>
+      <w:lvlText w:val=""/>
+      <w:lvlJc w:val="left"/>
+      <w:pPr>
+        <w:tabs>
+          <w:tab w:val="num" w:pos="5760"/>
+        </w:tabs>
+        <w:ind w:left="5760" w:hanging="360"/>
+      </w:pPr>
+      <w:rPr>
+        <w:rFonts w:ascii="Wingdings" w:hAnsi="Wingdings" w:hint="default"/>
+        <w:sz w:val="20"/>
+      </w:rPr>
+    </w:lvl>
+    <w:lvl w:ilvl="8" w:tentative="1">
+      <w:start w:val="1"/>
+      <w:numFmt w:val="bullet"/>
+      <w:lvlText w:val=""/>
+      <w:lvlJc w:val="left"/>
+      <w:pPr>
+        <w:tabs>
+          <w:tab w:val="num" w:pos="6480"/>
+        </w:tabs>
+        <w:ind w:left="6480" w:hanging="360"/>
+      </w:pPr>
+      <w:rPr>
+        <w:rFonts w:ascii="Wingdings" w:hAnsi="Wingdings" w:hint="default"/>
+        <w:sz w:val="20"/>
+      </w:rPr>
+    </w:lvl>
+  </w:abstractNum>
+  <w:abstractNum w:abstractNumId="2" w15:restartNumberingAfterBreak="0">
+    <w:nsid w:val="18786A68"/>
+    <w:multiLevelType w:val="multilevel"/>
+    <w:tmpl w:val="C8B0B012"/>
+    <w:lvl w:ilvl="0">
+      <w:start w:val="1"/>
+      <w:numFmt w:val="bullet"/>
+      <w:lvlText w:val=""/>
+      <w:lvlJc w:val="left"/>
+      <w:pPr>
+        <w:tabs>
+          <w:tab w:val="num" w:pos="720"/>
+        </w:tabs>
+        <w:ind w:left="720" w:hanging="360"/>
+      </w:pPr>
+      <w:rPr>
+        <w:rFonts w:ascii="Symbol" w:hAnsi="Symbol" w:hint="default"/>
+        <w:sz w:val="20"/>
+      </w:rPr>
+    </w:lvl>
+    <w:lvl w:ilvl="1" w:tentative="1">
+      <w:start w:val="1"/>
+      <w:numFmt w:val="bullet"/>
+      <w:lvlText w:val="o"/>
+      <w:lvlJc w:val="left"/>
+      <w:pPr>
+        <w:tabs>
+          <w:tab w:val="num" w:pos="1440"/>
+        </w:tabs>
+        <w:ind w:left="1440" w:hanging="360"/>
+      </w:pPr>
+      <w:rPr>
+        <w:rFonts w:ascii="Courier New" w:hAnsi="Courier New" w:hint="default"/>
+        <w:sz w:val="20"/>
+      </w:rPr>
+    </w:lvl>
+    <w:lvl w:ilvl="2" w:tentative="1">
+      <w:start w:val="1"/>
+      <w:numFmt w:val="bullet"/>
+      <w:lvlText w:val=""/>
+      <w:lvlJc w:val="left"/>
+      <w:pPr>
+        <w:tabs>
+          <w:tab w:val="num" w:pos="2160"/>
+        </w:tabs>
+        <w:ind w:left="2160" w:hanging="360"/>
+      </w:pPr>
+      <w:rPr>
+        <w:rFonts w:ascii="Wingdings" w:hAnsi="Wingdings" w:hint="default"/>
+        <w:sz w:val="20"/>
+      </w:rPr>
+    </w:lvl>
+    <w:lvl w:ilvl="3" w:tentative="1">
+      <w:start w:val="1"/>
+      <w:numFmt w:val="bullet"/>
+      <w:lvlText w:val=""/>
+      <w:lvlJc w:val="left"/>
+      <w:pPr>
+        <w:tabs>
+          <w:tab w:val="num" w:pos="2880"/>
+        </w:tabs>
+        <w:ind w:left="2880" w:hanging="360"/>
+      </w:pPr>
+      <w:rPr>
+        <w:rFonts w:ascii="Wingdings" w:hAnsi="Wingdings" w:hint="default"/>
+        <w:sz w:val="20"/>
+      </w:rPr>
+    </w:lvl>
+    <w:lvl w:ilvl="4" w:tentative="1">
+      <w:start w:val="1"/>
+      <w:numFmt w:val="bullet"/>
+      <w:lvlText w:val=""/>
+      <w:lvlJc w:val="left"/>
+      <w:pPr>
+        <w:tabs>
+          <w:tab w:val="num" w:pos="3600"/>
+        </w:tabs>
+        <w:ind w:left="3600" w:hanging="360"/>
+      </w:pPr>
+      <w:rPr>
+        <w:rFonts w:ascii="Wingdings" w:hAnsi="Wingdings" w:hint="default"/>
+        <w:sz w:val="20"/>
+      </w:rPr>
+    </w:lvl>
+    <w:lvl w:ilvl="5" w:tentative="1">
+      <w:start w:val="1"/>
+      <w:numFmt w:val="bullet"/>
+      <w:lvlText w:val=""/>
+      <w:lvlJc w:val="left"/>
+      <w:pPr>
+        <w:tabs>
+          <w:tab w:val="num" w:pos="4320"/>
+        </w:tabs>
+        <w:ind w:left="4320" w:hanging="360"/>
+      </w:pPr>
+      <w:rPr>
+        <w:rFonts w:ascii="Wingdings" w:hAnsi="Wingdings" w:hint="default"/>
+        <w:sz w:val="20"/>
+      </w:rPr>
+    </w:lvl>
+    <w:lvl w:ilvl="6" w:tentative="1">
+      <w:start w:val="1"/>
+      <w:numFmt w:val="bullet"/>
+      <w:lvlText w:val=""/>
+      <w:lvlJc w:val="left"/>
+      <w:pPr>
+        <w:tabs>
+          <w:tab w:val="num" w:pos="5040"/>
+        </w:tabs>
+        <w:ind w:left="5040" w:hanging="360"/>
+      </w:pPr>
+      <w:rPr>
+        <w:rFonts w:ascii="Wingdings" w:hAnsi="Wingdings" w:hint="default"/>
+        <w:sz w:val="20"/>
+      </w:rPr>
+    </w:lvl>
+    <w:lvl w:ilvl="7" w:tentative="1">
+      <w:start w:val="1"/>
+      <w:numFmt w:val="bullet"/>
+      <w:lvlText w:val=""/>
+      <w:lvlJc w:val="left"/>
+      <w:pPr>
+        <w:tabs>
+          <w:tab w:val="num" w:pos="5760"/>
+        </w:tabs>
+        <w:ind w:left="5760" w:hanging="360"/>
+      </w:pPr>
+      <w:rPr>
+        <w:rFonts w:ascii="Wingdings" w:hAnsi="Wingdings" w:hint="default"/>
+        <w:sz w:val="20"/>
+      </w:rPr>
+    </w:lvl>
+    <w:lvl w:ilvl="8" w:tentative="1">
+      <w:start w:val="1"/>
+      <w:numFmt w:val="bullet"/>
+      <w:lvlText w:val=""/>
+      <w:lvlJc w:val="left"/>
+      <w:pPr>
+        <w:tabs>
+          <w:tab w:val="num" w:pos="6480"/>
+        </w:tabs>
+        <w:ind w:left="6480" w:hanging="360"/>
+      </w:pPr>
+      <w:rPr>
+        <w:rFonts w:ascii="Wingdings" w:hAnsi="Wingdings" w:hint="default"/>
+        <w:sz w:val="20"/>
+      </w:rPr>
+    </w:lvl>
+  </w:abstractNum>
+  <w:abstractNum w:abstractNumId="3" w15:restartNumberingAfterBreak="0">
     <w:nsid w:val="21707231"/>
-    <w:multiLevelType w:val="hybridMultilevel"/>
-    <w:tmpl w:val="40509F50"/>
-    <w:lvl w:ilvl="0" w:tplc="FEC2E41A">
+    <w:multiLevelType w:val="multilevel"/>
+    <w:tmpl w:val="D0FCC87C"/>
+    <w:lvl w:ilvl="0">
       <w:start w:val="1"/>
       <w:numFmt w:val="upperRoman"/>
       <w:lvlText w:val="%1."/>
       <w:lvlJc w:val="left"/>
       <w:pPr>
         <w:ind w:left="720" w:hanging="720"/>
+      </w:pPr>
+      <w:rPr>
+        <w:rFonts w:hint="default"/>
+      </w:rPr>
+    </w:lvl>
+    <w:lvl w:ilvl="1">
+      <w:start w:val="4"/>
+      <w:numFmt w:val="decimal"/>
+      <w:isLgl/>
+      <w:lvlText w:val="%1.%2."/>
+      <w:lvlJc w:val="left"/>
+      <w:pPr>
+        <w:ind w:left="720" w:hanging="720"/>
+      </w:pPr>
+      <w:rPr>
+        <w:rFonts w:eastAsiaTheme="majorEastAsia" w:cstheme="majorBidi" w:hint="default"/>
+        <w:color w:val="0F4761" w:themeColor="accent1" w:themeShade="BF"/>
+        <w:sz w:val="28"/>
+      </w:rPr>
+    </w:lvl>
+    <w:lvl w:ilvl="2">
+      <w:start w:val="1"/>
+      <w:numFmt w:val="decimal"/>
+      <w:isLgl/>
+      <w:lvlText w:val="%1.%2.%3."/>
+      <w:lvlJc w:val="left"/>
+      <w:pPr>
+        <w:ind w:left="720" w:hanging="720"/>
+      </w:pPr>
+      <w:rPr>
+        <w:rFonts w:eastAsiaTheme="majorEastAsia" w:cstheme="majorBidi" w:hint="default"/>
+        <w:color w:val="0F4761" w:themeColor="accent1" w:themeShade="BF"/>
+        <w:sz w:val="28"/>
+      </w:rPr>
+    </w:lvl>
+    <w:lvl w:ilvl="3">
+      <w:start w:val="1"/>
+      <w:numFmt w:val="decimal"/>
+      <w:isLgl/>
+      <w:lvlText w:val="%1.%2.%3.%4."/>
+      <w:lvlJc w:val="left"/>
+      <w:pPr>
+        <w:ind w:left="1080" w:hanging="1080"/>
+      </w:pPr>
+      <w:rPr>
+        <w:rFonts w:eastAsiaTheme="majorEastAsia" w:cstheme="majorBidi" w:hint="default"/>
+        <w:color w:val="0F4761" w:themeColor="accent1" w:themeShade="BF"/>
+        <w:sz w:val="28"/>
+      </w:rPr>
+    </w:lvl>
+    <w:lvl w:ilvl="4">
+      <w:start w:val="1"/>
+      <w:numFmt w:val="decimal"/>
+      <w:isLgl/>
+      <w:lvlText w:val="%1.%2.%3.%4.%5."/>
+      <w:lvlJc w:val="left"/>
+      <w:pPr>
+        <w:ind w:left="1080" w:hanging="1080"/>
+      </w:pPr>
+      <w:rPr>
+        <w:rFonts w:eastAsiaTheme="majorEastAsia" w:cstheme="majorBidi" w:hint="default"/>
+        <w:color w:val="0F4761" w:themeColor="accent1" w:themeShade="BF"/>
+        <w:sz w:val="28"/>
+      </w:rPr>
+    </w:lvl>
+    <w:lvl w:ilvl="5">
+      <w:start w:val="1"/>
+      <w:numFmt w:val="decimal"/>
+      <w:isLgl/>
+      <w:lvlText w:val="%1.%2.%3.%4.%5.%6."/>
+      <w:lvlJc w:val="left"/>
+      <w:pPr>
+        <w:ind w:left="1440" w:hanging="1440"/>
+      </w:pPr>
+      <w:rPr>
+        <w:rFonts w:eastAsiaTheme="majorEastAsia" w:cstheme="majorBidi" w:hint="default"/>
+        <w:color w:val="0F4761" w:themeColor="accent1" w:themeShade="BF"/>
+        <w:sz w:val="28"/>
+      </w:rPr>
+    </w:lvl>
+    <w:lvl w:ilvl="6">
+      <w:start w:val="1"/>
+      <w:numFmt w:val="decimal"/>
+      <w:isLgl/>
+      <w:lvlText w:val="%1.%2.%3.%4.%5.%6.%7."/>
+      <w:lvlJc w:val="left"/>
+      <w:pPr>
+        <w:ind w:left="1440" w:hanging="1440"/>
+      </w:pPr>
+      <w:rPr>
+        <w:rFonts w:eastAsiaTheme="majorEastAsia" w:cstheme="majorBidi" w:hint="default"/>
+        <w:color w:val="0F4761" w:themeColor="accent1" w:themeShade="BF"/>
+        <w:sz w:val="28"/>
+      </w:rPr>
+    </w:lvl>
+    <w:lvl w:ilvl="7">
+      <w:start w:val="1"/>
+      <w:numFmt w:val="decimal"/>
+      <w:isLgl/>
+      <w:lvlText w:val="%1.%2.%3.%4.%5.%6.%7.%8."/>
+      <w:lvlJc w:val="left"/>
+      <w:pPr>
+        <w:ind w:left="1800" w:hanging="1800"/>
+      </w:pPr>
+      <w:rPr>
+        <w:rFonts w:eastAsiaTheme="majorEastAsia" w:cstheme="majorBidi" w:hint="default"/>
+        <w:color w:val="0F4761" w:themeColor="accent1" w:themeShade="BF"/>
+        <w:sz w:val="28"/>
+      </w:rPr>
+    </w:lvl>
+    <w:lvl w:ilvl="8">
+      <w:start w:val="1"/>
+      <w:numFmt w:val="decimal"/>
+      <w:isLgl/>
+      <w:lvlText w:val="%1.%2.%3.%4.%5.%6.%7.%8.%9."/>
+      <w:lvlJc w:val="left"/>
+      <w:pPr>
+        <w:ind w:left="1800" w:hanging="1800"/>
+      </w:pPr>
+      <w:rPr>
+        <w:rFonts w:eastAsiaTheme="majorEastAsia" w:cstheme="majorBidi" w:hint="default"/>
+        <w:color w:val="0F4761" w:themeColor="accent1" w:themeShade="BF"/>
+        <w:sz w:val="28"/>
+      </w:rPr>
+    </w:lvl>
+  </w:abstractNum>
+  <w:abstractNum w:abstractNumId="4" w15:restartNumberingAfterBreak="0">
+    <w:nsid w:val="2F296FFF"/>
+    <w:multiLevelType w:val="multilevel"/>
+    <w:tmpl w:val="A6B85CD2"/>
+    <w:lvl w:ilvl="0">
+      <w:start w:val="1"/>
+      <w:numFmt w:val="decimal"/>
+      <w:lvlText w:val="%1."/>
+      <w:lvlJc w:val="left"/>
+      <w:pPr>
+        <w:tabs>
+          <w:tab w:val="num" w:pos="720"/>
+        </w:tabs>
+        <w:ind w:left="720" w:hanging="360"/>
+      </w:pPr>
+    </w:lvl>
+    <w:lvl w:ilvl="1" w:tentative="1">
+      <w:start w:val="1"/>
+      <w:numFmt w:val="decimal"/>
+      <w:lvlText w:val="%2."/>
+      <w:lvlJc w:val="left"/>
+      <w:pPr>
+        <w:tabs>
+          <w:tab w:val="num" w:pos="1440"/>
+        </w:tabs>
+        <w:ind w:left="1440" w:hanging="360"/>
+      </w:pPr>
+    </w:lvl>
+    <w:lvl w:ilvl="2" w:tentative="1">
+      <w:start w:val="1"/>
+      <w:numFmt w:val="decimal"/>
+      <w:lvlText w:val="%3."/>
+      <w:lvlJc w:val="left"/>
+      <w:pPr>
+        <w:tabs>
+          <w:tab w:val="num" w:pos="2160"/>
+        </w:tabs>
+        <w:ind w:left="2160" w:hanging="360"/>
+      </w:pPr>
+    </w:lvl>
+    <w:lvl w:ilvl="3" w:tentative="1">
+      <w:start w:val="1"/>
+      <w:numFmt w:val="decimal"/>
+      <w:lvlText w:val="%4."/>
+      <w:lvlJc w:val="left"/>
+      <w:pPr>
+        <w:tabs>
+          <w:tab w:val="num" w:pos="2880"/>
+        </w:tabs>
+        <w:ind w:left="2880" w:hanging="360"/>
+      </w:pPr>
+    </w:lvl>
+    <w:lvl w:ilvl="4" w:tentative="1">
+      <w:start w:val="1"/>
+      <w:numFmt w:val="decimal"/>
+      <w:lvlText w:val="%5."/>
+      <w:lvlJc w:val="left"/>
+      <w:pPr>
+        <w:tabs>
+          <w:tab w:val="num" w:pos="3600"/>
+        </w:tabs>
+        <w:ind w:left="3600" w:hanging="360"/>
+      </w:pPr>
+    </w:lvl>
+    <w:lvl w:ilvl="5" w:tentative="1">
+      <w:start w:val="1"/>
+      <w:numFmt w:val="decimal"/>
+      <w:lvlText w:val="%6."/>
+      <w:lvlJc w:val="left"/>
+      <w:pPr>
+        <w:tabs>
+          <w:tab w:val="num" w:pos="4320"/>
+        </w:tabs>
+        <w:ind w:left="4320" w:hanging="360"/>
+      </w:pPr>
+    </w:lvl>
+    <w:lvl w:ilvl="6" w:tentative="1">
+      <w:start w:val="1"/>
+      <w:numFmt w:val="decimal"/>
+      <w:lvlText w:val="%7."/>
+      <w:lvlJc w:val="left"/>
+      <w:pPr>
+        <w:tabs>
+          <w:tab w:val="num" w:pos="5040"/>
+        </w:tabs>
+        <w:ind w:left="5040" w:hanging="360"/>
+      </w:pPr>
+    </w:lvl>
+    <w:lvl w:ilvl="7" w:tentative="1">
+      <w:start w:val="1"/>
+      <w:numFmt w:val="decimal"/>
+      <w:lvlText w:val="%8."/>
+      <w:lvlJc w:val="left"/>
+      <w:pPr>
+        <w:tabs>
+          <w:tab w:val="num" w:pos="5760"/>
+        </w:tabs>
+        <w:ind w:left="5760" w:hanging="360"/>
+      </w:pPr>
+    </w:lvl>
+    <w:lvl w:ilvl="8" w:tentative="1">
+      <w:start w:val="1"/>
+      <w:numFmt w:val="decimal"/>
+      <w:lvlText w:val="%9."/>
+      <w:lvlJc w:val="left"/>
+      <w:pPr>
+        <w:tabs>
+          <w:tab w:val="num" w:pos="6480"/>
+        </w:tabs>
+        <w:ind w:left="6480" w:hanging="360"/>
+      </w:pPr>
+    </w:lvl>
+  </w:abstractNum>
+  <w:abstractNum w:abstractNumId="5" w15:restartNumberingAfterBreak="0">
+    <w:nsid w:val="34671D46"/>
+    <w:multiLevelType w:val="multilevel"/>
+    <w:tmpl w:val="6DC46018"/>
+    <w:lvl w:ilvl="0">
+      <w:start w:val="1"/>
+      <w:numFmt w:val="bullet"/>
+      <w:lvlText w:val=""/>
+      <w:lvlJc w:val="left"/>
+      <w:pPr>
+        <w:tabs>
+          <w:tab w:val="num" w:pos="720"/>
+        </w:tabs>
+        <w:ind w:left="720" w:hanging="360"/>
+      </w:pPr>
+      <w:rPr>
+        <w:rFonts w:ascii="Symbol" w:hAnsi="Symbol" w:hint="default"/>
+        <w:sz w:val="20"/>
+      </w:rPr>
+    </w:lvl>
+    <w:lvl w:ilvl="1" w:tentative="1">
+      <w:start w:val="1"/>
+      <w:numFmt w:val="bullet"/>
+      <w:lvlText w:val="o"/>
+      <w:lvlJc w:val="left"/>
+      <w:pPr>
+        <w:tabs>
+          <w:tab w:val="num" w:pos="1440"/>
+        </w:tabs>
+        <w:ind w:left="1440" w:hanging="360"/>
+      </w:pPr>
+      <w:rPr>
+        <w:rFonts w:ascii="Courier New" w:hAnsi="Courier New" w:hint="default"/>
+        <w:sz w:val="20"/>
+      </w:rPr>
+    </w:lvl>
+    <w:lvl w:ilvl="2" w:tentative="1">
+      <w:start w:val="1"/>
+      <w:numFmt w:val="bullet"/>
+      <w:lvlText w:val=""/>
+      <w:lvlJc w:val="left"/>
+      <w:pPr>
+        <w:tabs>
+          <w:tab w:val="num" w:pos="2160"/>
+        </w:tabs>
+        <w:ind w:left="2160" w:hanging="360"/>
+      </w:pPr>
+      <w:rPr>
+        <w:rFonts w:ascii="Wingdings" w:hAnsi="Wingdings" w:hint="default"/>
+        <w:sz w:val="20"/>
+      </w:rPr>
+    </w:lvl>
+    <w:lvl w:ilvl="3" w:tentative="1">
+      <w:start w:val="1"/>
+      <w:numFmt w:val="bullet"/>
+      <w:lvlText w:val=""/>
+      <w:lvlJc w:val="left"/>
+      <w:pPr>
+        <w:tabs>
+          <w:tab w:val="num" w:pos="2880"/>
+        </w:tabs>
+        <w:ind w:left="2880" w:hanging="360"/>
+      </w:pPr>
+      <w:rPr>
+        <w:rFonts w:ascii="Wingdings" w:hAnsi="Wingdings" w:hint="default"/>
+        <w:sz w:val="20"/>
+      </w:rPr>
+    </w:lvl>
+    <w:lvl w:ilvl="4" w:tentative="1">
+      <w:start w:val="1"/>
+      <w:numFmt w:val="bullet"/>
+      <w:lvlText w:val=""/>
+      <w:lvlJc w:val="left"/>
+      <w:pPr>
+        <w:tabs>
+          <w:tab w:val="num" w:pos="3600"/>
+        </w:tabs>
+        <w:ind w:left="3600" w:hanging="360"/>
+      </w:pPr>
+      <w:rPr>
+        <w:rFonts w:ascii="Wingdings" w:hAnsi="Wingdings" w:hint="default"/>
+        <w:sz w:val="20"/>
+      </w:rPr>
+    </w:lvl>
+    <w:lvl w:ilvl="5" w:tentative="1">
+      <w:start w:val="1"/>
+      <w:numFmt w:val="bullet"/>
+      <w:lvlText w:val=""/>
+      <w:lvlJc w:val="left"/>
+      <w:pPr>
+        <w:tabs>
+          <w:tab w:val="num" w:pos="4320"/>
+        </w:tabs>
+        <w:ind w:left="4320" w:hanging="360"/>
+      </w:pPr>
+      <w:rPr>
+        <w:rFonts w:ascii="Wingdings" w:hAnsi="Wingdings" w:hint="default"/>
+        <w:sz w:val="20"/>
+      </w:rPr>
+    </w:lvl>
+    <w:lvl w:ilvl="6" w:tentative="1">
+      <w:start w:val="1"/>
+      <w:numFmt w:val="bullet"/>
+      <w:lvlText w:val=""/>
+      <w:lvlJc w:val="left"/>
+      <w:pPr>
+        <w:tabs>
+          <w:tab w:val="num" w:pos="5040"/>
+        </w:tabs>
+        <w:ind w:left="5040" w:hanging="360"/>
+      </w:pPr>
+      <w:rPr>
+        <w:rFonts w:ascii="Wingdings" w:hAnsi="Wingdings" w:hint="default"/>
+        <w:sz w:val="20"/>
+      </w:rPr>
+    </w:lvl>
+    <w:lvl w:ilvl="7" w:tentative="1">
+      <w:start w:val="1"/>
+      <w:numFmt w:val="bullet"/>
+      <w:lvlText w:val=""/>
+      <w:lvlJc w:val="left"/>
+      <w:pPr>
+        <w:tabs>
+          <w:tab w:val="num" w:pos="5760"/>
+        </w:tabs>
+        <w:ind w:left="5760" w:hanging="360"/>
+      </w:pPr>
+      <w:rPr>
+        <w:rFonts w:ascii="Wingdings" w:hAnsi="Wingdings" w:hint="default"/>
+        <w:sz w:val="20"/>
+      </w:rPr>
+    </w:lvl>
+    <w:lvl w:ilvl="8" w:tentative="1">
+      <w:start w:val="1"/>
+      <w:numFmt w:val="bullet"/>
+      <w:lvlText w:val=""/>
+      <w:lvlJc w:val="left"/>
+      <w:pPr>
+        <w:tabs>
+          <w:tab w:val="num" w:pos="6480"/>
+        </w:tabs>
+        <w:ind w:left="6480" w:hanging="360"/>
+      </w:pPr>
+      <w:rPr>
+        <w:rFonts w:ascii="Wingdings" w:hAnsi="Wingdings" w:hint="default"/>
+        <w:sz w:val="20"/>
+      </w:rPr>
+    </w:lvl>
+  </w:abstractNum>
+  <w:abstractNum w:abstractNumId="6" w15:restartNumberingAfterBreak="0">
+    <w:nsid w:val="3A593743"/>
+    <w:multiLevelType w:val="hybridMultilevel"/>
+    <w:tmpl w:val="94867160"/>
+    <w:lvl w:ilvl="0" w:tplc="04090001">
+      <w:start w:val="1"/>
+      <w:numFmt w:val="bullet"/>
+      <w:lvlText w:val=""/>
+      <w:lvlJc w:val="left"/>
+      <w:pPr>
+        <w:ind w:left="720" w:hanging="360"/>
+      </w:pPr>
+      <w:rPr>
+        <w:rFonts w:ascii="Symbol" w:hAnsi="Symbol" w:hint="default"/>
+      </w:rPr>
+    </w:lvl>
+    <w:lvl w:ilvl="1" w:tplc="04090003" w:tentative="1">
+      <w:start w:val="1"/>
+      <w:numFmt w:val="bullet"/>
+      <w:lvlText w:val="o"/>
+      <w:lvlJc w:val="left"/>
+      <w:pPr>
+        <w:ind w:left="1440" w:hanging="360"/>
+      </w:pPr>
+      <w:rPr>
+        <w:rFonts w:ascii="Courier New" w:hAnsi="Courier New" w:cs="Courier New" w:hint="default"/>
+      </w:rPr>
+    </w:lvl>
+    <w:lvl w:ilvl="2" w:tplc="04090005" w:tentative="1">
+      <w:start w:val="1"/>
+      <w:numFmt w:val="bullet"/>
+      <w:lvlText w:val=""/>
+      <w:lvlJc w:val="left"/>
+      <w:pPr>
+        <w:ind w:left="2160" w:hanging="360"/>
+      </w:pPr>
+      <w:rPr>
+        <w:rFonts w:ascii="Wingdings" w:hAnsi="Wingdings" w:hint="default"/>
+      </w:rPr>
+    </w:lvl>
+    <w:lvl w:ilvl="3" w:tplc="04090001" w:tentative="1">
+      <w:start w:val="1"/>
+      <w:numFmt w:val="bullet"/>
+      <w:lvlText w:val=""/>
+      <w:lvlJc w:val="left"/>
+      <w:pPr>
+        <w:ind w:left="2880" w:hanging="360"/>
+      </w:pPr>
+      <w:rPr>
+        <w:rFonts w:ascii="Symbol" w:hAnsi="Symbol" w:hint="default"/>
+      </w:rPr>
+    </w:lvl>
+    <w:lvl w:ilvl="4" w:tplc="04090003" w:tentative="1">
+      <w:start w:val="1"/>
+      <w:numFmt w:val="bullet"/>
+      <w:lvlText w:val="o"/>
+      <w:lvlJc w:val="left"/>
+      <w:pPr>
+        <w:ind w:left="3600" w:hanging="360"/>
+      </w:pPr>
+      <w:rPr>
+        <w:rFonts w:ascii="Courier New" w:hAnsi="Courier New" w:cs="Courier New" w:hint="default"/>
+      </w:rPr>
+    </w:lvl>
+    <w:lvl w:ilvl="5" w:tplc="04090005" w:tentative="1">
+      <w:start w:val="1"/>
+      <w:numFmt w:val="bullet"/>
+      <w:lvlText w:val=""/>
+      <w:lvlJc w:val="left"/>
+      <w:pPr>
+        <w:ind w:left="4320" w:hanging="360"/>
+      </w:pPr>
+      <w:rPr>
+        <w:rFonts w:ascii="Wingdings" w:hAnsi="Wingdings" w:hint="default"/>
+      </w:rPr>
+    </w:lvl>
+    <w:lvl w:ilvl="6" w:tplc="04090001" w:tentative="1">
+      <w:start w:val="1"/>
+      <w:numFmt w:val="bullet"/>
+      <w:lvlText w:val=""/>
+      <w:lvlJc w:val="left"/>
+      <w:pPr>
+        <w:ind w:left="5040" w:hanging="360"/>
+      </w:pPr>
+      <w:rPr>
+        <w:rFonts w:ascii="Symbol" w:hAnsi="Symbol" w:hint="default"/>
+      </w:rPr>
+    </w:lvl>
+    <w:lvl w:ilvl="7" w:tplc="04090003" w:tentative="1">
+      <w:start w:val="1"/>
+      <w:numFmt w:val="bullet"/>
+      <w:lvlText w:val="o"/>
+      <w:lvlJc w:val="left"/>
+      <w:pPr>
+        <w:ind w:left="5760" w:hanging="360"/>
+      </w:pPr>
+      <w:rPr>
+        <w:rFonts w:ascii="Courier New" w:hAnsi="Courier New" w:cs="Courier New" w:hint="default"/>
+      </w:rPr>
+    </w:lvl>
+    <w:lvl w:ilvl="8" w:tplc="04090005" w:tentative="1">
+      <w:start w:val="1"/>
+      <w:numFmt w:val="bullet"/>
+      <w:lvlText w:val=""/>
+      <w:lvlJc w:val="left"/>
+      <w:pPr>
+        <w:ind w:left="6480" w:hanging="360"/>
+      </w:pPr>
+      <w:rPr>
+        <w:rFonts w:ascii="Wingdings" w:hAnsi="Wingdings" w:hint="default"/>
+      </w:rPr>
+    </w:lvl>
+  </w:abstractNum>
+  <w:abstractNum w:abstractNumId="7" w15:restartNumberingAfterBreak="0">
+    <w:nsid w:val="3C66665F"/>
+    <w:multiLevelType w:val="multilevel"/>
+    <w:tmpl w:val="520E569A"/>
+    <w:lvl w:ilvl="0">
+      <w:start w:val="1"/>
+      <w:numFmt w:val="bullet"/>
+      <w:lvlText w:val=""/>
+      <w:lvlJc w:val="left"/>
+      <w:pPr>
+        <w:tabs>
+          <w:tab w:val="num" w:pos="720"/>
+        </w:tabs>
+        <w:ind w:left="720" w:hanging="360"/>
+      </w:pPr>
+      <w:rPr>
+        <w:rFonts w:ascii="Symbol" w:hAnsi="Symbol" w:hint="default"/>
+        <w:sz w:val="20"/>
+      </w:rPr>
+    </w:lvl>
+    <w:lvl w:ilvl="1" w:tentative="1">
+      <w:start w:val="1"/>
+      <w:numFmt w:val="bullet"/>
+      <w:lvlText w:val="o"/>
+      <w:lvlJc w:val="left"/>
+      <w:pPr>
+        <w:tabs>
+          <w:tab w:val="num" w:pos="1440"/>
+        </w:tabs>
+        <w:ind w:left="1440" w:hanging="360"/>
+      </w:pPr>
+      <w:rPr>
+        <w:rFonts w:ascii="Courier New" w:hAnsi="Courier New" w:hint="default"/>
+        <w:sz w:val="20"/>
+      </w:rPr>
+    </w:lvl>
+    <w:lvl w:ilvl="2" w:tentative="1">
+      <w:start w:val="1"/>
+      <w:numFmt w:val="bullet"/>
+      <w:lvlText w:val=""/>
+      <w:lvlJc w:val="left"/>
+      <w:pPr>
+        <w:tabs>
+          <w:tab w:val="num" w:pos="2160"/>
+        </w:tabs>
+        <w:ind w:left="2160" w:hanging="360"/>
+      </w:pPr>
+      <w:rPr>
+        <w:rFonts w:ascii="Wingdings" w:hAnsi="Wingdings" w:hint="default"/>
+        <w:sz w:val="20"/>
+      </w:rPr>
+    </w:lvl>
+    <w:lvl w:ilvl="3" w:tentative="1">
+      <w:start w:val="1"/>
+      <w:numFmt w:val="bullet"/>
+      <w:lvlText w:val=""/>
+      <w:lvlJc w:val="left"/>
+      <w:pPr>
+        <w:tabs>
+          <w:tab w:val="num" w:pos="2880"/>
+        </w:tabs>
+        <w:ind w:left="2880" w:hanging="360"/>
+      </w:pPr>
+      <w:rPr>
+        <w:rFonts w:ascii="Wingdings" w:hAnsi="Wingdings" w:hint="default"/>
+        <w:sz w:val="20"/>
+      </w:rPr>
+    </w:lvl>
+    <w:lvl w:ilvl="4" w:tentative="1">
+      <w:start w:val="1"/>
+      <w:numFmt w:val="bullet"/>
+      <w:lvlText w:val=""/>
+      <w:lvlJc w:val="left"/>
+      <w:pPr>
+        <w:tabs>
+          <w:tab w:val="num" w:pos="3600"/>
+        </w:tabs>
+        <w:ind w:left="3600" w:hanging="360"/>
+      </w:pPr>
+      <w:rPr>
+        <w:rFonts w:ascii="Wingdings" w:hAnsi="Wingdings" w:hint="default"/>
+        <w:sz w:val="20"/>
+      </w:rPr>
+    </w:lvl>
+    <w:lvl w:ilvl="5" w:tentative="1">
+      <w:start w:val="1"/>
+      <w:numFmt w:val="bullet"/>
+      <w:lvlText w:val=""/>
+      <w:lvlJc w:val="left"/>
+      <w:pPr>
+        <w:tabs>
+          <w:tab w:val="num" w:pos="4320"/>
+        </w:tabs>
+        <w:ind w:left="4320" w:hanging="360"/>
+      </w:pPr>
+      <w:rPr>
+        <w:rFonts w:ascii="Wingdings" w:hAnsi="Wingdings" w:hint="default"/>
+        <w:sz w:val="20"/>
+      </w:rPr>
+    </w:lvl>
+    <w:lvl w:ilvl="6" w:tentative="1">
+      <w:start w:val="1"/>
+      <w:numFmt w:val="bullet"/>
+      <w:lvlText w:val=""/>
+      <w:lvlJc w:val="left"/>
+      <w:pPr>
+        <w:tabs>
+          <w:tab w:val="num" w:pos="5040"/>
+        </w:tabs>
+        <w:ind w:left="5040" w:hanging="360"/>
+      </w:pPr>
+      <w:rPr>
+        <w:rFonts w:ascii="Wingdings" w:hAnsi="Wingdings" w:hint="default"/>
+        <w:sz w:val="20"/>
+      </w:rPr>
+    </w:lvl>
+    <w:lvl w:ilvl="7" w:tentative="1">
+      <w:start w:val="1"/>
+      <w:numFmt w:val="bullet"/>
+      <w:lvlText w:val=""/>
+      <w:lvlJc w:val="left"/>
+      <w:pPr>
+        <w:tabs>
+          <w:tab w:val="num" w:pos="5760"/>
+        </w:tabs>
+        <w:ind w:left="5760" w:hanging="360"/>
+      </w:pPr>
+      <w:rPr>
+        <w:rFonts w:ascii="Wingdings" w:hAnsi="Wingdings" w:hint="default"/>
+        <w:sz w:val="20"/>
+      </w:rPr>
+    </w:lvl>
+    <w:lvl w:ilvl="8" w:tentative="1">
+      <w:start w:val="1"/>
+      <w:numFmt w:val="bullet"/>
+      <w:lvlText w:val=""/>
+      <w:lvlJc w:val="left"/>
+      <w:pPr>
+        <w:tabs>
+          <w:tab w:val="num" w:pos="6480"/>
+        </w:tabs>
+        <w:ind w:left="6480" w:hanging="360"/>
+      </w:pPr>
+      <w:rPr>
+        <w:rFonts w:ascii="Wingdings" w:hAnsi="Wingdings" w:hint="default"/>
+        <w:sz w:val="20"/>
+      </w:rPr>
+    </w:lvl>
+  </w:abstractNum>
+  <w:abstractNum w:abstractNumId="8" w15:restartNumberingAfterBreak="0">
+    <w:nsid w:val="46BF3F49"/>
+    <w:multiLevelType w:val="multilevel"/>
+    <w:tmpl w:val="98209440"/>
+    <w:lvl w:ilvl="0">
+      <w:start w:val="1"/>
+      <w:numFmt w:val="bullet"/>
+      <w:lvlText w:val=""/>
+      <w:lvlJc w:val="left"/>
+      <w:pPr>
+        <w:ind w:left="720" w:hanging="360"/>
+      </w:pPr>
+      <w:rPr>
+        <w:rFonts w:ascii="Symbol" w:hAnsi="Symbol" w:hint="default"/>
+        <w:sz w:val="20"/>
+      </w:rPr>
+    </w:lvl>
+    <w:lvl w:ilvl="1" w:tentative="1">
+      <w:start w:val="1"/>
+      <w:numFmt w:val="bullet"/>
+      <w:lvlText w:val="o"/>
+      <w:lvlJc w:val="left"/>
+      <w:pPr>
+        <w:tabs>
+          <w:tab w:val="num" w:pos="1440"/>
+        </w:tabs>
+        <w:ind w:left="1440" w:hanging="360"/>
+      </w:pPr>
+      <w:rPr>
+        <w:rFonts w:ascii="Courier New" w:hAnsi="Courier New" w:hint="default"/>
+        <w:sz w:val="20"/>
+      </w:rPr>
+    </w:lvl>
+    <w:lvl w:ilvl="2" w:tentative="1">
+      <w:start w:val="1"/>
+      <w:numFmt w:val="bullet"/>
+      <w:lvlText w:val=""/>
+      <w:lvlJc w:val="left"/>
+      <w:pPr>
+        <w:tabs>
+          <w:tab w:val="num" w:pos="2160"/>
+        </w:tabs>
+        <w:ind w:left="2160" w:hanging="360"/>
+      </w:pPr>
+      <w:rPr>
+        <w:rFonts w:ascii="Wingdings" w:hAnsi="Wingdings" w:hint="default"/>
+        <w:sz w:val="20"/>
+      </w:rPr>
+    </w:lvl>
+    <w:lvl w:ilvl="3" w:tentative="1">
+      <w:start w:val="1"/>
+      <w:numFmt w:val="bullet"/>
+      <w:lvlText w:val=""/>
+      <w:lvlJc w:val="left"/>
+      <w:pPr>
+        <w:tabs>
+          <w:tab w:val="num" w:pos="2880"/>
+        </w:tabs>
+        <w:ind w:left="2880" w:hanging="360"/>
+      </w:pPr>
+      <w:rPr>
+        <w:rFonts w:ascii="Wingdings" w:hAnsi="Wingdings" w:hint="default"/>
+        <w:sz w:val="20"/>
+      </w:rPr>
+    </w:lvl>
+    <w:lvl w:ilvl="4" w:tentative="1">
+      <w:start w:val="1"/>
+      <w:numFmt w:val="bullet"/>
+      <w:lvlText w:val=""/>
+      <w:lvlJc w:val="left"/>
+      <w:pPr>
+        <w:tabs>
+          <w:tab w:val="num" w:pos="3600"/>
+        </w:tabs>
+        <w:ind w:left="3600" w:hanging="360"/>
+      </w:pPr>
+      <w:rPr>
+        <w:rFonts w:ascii="Wingdings" w:hAnsi="Wingdings" w:hint="default"/>
+        <w:sz w:val="20"/>
+      </w:rPr>
+    </w:lvl>
+    <w:lvl w:ilvl="5" w:tentative="1">
+      <w:start w:val="1"/>
+      <w:numFmt w:val="bullet"/>
+      <w:lvlText w:val=""/>
+      <w:lvlJc w:val="left"/>
+      <w:pPr>
+        <w:tabs>
+          <w:tab w:val="num" w:pos="4320"/>
+        </w:tabs>
+        <w:ind w:left="4320" w:hanging="360"/>
+      </w:pPr>
+      <w:rPr>
+        <w:rFonts w:ascii="Wingdings" w:hAnsi="Wingdings" w:hint="default"/>
+        <w:sz w:val="20"/>
+      </w:rPr>
+    </w:lvl>
+    <w:lvl w:ilvl="6" w:tentative="1">
+      <w:start w:val="1"/>
+      <w:numFmt w:val="bullet"/>
+      <w:lvlText w:val=""/>
+      <w:lvlJc w:val="left"/>
+      <w:pPr>
+        <w:tabs>
+          <w:tab w:val="num" w:pos="5040"/>
+        </w:tabs>
+        <w:ind w:left="5040" w:hanging="360"/>
+      </w:pPr>
+      <w:rPr>
+        <w:rFonts w:ascii="Wingdings" w:hAnsi="Wingdings" w:hint="default"/>
+        <w:sz w:val="20"/>
+      </w:rPr>
+    </w:lvl>
+    <w:lvl w:ilvl="7" w:tentative="1">
+      <w:start w:val="1"/>
+      <w:numFmt w:val="bullet"/>
+      <w:lvlText w:val=""/>
+      <w:lvlJc w:val="left"/>
+      <w:pPr>
+        <w:tabs>
+          <w:tab w:val="num" w:pos="5760"/>
+        </w:tabs>
+        <w:ind w:left="5760" w:hanging="360"/>
+      </w:pPr>
+      <w:rPr>
+        <w:rFonts w:ascii="Wingdings" w:hAnsi="Wingdings" w:hint="default"/>
+        <w:sz w:val="20"/>
+      </w:rPr>
+    </w:lvl>
+    <w:lvl w:ilvl="8" w:tentative="1">
+      <w:start w:val="1"/>
+      <w:numFmt w:val="bullet"/>
+      <w:lvlText w:val=""/>
+      <w:lvlJc w:val="left"/>
+      <w:pPr>
+        <w:tabs>
+          <w:tab w:val="num" w:pos="6480"/>
+        </w:tabs>
+        <w:ind w:left="6480" w:hanging="360"/>
+      </w:pPr>
+      <w:rPr>
+        <w:rFonts w:ascii="Wingdings" w:hAnsi="Wingdings" w:hint="default"/>
+        <w:sz w:val="20"/>
+      </w:rPr>
+    </w:lvl>
+  </w:abstractNum>
+  <w:abstractNum w:abstractNumId="9" w15:restartNumberingAfterBreak="0">
+    <w:nsid w:val="5D250D15"/>
+    <w:multiLevelType w:val="multilevel"/>
+    <w:tmpl w:val="3B603456"/>
+    <w:lvl w:ilvl="0">
+      <w:start w:val="1"/>
+      <w:numFmt w:val="decimal"/>
+      <w:lvlText w:val="%1."/>
+      <w:lvlJc w:val="left"/>
+      <w:pPr>
+        <w:tabs>
+          <w:tab w:val="num" w:pos="720"/>
+        </w:tabs>
+        <w:ind w:left="720" w:hanging="360"/>
+      </w:pPr>
+    </w:lvl>
+    <w:lvl w:ilvl="1">
+      <w:start w:val="1"/>
+      <w:numFmt w:val="bullet"/>
+      <w:lvlText w:val="o"/>
+      <w:lvlJc w:val="left"/>
+      <w:pPr>
+        <w:tabs>
+          <w:tab w:val="num" w:pos="1440"/>
+        </w:tabs>
+        <w:ind w:left="1440" w:hanging="360"/>
+      </w:pPr>
+      <w:rPr>
+        <w:rFonts w:ascii="Courier New" w:hAnsi="Courier New" w:hint="default"/>
+        <w:sz w:val="20"/>
+      </w:rPr>
+    </w:lvl>
+    <w:lvl w:ilvl="2" w:tentative="1">
+      <w:start w:val="1"/>
+      <w:numFmt w:val="decimal"/>
+      <w:lvlText w:val="%3."/>
+      <w:lvlJc w:val="left"/>
+      <w:pPr>
+        <w:tabs>
+          <w:tab w:val="num" w:pos="2160"/>
+        </w:tabs>
+        <w:ind w:left="2160" w:hanging="360"/>
+      </w:pPr>
+    </w:lvl>
+    <w:lvl w:ilvl="3" w:tentative="1">
+      <w:start w:val="1"/>
+      <w:numFmt w:val="decimal"/>
+      <w:lvlText w:val="%4."/>
+      <w:lvlJc w:val="left"/>
+      <w:pPr>
+        <w:tabs>
+          <w:tab w:val="num" w:pos="2880"/>
+        </w:tabs>
+        <w:ind w:left="2880" w:hanging="360"/>
+      </w:pPr>
+    </w:lvl>
+    <w:lvl w:ilvl="4" w:tentative="1">
+      <w:start w:val="1"/>
+      <w:numFmt w:val="decimal"/>
+      <w:lvlText w:val="%5."/>
+      <w:lvlJc w:val="left"/>
+      <w:pPr>
+        <w:tabs>
+          <w:tab w:val="num" w:pos="3600"/>
+        </w:tabs>
+        <w:ind w:left="3600" w:hanging="360"/>
+      </w:pPr>
+    </w:lvl>
+    <w:lvl w:ilvl="5" w:tentative="1">
+      <w:start w:val="1"/>
+      <w:numFmt w:val="decimal"/>
+      <w:lvlText w:val="%6."/>
+      <w:lvlJc w:val="left"/>
+      <w:pPr>
+        <w:tabs>
+          <w:tab w:val="num" w:pos="4320"/>
+        </w:tabs>
+        <w:ind w:left="4320" w:hanging="360"/>
+      </w:pPr>
+    </w:lvl>
+    <w:lvl w:ilvl="6" w:tentative="1">
+      <w:start w:val="1"/>
+      <w:numFmt w:val="decimal"/>
+      <w:lvlText w:val="%7."/>
+      <w:lvlJc w:val="left"/>
+      <w:pPr>
+        <w:tabs>
+          <w:tab w:val="num" w:pos="5040"/>
+        </w:tabs>
+        <w:ind w:left="5040" w:hanging="360"/>
+      </w:pPr>
+    </w:lvl>
+    <w:lvl w:ilvl="7" w:tentative="1">
+      <w:start w:val="1"/>
+      <w:numFmt w:val="decimal"/>
+      <w:lvlText w:val="%8."/>
+      <w:lvlJc w:val="left"/>
+      <w:pPr>
+        <w:tabs>
+          <w:tab w:val="num" w:pos="5760"/>
+        </w:tabs>
+        <w:ind w:left="5760" w:hanging="360"/>
+      </w:pPr>
+    </w:lvl>
+    <w:lvl w:ilvl="8" w:tentative="1">
+      <w:start w:val="1"/>
+      <w:numFmt w:val="decimal"/>
+      <w:lvlText w:val="%9."/>
+      <w:lvlJc w:val="left"/>
+      <w:pPr>
+        <w:tabs>
+          <w:tab w:val="num" w:pos="6480"/>
+        </w:tabs>
+        <w:ind w:left="6480" w:hanging="360"/>
+      </w:pPr>
+    </w:lvl>
+  </w:abstractNum>
+  <w:abstractNum w:abstractNumId="10" w15:restartNumberingAfterBreak="0">
+    <w:nsid w:val="5F1D173C"/>
+    <w:multiLevelType w:val="hybridMultilevel"/>
+    <w:tmpl w:val="3474A73E"/>
+    <w:lvl w:ilvl="0" w:tplc="0409000F">
+      <w:start w:val="1"/>
+      <w:numFmt w:val="decimal"/>
+      <w:lvlText w:val="%1."/>
+      <w:lvlJc w:val="left"/>
+      <w:pPr>
+        <w:ind w:left="360" w:hanging="360"/>
       </w:pPr>
       <w:rPr>
         <w:rFonts w:hint="default"/>
@@ -240,8 +3725,745 @@
       </w:pPr>
     </w:lvl>
   </w:abstractNum>
+  <w:abstractNum w:abstractNumId="11" w15:restartNumberingAfterBreak="0">
+    <w:nsid w:val="647231A7"/>
+    <w:multiLevelType w:val="multilevel"/>
+    <w:tmpl w:val="0FBCF56C"/>
+    <w:lvl w:ilvl="0">
+      <w:start w:val="1"/>
+      <w:numFmt w:val="bullet"/>
+      <w:lvlText w:val=""/>
+      <w:lvlJc w:val="left"/>
+      <w:pPr>
+        <w:tabs>
+          <w:tab w:val="num" w:pos="720"/>
+        </w:tabs>
+        <w:ind w:left="720" w:hanging="360"/>
+      </w:pPr>
+      <w:rPr>
+        <w:rFonts w:ascii="Symbol" w:hAnsi="Symbol" w:hint="default"/>
+        <w:sz w:val="20"/>
+      </w:rPr>
+    </w:lvl>
+    <w:lvl w:ilvl="1" w:tentative="1">
+      <w:start w:val="1"/>
+      <w:numFmt w:val="bullet"/>
+      <w:lvlText w:val="o"/>
+      <w:lvlJc w:val="left"/>
+      <w:pPr>
+        <w:tabs>
+          <w:tab w:val="num" w:pos="1440"/>
+        </w:tabs>
+        <w:ind w:left="1440" w:hanging="360"/>
+      </w:pPr>
+      <w:rPr>
+        <w:rFonts w:ascii="Courier New" w:hAnsi="Courier New" w:hint="default"/>
+        <w:sz w:val="20"/>
+      </w:rPr>
+    </w:lvl>
+    <w:lvl w:ilvl="2" w:tentative="1">
+      <w:start w:val="1"/>
+      <w:numFmt w:val="bullet"/>
+      <w:lvlText w:val=""/>
+      <w:lvlJc w:val="left"/>
+      <w:pPr>
+        <w:tabs>
+          <w:tab w:val="num" w:pos="2160"/>
+        </w:tabs>
+        <w:ind w:left="2160" w:hanging="360"/>
+      </w:pPr>
+      <w:rPr>
+        <w:rFonts w:ascii="Wingdings" w:hAnsi="Wingdings" w:hint="default"/>
+        <w:sz w:val="20"/>
+      </w:rPr>
+    </w:lvl>
+    <w:lvl w:ilvl="3" w:tentative="1">
+      <w:start w:val="1"/>
+      <w:numFmt w:val="bullet"/>
+      <w:lvlText w:val=""/>
+      <w:lvlJc w:val="left"/>
+      <w:pPr>
+        <w:tabs>
+          <w:tab w:val="num" w:pos="2880"/>
+        </w:tabs>
+        <w:ind w:left="2880" w:hanging="360"/>
+      </w:pPr>
+      <w:rPr>
+        <w:rFonts w:ascii="Wingdings" w:hAnsi="Wingdings" w:hint="default"/>
+        <w:sz w:val="20"/>
+      </w:rPr>
+    </w:lvl>
+    <w:lvl w:ilvl="4" w:tentative="1">
+      <w:start w:val="1"/>
+      <w:numFmt w:val="bullet"/>
+      <w:lvlText w:val=""/>
+      <w:lvlJc w:val="left"/>
+      <w:pPr>
+        <w:tabs>
+          <w:tab w:val="num" w:pos="3600"/>
+        </w:tabs>
+        <w:ind w:left="3600" w:hanging="360"/>
+      </w:pPr>
+      <w:rPr>
+        <w:rFonts w:ascii="Wingdings" w:hAnsi="Wingdings" w:hint="default"/>
+        <w:sz w:val="20"/>
+      </w:rPr>
+    </w:lvl>
+    <w:lvl w:ilvl="5" w:tentative="1">
+      <w:start w:val="1"/>
+      <w:numFmt w:val="bullet"/>
+      <w:lvlText w:val=""/>
+      <w:lvlJc w:val="left"/>
+      <w:pPr>
+        <w:tabs>
+          <w:tab w:val="num" w:pos="4320"/>
+        </w:tabs>
+        <w:ind w:left="4320" w:hanging="360"/>
+      </w:pPr>
+      <w:rPr>
+        <w:rFonts w:ascii="Wingdings" w:hAnsi="Wingdings" w:hint="default"/>
+        <w:sz w:val="20"/>
+      </w:rPr>
+    </w:lvl>
+    <w:lvl w:ilvl="6" w:tentative="1">
+      <w:start w:val="1"/>
+      <w:numFmt w:val="bullet"/>
+      <w:lvlText w:val=""/>
+      <w:lvlJc w:val="left"/>
+      <w:pPr>
+        <w:tabs>
+          <w:tab w:val="num" w:pos="5040"/>
+        </w:tabs>
+        <w:ind w:left="5040" w:hanging="360"/>
+      </w:pPr>
+      <w:rPr>
+        <w:rFonts w:ascii="Wingdings" w:hAnsi="Wingdings" w:hint="default"/>
+        <w:sz w:val="20"/>
+      </w:rPr>
+    </w:lvl>
+    <w:lvl w:ilvl="7" w:tentative="1">
+      <w:start w:val="1"/>
+      <w:numFmt w:val="bullet"/>
+      <w:lvlText w:val=""/>
+      <w:lvlJc w:val="left"/>
+      <w:pPr>
+        <w:tabs>
+          <w:tab w:val="num" w:pos="5760"/>
+        </w:tabs>
+        <w:ind w:left="5760" w:hanging="360"/>
+      </w:pPr>
+      <w:rPr>
+        <w:rFonts w:ascii="Wingdings" w:hAnsi="Wingdings" w:hint="default"/>
+        <w:sz w:val="20"/>
+      </w:rPr>
+    </w:lvl>
+    <w:lvl w:ilvl="8" w:tentative="1">
+      <w:start w:val="1"/>
+      <w:numFmt w:val="bullet"/>
+      <w:lvlText w:val=""/>
+      <w:lvlJc w:val="left"/>
+      <w:pPr>
+        <w:tabs>
+          <w:tab w:val="num" w:pos="6480"/>
+        </w:tabs>
+        <w:ind w:left="6480" w:hanging="360"/>
+      </w:pPr>
+      <w:rPr>
+        <w:rFonts w:ascii="Wingdings" w:hAnsi="Wingdings" w:hint="default"/>
+        <w:sz w:val="20"/>
+      </w:rPr>
+    </w:lvl>
+  </w:abstractNum>
+  <w:abstractNum w:abstractNumId="12" w15:restartNumberingAfterBreak="0">
+    <w:nsid w:val="6C247A5B"/>
+    <w:multiLevelType w:val="multilevel"/>
+    <w:tmpl w:val="8A30DFC0"/>
+    <w:lvl w:ilvl="0">
+      <w:start w:val="1"/>
+      <w:numFmt w:val="bullet"/>
+      <w:lvlText w:val=""/>
+      <w:lvlJc w:val="left"/>
+      <w:pPr>
+        <w:tabs>
+          <w:tab w:val="num" w:pos="720"/>
+        </w:tabs>
+        <w:ind w:left="720" w:hanging="360"/>
+      </w:pPr>
+      <w:rPr>
+        <w:rFonts w:ascii="Symbol" w:hAnsi="Symbol" w:hint="default"/>
+        <w:sz w:val="20"/>
+      </w:rPr>
+    </w:lvl>
+    <w:lvl w:ilvl="1" w:tentative="1">
+      <w:start w:val="1"/>
+      <w:numFmt w:val="bullet"/>
+      <w:lvlText w:val="o"/>
+      <w:lvlJc w:val="left"/>
+      <w:pPr>
+        <w:tabs>
+          <w:tab w:val="num" w:pos="1440"/>
+        </w:tabs>
+        <w:ind w:left="1440" w:hanging="360"/>
+      </w:pPr>
+      <w:rPr>
+        <w:rFonts w:ascii="Courier New" w:hAnsi="Courier New" w:hint="default"/>
+        <w:sz w:val="20"/>
+      </w:rPr>
+    </w:lvl>
+    <w:lvl w:ilvl="2" w:tentative="1">
+      <w:start w:val="1"/>
+      <w:numFmt w:val="bullet"/>
+      <w:lvlText w:val=""/>
+      <w:lvlJc w:val="left"/>
+      <w:pPr>
+        <w:tabs>
+          <w:tab w:val="num" w:pos="2160"/>
+        </w:tabs>
+        <w:ind w:left="2160" w:hanging="360"/>
+      </w:pPr>
+      <w:rPr>
+        <w:rFonts w:ascii="Wingdings" w:hAnsi="Wingdings" w:hint="default"/>
+        <w:sz w:val="20"/>
+      </w:rPr>
+    </w:lvl>
+    <w:lvl w:ilvl="3" w:tentative="1">
+      <w:start w:val="1"/>
+      <w:numFmt w:val="bullet"/>
+      <w:lvlText w:val=""/>
+      <w:lvlJc w:val="left"/>
+      <w:pPr>
+        <w:tabs>
+          <w:tab w:val="num" w:pos="2880"/>
+        </w:tabs>
+        <w:ind w:left="2880" w:hanging="360"/>
+      </w:pPr>
+      <w:rPr>
+        <w:rFonts w:ascii="Wingdings" w:hAnsi="Wingdings" w:hint="default"/>
+        <w:sz w:val="20"/>
+      </w:rPr>
+    </w:lvl>
+    <w:lvl w:ilvl="4" w:tentative="1">
+      <w:start w:val="1"/>
+      <w:numFmt w:val="bullet"/>
+      <w:lvlText w:val=""/>
+      <w:lvlJc w:val="left"/>
+      <w:pPr>
+        <w:tabs>
+          <w:tab w:val="num" w:pos="3600"/>
+        </w:tabs>
+        <w:ind w:left="3600" w:hanging="360"/>
+      </w:pPr>
+      <w:rPr>
+        <w:rFonts w:ascii="Wingdings" w:hAnsi="Wingdings" w:hint="default"/>
+        <w:sz w:val="20"/>
+      </w:rPr>
+    </w:lvl>
+    <w:lvl w:ilvl="5" w:tentative="1">
+      <w:start w:val="1"/>
+      <w:numFmt w:val="bullet"/>
+      <w:lvlText w:val=""/>
+      <w:lvlJc w:val="left"/>
+      <w:pPr>
+        <w:tabs>
+          <w:tab w:val="num" w:pos="4320"/>
+        </w:tabs>
+        <w:ind w:left="4320" w:hanging="360"/>
+      </w:pPr>
+      <w:rPr>
+        <w:rFonts w:ascii="Wingdings" w:hAnsi="Wingdings" w:hint="default"/>
+        <w:sz w:val="20"/>
+      </w:rPr>
+    </w:lvl>
+    <w:lvl w:ilvl="6" w:tentative="1">
+      <w:start w:val="1"/>
+      <w:numFmt w:val="bullet"/>
+      <w:lvlText w:val=""/>
+      <w:lvlJc w:val="left"/>
+      <w:pPr>
+        <w:tabs>
+          <w:tab w:val="num" w:pos="5040"/>
+        </w:tabs>
+        <w:ind w:left="5040" w:hanging="360"/>
+      </w:pPr>
+      <w:rPr>
+        <w:rFonts w:ascii="Wingdings" w:hAnsi="Wingdings" w:hint="default"/>
+        <w:sz w:val="20"/>
+      </w:rPr>
+    </w:lvl>
+    <w:lvl w:ilvl="7" w:tentative="1">
+      <w:start w:val="1"/>
+      <w:numFmt w:val="bullet"/>
+      <w:lvlText w:val=""/>
+      <w:lvlJc w:val="left"/>
+      <w:pPr>
+        <w:tabs>
+          <w:tab w:val="num" w:pos="5760"/>
+        </w:tabs>
+        <w:ind w:left="5760" w:hanging="360"/>
+      </w:pPr>
+      <w:rPr>
+        <w:rFonts w:ascii="Wingdings" w:hAnsi="Wingdings" w:hint="default"/>
+        <w:sz w:val="20"/>
+      </w:rPr>
+    </w:lvl>
+    <w:lvl w:ilvl="8" w:tentative="1">
+      <w:start w:val="1"/>
+      <w:numFmt w:val="bullet"/>
+      <w:lvlText w:val=""/>
+      <w:lvlJc w:val="left"/>
+      <w:pPr>
+        <w:tabs>
+          <w:tab w:val="num" w:pos="6480"/>
+        </w:tabs>
+        <w:ind w:left="6480" w:hanging="360"/>
+      </w:pPr>
+      <w:rPr>
+        <w:rFonts w:ascii="Wingdings" w:hAnsi="Wingdings" w:hint="default"/>
+        <w:sz w:val="20"/>
+      </w:rPr>
+    </w:lvl>
+  </w:abstractNum>
+  <w:abstractNum w:abstractNumId="13" w15:restartNumberingAfterBreak="0">
+    <w:nsid w:val="6E061A34"/>
+    <w:multiLevelType w:val="multilevel"/>
+    <w:tmpl w:val="C9BCE976"/>
+    <w:lvl w:ilvl="0">
+      <w:start w:val="1"/>
+      <w:numFmt w:val="bullet"/>
+      <w:lvlText w:val=""/>
+      <w:lvlJc w:val="left"/>
+      <w:pPr>
+        <w:tabs>
+          <w:tab w:val="num" w:pos="720"/>
+        </w:tabs>
+        <w:ind w:left="720" w:hanging="360"/>
+      </w:pPr>
+      <w:rPr>
+        <w:rFonts w:ascii="Symbol" w:hAnsi="Symbol" w:hint="default"/>
+        <w:sz w:val="20"/>
+      </w:rPr>
+    </w:lvl>
+    <w:lvl w:ilvl="1" w:tentative="1">
+      <w:start w:val="1"/>
+      <w:numFmt w:val="bullet"/>
+      <w:lvlText w:val="o"/>
+      <w:lvlJc w:val="left"/>
+      <w:pPr>
+        <w:tabs>
+          <w:tab w:val="num" w:pos="1440"/>
+        </w:tabs>
+        <w:ind w:left="1440" w:hanging="360"/>
+      </w:pPr>
+      <w:rPr>
+        <w:rFonts w:ascii="Courier New" w:hAnsi="Courier New" w:hint="default"/>
+        <w:sz w:val="20"/>
+      </w:rPr>
+    </w:lvl>
+    <w:lvl w:ilvl="2" w:tentative="1">
+      <w:start w:val="1"/>
+      <w:numFmt w:val="bullet"/>
+      <w:lvlText w:val=""/>
+      <w:lvlJc w:val="left"/>
+      <w:pPr>
+        <w:tabs>
+          <w:tab w:val="num" w:pos="2160"/>
+        </w:tabs>
+        <w:ind w:left="2160" w:hanging="360"/>
+      </w:pPr>
+      <w:rPr>
+        <w:rFonts w:ascii="Wingdings" w:hAnsi="Wingdings" w:hint="default"/>
+        <w:sz w:val="20"/>
+      </w:rPr>
+    </w:lvl>
+    <w:lvl w:ilvl="3" w:tentative="1">
+      <w:start w:val="1"/>
+      <w:numFmt w:val="bullet"/>
+      <w:lvlText w:val=""/>
+      <w:lvlJc w:val="left"/>
+      <w:pPr>
+        <w:tabs>
+          <w:tab w:val="num" w:pos="2880"/>
+        </w:tabs>
+        <w:ind w:left="2880" w:hanging="360"/>
+      </w:pPr>
+      <w:rPr>
+        <w:rFonts w:ascii="Wingdings" w:hAnsi="Wingdings" w:hint="default"/>
+        <w:sz w:val="20"/>
+      </w:rPr>
+    </w:lvl>
+    <w:lvl w:ilvl="4" w:tentative="1">
+      <w:start w:val="1"/>
+      <w:numFmt w:val="bullet"/>
+      <w:lvlText w:val=""/>
+      <w:lvlJc w:val="left"/>
+      <w:pPr>
+        <w:tabs>
+          <w:tab w:val="num" w:pos="3600"/>
+        </w:tabs>
+        <w:ind w:left="3600" w:hanging="360"/>
+      </w:pPr>
+      <w:rPr>
+        <w:rFonts w:ascii="Wingdings" w:hAnsi="Wingdings" w:hint="default"/>
+        <w:sz w:val="20"/>
+      </w:rPr>
+    </w:lvl>
+    <w:lvl w:ilvl="5" w:tentative="1">
+      <w:start w:val="1"/>
+      <w:numFmt w:val="bullet"/>
+      <w:lvlText w:val=""/>
+      <w:lvlJc w:val="left"/>
+      <w:pPr>
+        <w:tabs>
+          <w:tab w:val="num" w:pos="4320"/>
+        </w:tabs>
+        <w:ind w:left="4320" w:hanging="360"/>
+      </w:pPr>
+      <w:rPr>
+        <w:rFonts w:ascii="Wingdings" w:hAnsi="Wingdings" w:hint="default"/>
+        <w:sz w:val="20"/>
+      </w:rPr>
+    </w:lvl>
+    <w:lvl w:ilvl="6" w:tentative="1">
+      <w:start w:val="1"/>
+      <w:numFmt w:val="bullet"/>
+      <w:lvlText w:val=""/>
+      <w:lvlJc w:val="left"/>
+      <w:pPr>
+        <w:tabs>
+          <w:tab w:val="num" w:pos="5040"/>
+        </w:tabs>
+        <w:ind w:left="5040" w:hanging="360"/>
+      </w:pPr>
+      <w:rPr>
+        <w:rFonts w:ascii="Wingdings" w:hAnsi="Wingdings" w:hint="default"/>
+        <w:sz w:val="20"/>
+      </w:rPr>
+    </w:lvl>
+    <w:lvl w:ilvl="7" w:tentative="1">
+      <w:start w:val="1"/>
+      <w:numFmt w:val="bullet"/>
+      <w:lvlText w:val=""/>
+      <w:lvlJc w:val="left"/>
+      <w:pPr>
+        <w:tabs>
+          <w:tab w:val="num" w:pos="5760"/>
+        </w:tabs>
+        <w:ind w:left="5760" w:hanging="360"/>
+      </w:pPr>
+      <w:rPr>
+        <w:rFonts w:ascii="Wingdings" w:hAnsi="Wingdings" w:hint="default"/>
+        <w:sz w:val="20"/>
+      </w:rPr>
+    </w:lvl>
+    <w:lvl w:ilvl="8" w:tentative="1">
+      <w:start w:val="1"/>
+      <w:numFmt w:val="bullet"/>
+      <w:lvlText w:val=""/>
+      <w:lvlJc w:val="left"/>
+      <w:pPr>
+        <w:tabs>
+          <w:tab w:val="num" w:pos="6480"/>
+        </w:tabs>
+        <w:ind w:left="6480" w:hanging="360"/>
+      </w:pPr>
+      <w:rPr>
+        <w:rFonts w:ascii="Wingdings" w:hAnsi="Wingdings" w:hint="default"/>
+        <w:sz w:val="20"/>
+      </w:rPr>
+    </w:lvl>
+  </w:abstractNum>
+  <w:abstractNum w:abstractNumId="14" w15:restartNumberingAfterBreak="0">
+    <w:nsid w:val="74925221"/>
+    <w:multiLevelType w:val="multilevel"/>
+    <w:tmpl w:val="0B66B136"/>
+    <w:lvl w:ilvl="0">
+      <w:start w:val="1"/>
+      <w:numFmt w:val="decimal"/>
+      <w:lvlText w:val="%1."/>
+      <w:lvlJc w:val="left"/>
+      <w:pPr>
+        <w:tabs>
+          <w:tab w:val="num" w:pos="720"/>
+        </w:tabs>
+        <w:ind w:left="720" w:hanging="360"/>
+      </w:pPr>
+      <w:rPr>
+        <w:rFonts w:asciiTheme="minorHAnsi" w:eastAsia="Times New Roman" w:hAnsiTheme="minorHAnsi" w:cs="Times New Roman"/>
+      </w:rPr>
+    </w:lvl>
+    <w:lvl w:ilvl="1" w:tentative="1">
+      <w:start w:val="1"/>
+      <w:numFmt w:val="decimal"/>
+      <w:lvlText w:val="%2."/>
+      <w:lvlJc w:val="left"/>
+      <w:pPr>
+        <w:tabs>
+          <w:tab w:val="num" w:pos="1440"/>
+        </w:tabs>
+        <w:ind w:left="1440" w:hanging="360"/>
+      </w:pPr>
+    </w:lvl>
+    <w:lvl w:ilvl="2" w:tentative="1">
+      <w:start w:val="1"/>
+      <w:numFmt w:val="decimal"/>
+      <w:lvlText w:val="%3."/>
+      <w:lvlJc w:val="left"/>
+      <w:pPr>
+        <w:tabs>
+          <w:tab w:val="num" w:pos="2160"/>
+        </w:tabs>
+        <w:ind w:left="2160" w:hanging="360"/>
+      </w:pPr>
+    </w:lvl>
+    <w:lvl w:ilvl="3" w:tentative="1">
+      <w:start w:val="1"/>
+      <w:numFmt w:val="decimal"/>
+      <w:lvlText w:val="%4."/>
+      <w:lvlJc w:val="left"/>
+      <w:pPr>
+        <w:tabs>
+          <w:tab w:val="num" w:pos="2880"/>
+        </w:tabs>
+        <w:ind w:left="2880" w:hanging="360"/>
+      </w:pPr>
+    </w:lvl>
+    <w:lvl w:ilvl="4" w:tentative="1">
+      <w:start w:val="1"/>
+      <w:numFmt w:val="decimal"/>
+      <w:lvlText w:val="%5."/>
+      <w:lvlJc w:val="left"/>
+      <w:pPr>
+        <w:tabs>
+          <w:tab w:val="num" w:pos="3600"/>
+        </w:tabs>
+        <w:ind w:left="3600" w:hanging="360"/>
+      </w:pPr>
+    </w:lvl>
+    <w:lvl w:ilvl="5" w:tentative="1">
+      <w:start w:val="1"/>
+      <w:numFmt w:val="decimal"/>
+      <w:lvlText w:val="%6."/>
+      <w:lvlJc w:val="left"/>
+      <w:pPr>
+        <w:tabs>
+          <w:tab w:val="num" w:pos="4320"/>
+        </w:tabs>
+        <w:ind w:left="4320" w:hanging="360"/>
+      </w:pPr>
+    </w:lvl>
+    <w:lvl w:ilvl="6" w:tentative="1">
+      <w:start w:val="1"/>
+      <w:numFmt w:val="decimal"/>
+      <w:lvlText w:val="%7."/>
+      <w:lvlJc w:val="left"/>
+      <w:pPr>
+        <w:tabs>
+          <w:tab w:val="num" w:pos="5040"/>
+        </w:tabs>
+        <w:ind w:left="5040" w:hanging="360"/>
+      </w:pPr>
+    </w:lvl>
+    <w:lvl w:ilvl="7" w:tentative="1">
+      <w:start w:val="1"/>
+      <w:numFmt w:val="decimal"/>
+      <w:lvlText w:val="%8."/>
+      <w:lvlJc w:val="left"/>
+      <w:pPr>
+        <w:tabs>
+          <w:tab w:val="num" w:pos="5760"/>
+        </w:tabs>
+        <w:ind w:left="5760" w:hanging="360"/>
+      </w:pPr>
+    </w:lvl>
+    <w:lvl w:ilvl="8" w:tentative="1">
+      <w:start w:val="1"/>
+      <w:numFmt w:val="decimal"/>
+      <w:lvlText w:val="%9."/>
+      <w:lvlJc w:val="left"/>
+      <w:pPr>
+        <w:tabs>
+          <w:tab w:val="num" w:pos="6480"/>
+        </w:tabs>
+        <w:ind w:left="6480" w:hanging="360"/>
+      </w:pPr>
+    </w:lvl>
+  </w:abstractNum>
+  <w:abstractNum w:abstractNumId="15" w15:restartNumberingAfterBreak="0">
+    <w:nsid w:val="771A5FD7"/>
+    <w:multiLevelType w:val="hybridMultilevel"/>
+    <w:tmpl w:val="E996D414"/>
+    <w:lvl w:ilvl="0" w:tplc="0409000F">
+      <w:start w:val="1"/>
+      <w:numFmt w:val="decimal"/>
+      <w:lvlText w:val="%1."/>
+      <w:lvlJc w:val="left"/>
+      <w:pPr>
+        <w:ind w:left="720" w:hanging="360"/>
+      </w:pPr>
+      <w:rPr>
+        <w:rFonts w:hint="default"/>
+      </w:rPr>
+    </w:lvl>
+    <w:lvl w:ilvl="1" w:tplc="04090019" w:tentative="1">
+      <w:start w:val="1"/>
+      <w:numFmt w:val="lowerLetter"/>
+      <w:lvlText w:val="%2."/>
+      <w:lvlJc w:val="left"/>
+      <w:pPr>
+        <w:ind w:left="1440" w:hanging="360"/>
+      </w:pPr>
+    </w:lvl>
+    <w:lvl w:ilvl="2" w:tplc="0409001B" w:tentative="1">
+      <w:start w:val="1"/>
+      <w:numFmt w:val="lowerRoman"/>
+      <w:lvlText w:val="%3."/>
+      <w:lvlJc w:val="right"/>
+      <w:pPr>
+        <w:ind w:left="2160" w:hanging="180"/>
+      </w:pPr>
+    </w:lvl>
+    <w:lvl w:ilvl="3" w:tplc="0409000F" w:tentative="1">
+      <w:start w:val="1"/>
+      <w:numFmt w:val="decimal"/>
+      <w:lvlText w:val="%4."/>
+      <w:lvlJc w:val="left"/>
+      <w:pPr>
+        <w:ind w:left="2880" w:hanging="360"/>
+      </w:pPr>
+    </w:lvl>
+    <w:lvl w:ilvl="4" w:tplc="04090019" w:tentative="1">
+      <w:start w:val="1"/>
+      <w:numFmt w:val="lowerLetter"/>
+      <w:lvlText w:val="%5."/>
+      <w:lvlJc w:val="left"/>
+      <w:pPr>
+        <w:ind w:left="3600" w:hanging="360"/>
+      </w:pPr>
+    </w:lvl>
+    <w:lvl w:ilvl="5" w:tplc="0409001B" w:tentative="1">
+      <w:start w:val="1"/>
+      <w:numFmt w:val="lowerRoman"/>
+      <w:lvlText w:val="%6."/>
+      <w:lvlJc w:val="right"/>
+      <w:pPr>
+        <w:ind w:left="4320" w:hanging="180"/>
+      </w:pPr>
+    </w:lvl>
+    <w:lvl w:ilvl="6" w:tplc="0409000F" w:tentative="1">
+      <w:start w:val="1"/>
+      <w:numFmt w:val="decimal"/>
+      <w:lvlText w:val="%7."/>
+      <w:lvlJc w:val="left"/>
+      <w:pPr>
+        <w:ind w:left="5040" w:hanging="360"/>
+      </w:pPr>
+    </w:lvl>
+    <w:lvl w:ilvl="7" w:tplc="04090019" w:tentative="1">
+      <w:start w:val="1"/>
+      <w:numFmt w:val="lowerLetter"/>
+      <w:lvlText w:val="%8."/>
+      <w:lvlJc w:val="left"/>
+      <w:pPr>
+        <w:ind w:left="5760" w:hanging="360"/>
+      </w:pPr>
+    </w:lvl>
+    <w:lvl w:ilvl="8" w:tplc="0409001B" w:tentative="1">
+      <w:start w:val="1"/>
+      <w:numFmt w:val="lowerRoman"/>
+      <w:lvlText w:val="%9."/>
+      <w:lvlJc w:val="right"/>
+      <w:pPr>
+        <w:ind w:left="6480" w:hanging="180"/>
+      </w:pPr>
+    </w:lvl>
+  </w:abstractNum>
   <w:num w:numId="1" w16cid:durableId="1525708574">
+    <w:abstractNumId w:val="3"/>
+  </w:num>
+  <w:num w:numId="2" w16cid:durableId="657346226">
     <w:abstractNumId w:val="0"/>
+  </w:num>
+  <w:num w:numId="3" w16cid:durableId="1958441245">
+    <w:abstractNumId w:val="5"/>
+  </w:num>
+  <w:num w:numId="4" w16cid:durableId="1193811638">
+    <w:abstractNumId w:val="15"/>
+  </w:num>
+  <w:num w:numId="5" w16cid:durableId="1490900217">
+    <w:abstractNumId w:val="10"/>
+  </w:num>
+  <w:num w:numId="6" w16cid:durableId="631012462">
+    <w:abstractNumId w:val="9"/>
+  </w:num>
+  <w:num w:numId="7" w16cid:durableId="108552247">
+    <w:abstractNumId w:val="9"/>
+    <w:lvlOverride w:ilvl="1">
+      <w:lvl w:ilvl="1">
+        <w:numFmt w:val="bullet"/>
+        <w:lvlText w:val=""/>
+        <w:lvlJc w:val="left"/>
+        <w:pPr>
+          <w:tabs>
+            <w:tab w:val="num" w:pos="1440"/>
+          </w:tabs>
+          <w:ind w:left="1440" w:hanging="360"/>
+        </w:pPr>
+        <w:rPr>
+          <w:rFonts w:ascii="Symbol" w:hAnsi="Symbol" w:hint="default"/>
+          <w:sz w:val="20"/>
+        </w:rPr>
+      </w:lvl>
+    </w:lvlOverride>
+  </w:num>
+  <w:num w:numId="8" w16cid:durableId="1587349411">
+    <w:abstractNumId w:val="9"/>
+    <w:lvlOverride w:ilvl="1">
+      <w:lvl w:ilvl="1">
+        <w:numFmt w:val="bullet"/>
+        <w:lvlText w:val=""/>
+        <w:lvlJc w:val="left"/>
+        <w:pPr>
+          <w:tabs>
+            <w:tab w:val="num" w:pos="1440"/>
+          </w:tabs>
+          <w:ind w:left="1440" w:hanging="360"/>
+        </w:pPr>
+        <w:rPr>
+          <w:rFonts w:ascii="Symbol" w:hAnsi="Symbol" w:hint="default"/>
+          <w:sz w:val="20"/>
+        </w:rPr>
+      </w:lvl>
+    </w:lvlOverride>
+  </w:num>
+  <w:num w:numId="9" w16cid:durableId="607004662">
+    <w:abstractNumId w:val="4"/>
+  </w:num>
+  <w:num w:numId="10" w16cid:durableId="987396586">
+    <w:abstractNumId w:val="14"/>
+  </w:num>
+  <w:num w:numId="11" w16cid:durableId="1334188021">
+    <w:abstractNumId w:val="6"/>
+  </w:num>
+  <w:num w:numId="12" w16cid:durableId="183787868">
+    <w:abstractNumId w:val="1"/>
+  </w:num>
+  <w:num w:numId="13" w16cid:durableId="2022930733">
+    <w:abstractNumId w:val="11"/>
+  </w:num>
+  <w:num w:numId="14" w16cid:durableId="591358420">
+    <w:abstractNumId w:val="2"/>
+  </w:num>
+  <w:num w:numId="15" w16cid:durableId="565651853">
+    <w:abstractNumId w:val="8"/>
+  </w:num>
+  <w:num w:numId="16" w16cid:durableId="1746878343">
+    <w:abstractNumId w:val="7"/>
+  </w:num>
+  <w:num w:numId="17" w16cid:durableId="1131482859">
+    <w:abstractNumId w:val="12"/>
+  </w:num>
+  <w:num w:numId="18" w16cid:durableId="2038000584">
+    <w:abstractNumId w:val="13"/>
   </w:num>
 </w:numbering>
 </file>
@@ -674,7 +4896,6 @@
     <w:next w:val="Normal"/>
     <w:link w:val="Heading2Char"/>
     <w:uiPriority w:val="9"/>
-    <w:semiHidden/>
     <w:unhideWhenUsed/>
     <w:qFormat/>
     <w:rsid w:val="00A07AD6"/>
@@ -697,7 +4918,6 @@
     <w:next w:val="Normal"/>
     <w:link w:val="Heading3Char"/>
     <w:uiPriority w:val="9"/>
-    <w:semiHidden/>
     <w:unhideWhenUsed/>
     <w:qFormat/>
     <w:rsid w:val="00A07AD6"/>
@@ -891,7 +5111,6 @@
     <w:basedOn w:val="DefaultParagraphFont"/>
     <w:link w:val="Heading2"/>
     <w:uiPriority w:val="9"/>
-    <w:semiHidden/>
     <w:rsid w:val="00A07AD6"/>
     <w:rPr>
       <w:rFonts w:asciiTheme="majorHAnsi" w:eastAsiaTheme="majorEastAsia" w:hAnsiTheme="majorHAnsi" w:cstheme="majorBidi"/>
@@ -905,7 +5124,6 @@
     <w:basedOn w:val="DefaultParagraphFont"/>
     <w:link w:val="Heading3"/>
     <w:uiPriority w:val="9"/>
-    <w:semiHidden/>
     <w:rsid w:val="00A07AD6"/>
     <w:rPr>
       <w:rFonts w:eastAsiaTheme="majorEastAsia" w:cstheme="majorBidi"/>
@@ -1162,6 +5380,93 @@
       <w:color w:val="0F4761" w:themeColor="accent1" w:themeShade="BF"/>
       <w:spacing w:val="5"/>
     </w:rPr>
+  </w:style>
+  <w:style w:type="character" w:styleId="Hyperlink">
+    <w:name w:val="Hyperlink"/>
+    <w:basedOn w:val="DefaultParagraphFont"/>
+    <w:uiPriority w:val="99"/>
+    <w:unhideWhenUsed/>
+    <w:rsid w:val="00FC73EE"/>
+    <w:rPr>
+      <w:color w:val="467886" w:themeColor="hyperlink"/>
+      <w:u w:val="single"/>
+    </w:rPr>
+  </w:style>
+  <w:style w:type="character" w:styleId="UnresolvedMention">
+    <w:name w:val="Unresolved Mention"/>
+    <w:basedOn w:val="DefaultParagraphFont"/>
+    <w:uiPriority w:val="99"/>
+    <w:semiHidden/>
+    <w:unhideWhenUsed/>
+    <w:rsid w:val="00FC73EE"/>
+    <w:rPr>
+      <w:color w:val="605E5C"/>
+      <w:shd w:val="clear" w:color="auto" w:fill="E1DFDD"/>
+    </w:rPr>
+  </w:style>
+  <w:style w:type="paragraph" w:styleId="NormalWeb">
+    <w:name w:val="Normal (Web)"/>
+    <w:basedOn w:val="Normal"/>
+    <w:uiPriority w:val="99"/>
+    <w:unhideWhenUsed/>
+    <w:rsid w:val="00157984"/>
+    <w:pPr>
+      <w:spacing w:before="100" w:beforeAutospacing="1" w:after="100" w:afterAutospacing="1" w:line="240" w:lineRule="auto"/>
+    </w:pPr>
+    <w:rPr>
+      <w:rFonts w:ascii="Times New Roman" w:eastAsia="Times New Roman" w:hAnsi="Times New Roman" w:cs="Times New Roman"/>
+      <w:kern w:val="0"/>
+      <w14:ligatures w14:val="none"/>
+    </w:rPr>
+  </w:style>
+  <w:style w:type="paragraph" w:styleId="Footer">
+    <w:name w:val="footer"/>
+    <w:basedOn w:val="Normal"/>
+    <w:link w:val="FooterChar"/>
+    <w:uiPriority w:val="99"/>
+    <w:unhideWhenUsed/>
+    <w:rsid w:val="00F7120E"/>
+    <w:pPr>
+      <w:tabs>
+        <w:tab w:val="center" w:pos="4680"/>
+        <w:tab w:val="right" w:pos="9360"/>
+      </w:tabs>
+      <w:spacing w:after="0" w:line="240" w:lineRule="auto"/>
+    </w:pPr>
+  </w:style>
+  <w:style w:type="character" w:customStyle="1" w:styleId="FooterChar">
+    <w:name w:val="Footer Char"/>
+    <w:basedOn w:val="DefaultParagraphFont"/>
+    <w:link w:val="Footer"/>
+    <w:uiPriority w:val="99"/>
+    <w:rsid w:val="00F7120E"/>
+  </w:style>
+  <w:style w:type="character" w:styleId="PageNumber">
+    <w:name w:val="page number"/>
+    <w:basedOn w:val="DefaultParagraphFont"/>
+    <w:uiPriority w:val="99"/>
+    <w:semiHidden/>
+    <w:unhideWhenUsed/>
+    <w:rsid w:val="00F7120E"/>
+  </w:style>
+  <w:style w:type="table" w:styleId="TableGrid">
+    <w:name w:val="Table Grid"/>
+    <w:basedOn w:val="TableNormal"/>
+    <w:uiPriority w:val="39"/>
+    <w:rsid w:val="00863C61"/>
+    <w:pPr>
+      <w:spacing w:after="0" w:line="240" w:lineRule="auto"/>
+    </w:pPr>
+    <w:tblPr>
+      <w:tblBorders>
+        <w:top w:val="single" w:sz="4" w:space="0" w:color="auto"/>
+        <w:left w:val="single" w:sz="4" w:space="0" w:color="auto"/>
+        <w:bottom w:val="single" w:sz="4" w:space="0" w:color="auto"/>
+        <w:right w:val="single" w:sz="4" w:space="0" w:color="auto"/>
+        <w:insideH w:val="single" w:sz="4" w:space="0" w:color="auto"/>
+        <w:insideV w:val="single" w:sz="4" w:space="0" w:color="auto"/>
+      </w:tblBorders>
+    </w:tblPr>
   </w:style>
 </w:styles>
 </file>

</xml_diff>

<commit_message>
Updates on Task 2
</commit_message>
<xml_diff>
--- a/FTEC4003 Project Report.docx
+++ b/FTEC4003 Project Report.docx
@@ -4,21 +4,25 @@
   <w:body>
     <w:p>
       <w:pPr>
+        <w:spacing w:line="276" w:lineRule="auto"/>
         <w:jc w:val="center"/>
       </w:pPr>
     </w:p>
     <w:p>
       <w:pPr>
+        <w:spacing w:line="276" w:lineRule="auto"/>
         <w:jc w:val="center"/>
       </w:pPr>
     </w:p>
     <w:p>
       <w:pPr>
+        <w:spacing w:line="276" w:lineRule="auto"/>
         <w:jc w:val="center"/>
       </w:pPr>
     </w:p>
     <w:p>
       <w:pPr>
+        <w:spacing w:line="276" w:lineRule="auto"/>
         <w:jc w:val="center"/>
       </w:pPr>
       <w:r>
@@ -71,6 +75,7 @@
     </w:p>
     <w:p>
       <w:pPr>
+        <w:spacing w:line="276" w:lineRule="auto"/>
         <w:jc w:val="center"/>
         <w:rPr>
           <w:b/>
@@ -91,6 +96,7 @@
     </w:p>
     <w:p>
       <w:pPr>
+        <w:spacing w:line="276" w:lineRule="auto"/>
         <w:jc w:val="center"/>
         <w:rPr>
           <w:b/>
@@ -114,6 +120,7 @@
     </w:p>
     <w:p>
       <w:pPr>
+        <w:spacing w:line="276" w:lineRule="auto"/>
         <w:jc w:val="center"/>
       </w:pPr>
       <w:r>
@@ -121,6 +128,9 @@
       </w:r>
     </w:p>
     <w:p>
+      <w:pPr>
+        <w:spacing w:line="276" w:lineRule="auto"/>
+      </w:pPr>
       <w:r>
         <w:br w:type="page"/>
       </w:r>
@@ -128,6 +138,7 @@
     <w:p>
       <w:pPr>
         <w:pStyle w:val="Heading1"/>
+        <w:spacing w:line="276" w:lineRule="auto"/>
         <w:rPr>
           <w:b/>
           <w:bCs/>
@@ -144,7 +155,7 @@
     </w:p>
     <w:p>
       <w:pPr>
-        <w:spacing w:before="120" w:after="120" w:line="240" w:lineRule="auto"/>
+        <w:spacing w:before="120" w:after="120" w:line="276" w:lineRule="auto"/>
         <w:rPr>
           <w:rFonts w:eastAsia="Times New Roman" w:cs="Times New Roman"/>
           <w:color w:val="000000"/>
@@ -164,7 +175,7 @@
     </w:p>
     <w:p>
       <w:pPr>
-        <w:spacing w:before="120" w:after="120" w:line="240" w:lineRule="auto"/>
+        <w:spacing w:before="120" w:after="120" w:line="276" w:lineRule="auto"/>
         <w:rPr>
           <w:rFonts w:eastAsia="Times New Roman" w:cs="Times New Roman"/>
           <w:color w:val="000000"/>
@@ -182,9 +193,14 @@
         <w:t>The primary objective is to develop robust machine learning models that can effectively identify fraudulent or anomalous patterns in financial transactions while maintaining interpretability and practical deployment feasibility. This foundational work establishes the basis for more advanced risk modeling techniques</w:t>
       </w:r>
     </w:p>
-    <w:p/>
-    <w:p>
-      <w:pPr>
+    <w:p>
+      <w:pPr>
+        <w:spacing w:line="276" w:lineRule="auto"/>
+      </w:pPr>
+    </w:p>
+    <w:p>
+      <w:pPr>
+        <w:spacing w:line="276" w:lineRule="auto"/>
         <w:rPr>
           <w:rFonts w:asciiTheme="majorHAnsi" w:eastAsiaTheme="majorEastAsia" w:hAnsiTheme="majorHAnsi" w:cstheme="majorBidi"/>
           <w:color w:val="0F4761" w:themeColor="accent1" w:themeShade="BF"/>
@@ -203,6 +219,7 @@
           <w:ilvl w:val="0"/>
           <w:numId w:val="1"/>
         </w:numPr>
+        <w:spacing w:line="276" w:lineRule="auto"/>
         <w:ind w:left="426" w:hanging="437"/>
         <w:rPr>
           <w:b/>
@@ -232,6 +249,7 @@
           <w:ilvl w:val="0"/>
           <w:numId w:val="2"/>
         </w:numPr>
+        <w:spacing w:line="276" w:lineRule="auto"/>
         <w:rPr>
           <w:b/>
           <w:bCs/>
@@ -247,7 +265,7 @@
     </w:p>
     <w:p>
       <w:pPr>
-        <w:spacing w:before="120" w:after="120" w:line="240" w:lineRule="auto"/>
+        <w:spacing w:before="120" w:after="120" w:line="276" w:lineRule="auto"/>
         <w:rPr>
           <w:rFonts w:eastAsia="Times New Roman" w:cs="Times New Roman"/>
           <w:color w:val="000000"/>
@@ -267,7 +285,7 @@
     </w:p>
     <w:p>
       <w:pPr>
-        <w:spacing w:before="120" w:after="120" w:line="240" w:lineRule="auto"/>
+        <w:spacing w:before="120" w:after="120" w:line="276" w:lineRule="auto"/>
         <w:rPr>
           <w:rFonts w:eastAsia="Times New Roman" w:cs="Times New Roman"/>
           <w:color w:val="000000"/>
@@ -302,7 +320,7 @@
           <w:ilvl w:val="0"/>
           <w:numId w:val="3"/>
         </w:numPr>
-        <w:spacing w:after="0" w:line="240" w:lineRule="auto"/>
+        <w:spacing w:after="0" w:line="276" w:lineRule="auto"/>
         <w:textAlignment w:val="baseline"/>
         <w:rPr>
           <w:rFonts w:eastAsia="Times New Roman" w:cs="Times New Roman"/>
@@ -327,7 +345,7 @@
           <w:ilvl w:val="0"/>
           <w:numId w:val="3"/>
         </w:numPr>
-        <w:spacing w:after="0" w:line="240" w:lineRule="auto"/>
+        <w:spacing w:after="0" w:line="276" w:lineRule="auto"/>
         <w:textAlignment w:val="baseline"/>
         <w:rPr>
           <w:rFonts w:eastAsia="Times New Roman" w:cs="Times New Roman"/>
@@ -352,7 +370,7 @@
           <w:ilvl w:val="0"/>
           <w:numId w:val="3"/>
         </w:numPr>
-        <w:spacing w:after="0" w:line="240" w:lineRule="auto"/>
+        <w:spacing w:after="0" w:line="276" w:lineRule="auto"/>
         <w:textAlignment w:val="baseline"/>
         <w:rPr>
           <w:rFonts w:eastAsia="Times New Roman" w:cs="Times New Roman"/>
@@ -377,7 +395,7 @@
           <w:ilvl w:val="0"/>
           <w:numId w:val="3"/>
         </w:numPr>
-        <w:spacing w:after="0" w:line="240" w:lineRule="auto"/>
+        <w:spacing w:after="0" w:line="276" w:lineRule="auto"/>
         <w:textAlignment w:val="baseline"/>
         <w:rPr>
           <w:rFonts w:eastAsia="Times New Roman" w:cs="Times New Roman"/>
@@ -438,7 +456,7 @@
           <w:ilvl w:val="0"/>
           <w:numId w:val="3"/>
         </w:numPr>
-        <w:spacing w:after="0" w:line="240" w:lineRule="auto"/>
+        <w:spacing w:after="0" w:line="276" w:lineRule="auto"/>
         <w:textAlignment w:val="baseline"/>
         <w:rPr>
           <w:rFonts w:eastAsia="Times New Roman" w:cs="Times New Roman"/>
@@ -477,7 +495,7 @@
     </w:p>
     <w:p>
       <w:pPr>
-        <w:spacing w:before="120" w:after="120" w:line="240" w:lineRule="auto"/>
+        <w:spacing w:before="120" w:after="120" w:line="276" w:lineRule="auto"/>
         <w:rPr>
           <w:rFonts w:eastAsia="Times New Roman" w:cs="Times New Roman"/>
           <w:color w:val="000000"/>
@@ -508,7 +526,7 @@
     </w:p>
     <w:p>
       <w:pPr>
-        <w:spacing w:before="120" w:after="120" w:line="240" w:lineRule="auto"/>
+        <w:spacing w:before="120" w:after="120" w:line="276" w:lineRule="auto"/>
         <w:rPr>
           <w:rFonts w:eastAsia="Times New Roman" w:cs="Times New Roman"/>
           <w:color w:val="000000"/>
@@ -524,6 +542,7 @@
           <w:ilvl w:val="0"/>
           <w:numId w:val="2"/>
         </w:numPr>
+        <w:spacing w:line="276" w:lineRule="auto"/>
         <w:rPr>
           <w:b/>
           <w:bCs/>
@@ -544,6 +563,7 @@
           <w:ilvl w:val="1"/>
           <w:numId w:val="2"/>
         </w:numPr>
+        <w:spacing w:line="276" w:lineRule="auto"/>
       </w:pPr>
       <w:r>
         <w:t xml:space="preserve">Data </w:t>
@@ -558,7 +578,7 @@
     <w:p>
       <w:pPr>
         <w:pStyle w:val="NormalWeb"/>
-        <w:spacing w:before="120" w:beforeAutospacing="0" w:after="120" w:afterAutospacing="0"/>
+        <w:spacing w:before="120" w:beforeAutospacing="0" w:after="120" w:afterAutospacing="0" w:line="276" w:lineRule="auto"/>
         <w:rPr>
           <w:rFonts w:asciiTheme="minorHAnsi" w:hAnsiTheme="minorHAnsi"/>
           <w:color w:val="000000"/>
@@ -579,7 +599,7 @@
           <w:ilvl w:val="0"/>
           <w:numId w:val="6"/>
         </w:numPr>
-        <w:spacing w:before="0" w:beforeAutospacing="0" w:after="0" w:afterAutospacing="0"/>
+        <w:spacing w:before="0" w:beforeAutospacing="0" w:after="0" w:afterAutospacing="0" w:line="276" w:lineRule="auto"/>
         <w:textAlignment w:val="baseline"/>
         <w:rPr>
           <w:rFonts w:asciiTheme="minorHAnsi" w:hAnsiTheme="minorHAnsi"/>
@@ -610,7 +630,7 @@
           <w:ilvl w:val="0"/>
           <w:numId w:val="6"/>
         </w:numPr>
-        <w:spacing w:before="0" w:beforeAutospacing="0" w:after="0" w:afterAutospacing="0"/>
+        <w:spacing w:before="0" w:beforeAutospacing="0" w:after="0" w:afterAutospacing="0" w:line="276" w:lineRule="auto"/>
         <w:textAlignment w:val="baseline"/>
         <w:rPr>
           <w:rFonts w:asciiTheme="minorHAnsi" w:hAnsiTheme="minorHAnsi"/>
@@ -641,7 +661,7 @@
           <w:ilvl w:val="1"/>
           <w:numId w:val="7"/>
         </w:numPr>
-        <w:spacing w:before="0" w:beforeAutospacing="0" w:after="0" w:afterAutospacing="0"/>
+        <w:spacing w:before="0" w:beforeAutospacing="0" w:after="0" w:afterAutospacing="0" w:line="276" w:lineRule="auto"/>
         <w:textAlignment w:val="baseline"/>
         <w:rPr>
           <w:rFonts w:asciiTheme="minorHAnsi" w:hAnsiTheme="minorHAnsi"/>
@@ -663,7 +683,7 @@
           <w:ilvl w:val="1"/>
           <w:numId w:val="8"/>
         </w:numPr>
-        <w:spacing w:before="0" w:beforeAutospacing="0" w:after="0" w:afterAutospacing="0"/>
+        <w:spacing w:before="0" w:beforeAutospacing="0" w:after="0" w:afterAutospacing="0" w:line="276" w:lineRule="auto"/>
         <w:textAlignment w:val="baseline"/>
         <w:rPr>
           <w:rFonts w:asciiTheme="minorHAnsi" w:hAnsiTheme="minorHAnsi"/>
@@ -685,7 +705,7 @@
           <w:ilvl w:val="0"/>
           <w:numId w:val="6"/>
         </w:numPr>
-        <w:spacing w:before="0" w:beforeAutospacing="0" w:after="0" w:afterAutospacing="0"/>
+        <w:spacing w:before="0" w:beforeAutospacing="0" w:after="0" w:afterAutospacing="0" w:line="276" w:lineRule="auto"/>
         <w:textAlignment w:val="baseline"/>
         <w:rPr>
           <w:rFonts w:asciiTheme="minorHAnsi" w:hAnsiTheme="minorHAnsi"/>
@@ -709,7 +729,11 @@
         <w:t>: Data validation confirmed zero missing values</w:t>
       </w:r>
     </w:p>
-    <w:p/>
+    <w:p>
+      <w:pPr>
+        <w:spacing w:line="276" w:lineRule="auto"/>
+      </w:pPr>
+    </w:p>
     <w:p>
       <w:pPr>
         <w:pStyle w:val="Heading2"/>
@@ -717,6 +741,7 @@
           <w:ilvl w:val="1"/>
           <w:numId w:val="2"/>
         </w:numPr>
+        <w:spacing w:line="276" w:lineRule="auto"/>
       </w:pPr>
       <w:r>
         <w:t>Train-Validation Split</w:t>
@@ -725,7 +750,7 @@
     <w:p>
       <w:pPr>
         <w:pStyle w:val="NormalWeb"/>
-        <w:spacing w:before="0" w:beforeAutospacing="0" w:after="0" w:afterAutospacing="0"/>
+        <w:spacing w:before="0" w:beforeAutospacing="0" w:after="0" w:afterAutospacing="0" w:line="276" w:lineRule="auto"/>
         <w:textAlignment w:val="baseline"/>
         <w:rPr>
           <w:rFonts w:asciiTheme="minorHAnsi" w:hAnsiTheme="minorHAnsi"/>
@@ -752,7 +777,7 @@
     <w:p>
       <w:pPr>
         <w:pStyle w:val="NormalWeb"/>
-        <w:spacing w:before="0" w:beforeAutospacing="0" w:after="0" w:afterAutospacing="0"/>
+        <w:spacing w:before="0" w:beforeAutospacing="0" w:after="0" w:afterAutospacing="0" w:line="276" w:lineRule="auto"/>
         <w:textAlignment w:val="baseline"/>
         <w:rPr>
           <w:rFonts w:asciiTheme="minorHAnsi" w:hAnsiTheme="minorHAnsi"/>
@@ -779,7 +804,7 @@
     <w:p>
       <w:pPr>
         <w:pStyle w:val="NormalWeb"/>
-        <w:spacing w:before="0" w:beforeAutospacing="0" w:after="0" w:afterAutospacing="0"/>
+        <w:spacing w:before="0" w:beforeAutospacing="0" w:after="0" w:afterAutospacing="0" w:line="276" w:lineRule="auto"/>
         <w:textAlignment w:val="baseline"/>
         <w:rPr>
           <w:rFonts w:asciiTheme="minorHAnsi" w:hAnsiTheme="minorHAnsi"/>
@@ -797,7 +822,7 @@
     <w:p>
       <w:pPr>
         <w:pStyle w:val="NormalWeb"/>
-        <w:spacing w:before="0" w:beforeAutospacing="0" w:after="0" w:afterAutospacing="0"/>
+        <w:spacing w:before="0" w:beforeAutospacing="0" w:after="0" w:afterAutospacing="0" w:line="276" w:lineRule="auto"/>
         <w:textAlignment w:val="baseline"/>
         <w:rPr>
           <w:rFonts w:asciiTheme="minorHAnsi" w:hAnsiTheme="minorHAnsi"/>
@@ -815,7 +840,7 @@
     <w:p>
       <w:pPr>
         <w:pStyle w:val="NormalWeb"/>
-        <w:spacing w:before="0" w:beforeAutospacing="0" w:after="0" w:afterAutospacing="0"/>
+        <w:spacing w:before="0" w:beforeAutospacing="0" w:after="0" w:afterAutospacing="0" w:line="276" w:lineRule="auto"/>
         <w:textAlignment w:val="baseline"/>
         <w:rPr>
           <w:rFonts w:asciiTheme="minorHAnsi" w:hAnsiTheme="minorHAnsi"/>
@@ -830,15 +855,17 @@
           <w:ilvl w:val="1"/>
           <w:numId w:val="2"/>
         </w:numPr>
-      </w:pPr>
-      <w:r>
+        <w:spacing w:line="276" w:lineRule="auto"/>
+      </w:pPr>
+      <w:r>
+        <w:lastRenderedPageBreak/>
         <w:t>Initial Model Evaluation</w:t>
       </w:r>
     </w:p>
     <w:p>
       <w:pPr>
         <w:pStyle w:val="NormalWeb"/>
-        <w:spacing w:before="120" w:beforeAutospacing="0" w:after="120" w:afterAutospacing="0"/>
+        <w:spacing w:before="120" w:beforeAutospacing="0" w:after="120" w:afterAutospacing="0" w:line="276" w:lineRule="auto"/>
         <w:rPr>
           <w:rFonts w:asciiTheme="minorHAnsi" w:hAnsiTheme="minorHAnsi"/>
           <w:color w:val="000000"/>
@@ -855,18 +882,17 @@
     <w:p>
       <w:pPr>
         <w:pStyle w:val="NormalWeb"/>
-        <w:spacing w:before="120" w:beforeAutospacing="0" w:after="120" w:afterAutospacing="0"/>
-        <w:rPr>
-          <w:rFonts w:asciiTheme="minorHAnsi" w:hAnsiTheme="minorHAnsi"/>
-          <w:color w:val="000000"/>
-        </w:rPr>
-      </w:pPr>
-      <w:r>
-        <w:rPr>
-          <w:rFonts w:asciiTheme="minorHAnsi" w:hAnsiTheme="minorHAnsi"/>
-          <w:color w:val="000000"/>
-        </w:rPr>
-        <w:lastRenderedPageBreak/>
+        <w:spacing w:before="120" w:beforeAutospacing="0" w:after="120" w:afterAutospacing="0" w:line="276" w:lineRule="auto"/>
+        <w:rPr>
+          <w:rFonts w:asciiTheme="minorHAnsi" w:hAnsiTheme="minorHAnsi"/>
+          <w:color w:val="000000"/>
+        </w:rPr>
+      </w:pPr>
+      <w:r>
+        <w:rPr>
+          <w:rFonts w:asciiTheme="minorHAnsi" w:hAnsiTheme="minorHAnsi"/>
+          <w:color w:val="000000"/>
+        </w:rPr>
         <w:t>Initial Ranking (F1 Score for Anomalous Class):</w:t>
       </w:r>
     </w:p>
@@ -877,7 +903,7 @@
           <w:ilvl w:val="0"/>
           <w:numId w:val="11"/>
         </w:numPr>
-        <w:spacing w:before="120" w:beforeAutospacing="0" w:after="120" w:afterAutospacing="0"/>
+        <w:spacing w:before="120" w:beforeAutospacing="0" w:after="120" w:afterAutospacing="0" w:line="276" w:lineRule="auto"/>
         <w:rPr>
           <w:rFonts w:asciiTheme="minorHAnsi" w:hAnsiTheme="minorHAnsi"/>
           <w:color w:val="000000"/>
@@ -907,7 +933,7 @@
           <w:ilvl w:val="0"/>
           <w:numId w:val="11"/>
         </w:numPr>
-        <w:spacing w:before="120" w:beforeAutospacing="0" w:after="120" w:afterAutospacing="0"/>
+        <w:spacing w:before="120" w:beforeAutospacing="0" w:after="120" w:afterAutospacing="0" w:line="276" w:lineRule="auto"/>
         <w:rPr>
           <w:rFonts w:asciiTheme="minorHAnsi" w:hAnsiTheme="minorHAnsi"/>
           <w:color w:val="000000"/>
@@ -937,7 +963,7 @@
           <w:ilvl w:val="0"/>
           <w:numId w:val="11"/>
         </w:numPr>
-        <w:spacing w:before="120" w:beforeAutospacing="0" w:after="120" w:afterAutospacing="0"/>
+        <w:spacing w:before="120" w:beforeAutospacing="0" w:after="120" w:afterAutospacing="0" w:line="276" w:lineRule="auto"/>
         <w:rPr>
           <w:rFonts w:asciiTheme="minorHAnsi" w:hAnsiTheme="minorHAnsi"/>
           <w:color w:val="000000"/>
@@ -967,7 +993,7 @@
           <w:ilvl w:val="0"/>
           <w:numId w:val="11"/>
         </w:numPr>
-        <w:spacing w:before="120" w:beforeAutospacing="0" w:after="120" w:afterAutospacing="0"/>
+        <w:spacing w:before="120" w:beforeAutospacing="0" w:after="120" w:afterAutospacing="0" w:line="276" w:lineRule="auto"/>
         <w:rPr>
           <w:rFonts w:asciiTheme="minorHAnsi" w:hAnsiTheme="minorHAnsi"/>
           <w:color w:val="000000"/>
@@ -997,7 +1023,7 @@
           <w:ilvl w:val="0"/>
           <w:numId w:val="11"/>
         </w:numPr>
-        <w:spacing w:before="120" w:beforeAutospacing="0" w:after="120" w:afterAutospacing="0"/>
+        <w:spacing w:before="120" w:beforeAutospacing="0" w:after="120" w:afterAutospacing="0" w:line="276" w:lineRule="auto"/>
         <w:rPr>
           <w:rFonts w:asciiTheme="minorHAnsi" w:hAnsiTheme="minorHAnsi"/>
           <w:color w:val="000000"/>
@@ -1027,7 +1053,7 @@
           <w:ilvl w:val="0"/>
           <w:numId w:val="11"/>
         </w:numPr>
-        <w:spacing w:before="120" w:beforeAutospacing="0" w:after="120" w:afterAutospacing="0"/>
+        <w:spacing w:before="120" w:beforeAutospacing="0" w:after="120" w:afterAutospacing="0" w:line="276" w:lineRule="auto"/>
         <w:rPr>
           <w:rFonts w:asciiTheme="minorHAnsi" w:hAnsiTheme="minorHAnsi"/>
           <w:color w:val="000000"/>
@@ -1057,7 +1083,7 @@
           <w:ilvl w:val="0"/>
           <w:numId w:val="11"/>
         </w:numPr>
-        <w:spacing w:before="120" w:beforeAutospacing="0" w:after="120" w:afterAutospacing="0"/>
+        <w:spacing w:before="120" w:beforeAutospacing="0" w:after="120" w:afterAutospacing="0" w:line="276" w:lineRule="auto"/>
         <w:rPr>
           <w:rFonts w:asciiTheme="minorHAnsi" w:hAnsiTheme="minorHAnsi"/>
           <w:color w:val="000000"/>
@@ -1081,6 +1107,9 @@
       </w:r>
     </w:p>
     <w:p>
+      <w:pPr>
+        <w:spacing w:line="276" w:lineRule="auto"/>
+      </w:pPr>
       <w:r>
         <w:rPr>
           <w:rFonts w:cs="Times New Roman"/>
@@ -1128,7 +1157,11 @@
         <w:t>methods</w:t>
       </w:r>
     </w:p>
-    <w:p/>
+    <w:p>
+      <w:pPr>
+        <w:spacing w:line="276" w:lineRule="auto"/>
+      </w:pPr>
+    </w:p>
     <w:p>
       <w:pPr>
         <w:pStyle w:val="Heading2"/>
@@ -1136,6 +1169,7 @@
           <w:ilvl w:val="1"/>
           <w:numId w:val="2"/>
         </w:numPr>
+        <w:spacing w:line="276" w:lineRule="auto"/>
       </w:pPr>
       <w:r>
         <w:t>Hyper</w:t>
@@ -1151,6 +1185,7 @@
           <w:ilvl w:val="2"/>
           <w:numId w:val="2"/>
         </w:numPr>
+        <w:spacing w:line="276" w:lineRule="auto"/>
       </w:pPr>
       <w:r>
         <w:t>Random Forest Optimization</w:t>
@@ -1159,7 +1194,7 @@
     <w:p>
       <w:pPr>
         <w:pStyle w:val="NormalWeb"/>
-        <w:spacing w:before="120" w:beforeAutospacing="0" w:after="120" w:afterAutospacing="0"/>
+        <w:spacing w:before="120" w:beforeAutospacing="0" w:after="120" w:afterAutospacing="0" w:line="276" w:lineRule="auto"/>
         <w:rPr>
           <w:rFonts w:asciiTheme="minorHAnsi" w:hAnsiTheme="minorHAnsi"/>
           <w:color w:val="000000"/>
@@ -1180,7 +1215,7 @@
           <w:ilvl w:val="0"/>
           <w:numId w:val="15"/>
         </w:numPr>
-        <w:spacing w:before="0" w:beforeAutospacing="0" w:after="0" w:afterAutospacing="0"/>
+        <w:spacing w:before="0" w:beforeAutospacing="0" w:after="0" w:afterAutospacing="0" w:line="276" w:lineRule="auto"/>
         <w:textAlignment w:val="baseline"/>
         <w:rPr>
           <w:rFonts w:asciiTheme="minorHAnsi" w:hAnsiTheme="minorHAnsi"/>
@@ -1202,7 +1237,7 @@
           <w:ilvl w:val="0"/>
           <w:numId w:val="15"/>
         </w:numPr>
-        <w:spacing w:before="0" w:beforeAutospacing="0" w:after="0" w:afterAutospacing="0"/>
+        <w:spacing w:before="0" w:beforeAutospacing="0" w:after="0" w:afterAutospacing="0" w:line="276" w:lineRule="auto"/>
         <w:textAlignment w:val="baseline"/>
         <w:rPr>
           <w:rFonts w:asciiTheme="minorHAnsi" w:hAnsiTheme="minorHAnsi"/>
@@ -1224,7 +1259,7 @@
           <w:ilvl w:val="0"/>
           <w:numId w:val="15"/>
         </w:numPr>
-        <w:spacing w:before="0" w:beforeAutospacing="0" w:after="0" w:afterAutospacing="0"/>
+        <w:spacing w:before="0" w:beforeAutospacing="0" w:after="0" w:afterAutospacing="0" w:line="276" w:lineRule="auto"/>
         <w:textAlignment w:val="baseline"/>
         <w:rPr>
           <w:rFonts w:asciiTheme="minorHAnsi" w:hAnsiTheme="minorHAnsi"/>
@@ -1246,7 +1281,7 @@
           <w:ilvl w:val="0"/>
           <w:numId w:val="15"/>
         </w:numPr>
-        <w:spacing w:before="0" w:beforeAutospacing="0" w:after="0" w:afterAutospacing="0"/>
+        <w:spacing w:before="0" w:beforeAutospacing="0" w:after="0" w:afterAutospacing="0" w:line="276" w:lineRule="auto"/>
         <w:textAlignment w:val="baseline"/>
         <w:rPr>
           <w:rFonts w:asciiTheme="minorHAnsi" w:hAnsiTheme="minorHAnsi"/>
@@ -1264,7 +1299,7 @@
     <w:p>
       <w:pPr>
         <w:pStyle w:val="NormalWeb"/>
-        <w:spacing w:before="120" w:beforeAutospacing="0" w:after="120" w:afterAutospacing="0"/>
+        <w:spacing w:before="120" w:beforeAutospacing="0" w:after="120" w:afterAutospacing="0" w:line="276" w:lineRule="auto"/>
         <w:rPr>
           <w:rFonts w:asciiTheme="minorHAnsi" w:hAnsiTheme="minorHAnsi"/>
           <w:color w:val="000000"/>
@@ -1285,7 +1320,7 @@
           <w:ilvl w:val="0"/>
           <w:numId w:val="15"/>
         </w:numPr>
-        <w:spacing w:before="0" w:beforeAutospacing="0" w:after="0" w:afterAutospacing="0"/>
+        <w:spacing w:before="0" w:beforeAutospacing="0" w:after="0" w:afterAutospacing="0" w:line="276" w:lineRule="auto"/>
         <w:textAlignment w:val="baseline"/>
         <w:rPr>
           <w:rFonts w:asciiTheme="minorHAnsi" w:hAnsiTheme="minorHAnsi"/>
@@ -1307,7 +1342,7 @@
           <w:ilvl w:val="0"/>
           <w:numId w:val="15"/>
         </w:numPr>
-        <w:spacing w:before="0" w:beforeAutospacing="0" w:after="0" w:afterAutospacing="0"/>
+        <w:spacing w:before="0" w:beforeAutospacing="0" w:after="0" w:afterAutospacing="0" w:line="276" w:lineRule="auto"/>
         <w:textAlignment w:val="baseline"/>
         <w:rPr>
           <w:rFonts w:asciiTheme="minorHAnsi" w:hAnsiTheme="minorHAnsi"/>
@@ -1329,7 +1364,7 @@
           <w:ilvl w:val="0"/>
           <w:numId w:val="15"/>
         </w:numPr>
-        <w:spacing w:before="0" w:beforeAutospacing="0" w:after="0" w:afterAutospacing="0"/>
+        <w:spacing w:before="0" w:beforeAutospacing="0" w:after="0" w:afterAutospacing="0" w:line="276" w:lineRule="auto"/>
         <w:textAlignment w:val="baseline"/>
         <w:rPr>
           <w:rFonts w:asciiTheme="minorHAnsi" w:hAnsiTheme="minorHAnsi"/>
@@ -1351,7 +1386,7 @@
           <w:ilvl w:val="0"/>
           <w:numId w:val="15"/>
         </w:numPr>
-        <w:spacing w:before="0" w:beforeAutospacing="0" w:after="0" w:afterAutospacing="0"/>
+        <w:spacing w:before="0" w:beforeAutospacing="0" w:after="0" w:afterAutospacing="0" w:line="276" w:lineRule="auto"/>
         <w:textAlignment w:val="baseline"/>
         <w:rPr>
           <w:rFonts w:asciiTheme="minorHAnsi" w:hAnsiTheme="minorHAnsi"/>
@@ -1369,7 +1404,7 @@
     <w:p>
       <w:pPr>
         <w:pStyle w:val="NormalWeb"/>
-        <w:spacing w:before="120" w:beforeAutospacing="0" w:after="120" w:afterAutospacing="0"/>
+        <w:spacing w:before="120" w:beforeAutospacing="0" w:after="120" w:afterAutospacing="0" w:line="276" w:lineRule="auto"/>
         <w:rPr>
           <w:rFonts w:asciiTheme="minorHAnsi" w:hAnsiTheme="minorHAnsi"/>
           <w:color w:val="000000"/>
@@ -1390,7 +1425,7 @@
           <w:ilvl w:val="0"/>
           <w:numId w:val="15"/>
         </w:numPr>
-        <w:spacing w:before="0" w:beforeAutospacing="0" w:after="0" w:afterAutospacing="0"/>
+        <w:spacing w:before="0" w:beforeAutospacing="0" w:after="0" w:afterAutospacing="0" w:line="276" w:lineRule="auto"/>
         <w:textAlignment w:val="baseline"/>
         <w:rPr>
           <w:rFonts w:asciiTheme="minorHAnsi" w:hAnsiTheme="minorHAnsi"/>
@@ -1412,7 +1447,7 @@
           <w:ilvl w:val="0"/>
           <w:numId w:val="15"/>
         </w:numPr>
-        <w:spacing w:before="0" w:beforeAutospacing="0" w:after="0" w:afterAutospacing="0"/>
+        <w:spacing w:before="0" w:beforeAutospacing="0" w:after="0" w:afterAutospacing="0" w:line="276" w:lineRule="auto"/>
         <w:textAlignment w:val="baseline"/>
         <w:rPr>
           <w:rFonts w:asciiTheme="minorHAnsi" w:hAnsiTheme="minorHAnsi"/>
@@ -1434,7 +1469,7 @@
           <w:ilvl w:val="0"/>
           <w:numId w:val="15"/>
         </w:numPr>
-        <w:spacing w:before="0" w:beforeAutospacing="0" w:after="0" w:afterAutospacing="0"/>
+        <w:spacing w:before="0" w:beforeAutospacing="0" w:after="0" w:afterAutospacing="0" w:line="276" w:lineRule="auto"/>
         <w:textAlignment w:val="baseline"/>
         <w:rPr>
           <w:rFonts w:asciiTheme="minorHAnsi" w:hAnsiTheme="minorHAnsi"/>
@@ -1456,7 +1491,7 @@
           <w:ilvl w:val="0"/>
           <w:numId w:val="15"/>
         </w:numPr>
-        <w:spacing w:before="0" w:beforeAutospacing="0" w:after="0" w:afterAutospacing="0"/>
+        <w:spacing w:before="0" w:beforeAutospacing="0" w:after="0" w:afterAutospacing="0" w:line="276" w:lineRule="auto"/>
         <w:textAlignment w:val="baseline"/>
         <w:rPr>
           <w:rFonts w:asciiTheme="minorHAnsi" w:hAnsiTheme="minorHAnsi"/>
@@ -1468,13 +1503,14 @@
           <w:rFonts w:asciiTheme="minorHAnsi" w:hAnsiTheme="minorHAnsi"/>
           <w:color w:val="000000"/>
         </w:rPr>
+        <w:lastRenderedPageBreak/>
         <w:t>Overall Accuracy: 0.99</w:t>
       </w:r>
     </w:p>
     <w:p>
       <w:pPr>
         <w:pStyle w:val="NormalWeb"/>
-        <w:spacing w:before="0" w:beforeAutospacing="0" w:after="0" w:afterAutospacing="0"/>
+        <w:spacing w:before="0" w:beforeAutospacing="0" w:after="0" w:afterAutospacing="0" w:line="276" w:lineRule="auto"/>
         <w:textAlignment w:val="baseline"/>
         <w:rPr>
           <w:rFonts w:asciiTheme="minorHAnsi" w:hAnsiTheme="minorHAnsi"/>
@@ -1489,6 +1525,7 @@
           <w:ilvl w:val="2"/>
           <w:numId w:val="2"/>
         </w:numPr>
+        <w:spacing w:line="276" w:lineRule="auto"/>
       </w:pPr>
       <w:r>
         <w:t>Bagging Optimization</w:t>
@@ -1497,7 +1534,7 @@
     <w:p>
       <w:pPr>
         <w:pStyle w:val="NormalWeb"/>
-        <w:spacing w:before="120" w:beforeAutospacing="0" w:after="120" w:afterAutospacing="0"/>
+        <w:spacing w:before="120" w:beforeAutospacing="0" w:after="120" w:afterAutospacing="0" w:line="276" w:lineRule="auto"/>
         <w:rPr>
           <w:rFonts w:asciiTheme="minorHAnsi" w:hAnsiTheme="minorHAnsi"/>
           <w:color w:val="000000"/>
@@ -1518,7 +1555,7 @@
           <w:ilvl w:val="0"/>
           <w:numId w:val="16"/>
         </w:numPr>
-        <w:spacing w:before="0" w:beforeAutospacing="0" w:after="0" w:afterAutospacing="0"/>
+        <w:spacing w:before="0" w:beforeAutospacing="0" w:after="0" w:afterAutospacing="0" w:line="276" w:lineRule="auto"/>
         <w:textAlignment w:val="baseline"/>
         <w:rPr>
           <w:rFonts w:asciiTheme="minorHAnsi" w:hAnsiTheme="minorHAnsi"/>
@@ -1540,7 +1577,7 @@
           <w:ilvl w:val="0"/>
           <w:numId w:val="16"/>
         </w:numPr>
-        <w:spacing w:before="0" w:beforeAutospacing="0" w:after="0" w:afterAutospacing="0"/>
+        <w:spacing w:before="0" w:beforeAutospacing="0" w:after="0" w:afterAutospacing="0" w:line="276" w:lineRule="auto"/>
         <w:textAlignment w:val="baseline"/>
         <w:rPr>
           <w:rFonts w:asciiTheme="minorHAnsi" w:hAnsiTheme="minorHAnsi"/>
@@ -1552,7 +1589,6 @@
           <w:rFonts w:asciiTheme="minorHAnsi" w:hAnsiTheme="minorHAnsi"/>
           <w:color w:val="000000"/>
         </w:rPr>
-        <w:lastRenderedPageBreak/>
         <w:t>max_samples: [0.5, 0.7, 1.0]</w:t>
       </w:r>
     </w:p>
@@ -1563,7 +1599,7 @@
           <w:ilvl w:val="0"/>
           <w:numId w:val="16"/>
         </w:numPr>
-        <w:spacing w:before="0" w:beforeAutospacing="0" w:after="0" w:afterAutospacing="0"/>
+        <w:spacing w:before="0" w:beforeAutospacing="0" w:after="0" w:afterAutospacing="0" w:line="276" w:lineRule="auto"/>
         <w:textAlignment w:val="baseline"/>
         <w:rPr>
           <w:rFonts w:asciiTheme="minorHAnsi" w:hAnsiTheme="minorHAnsi"/>
@@ -1581,7 +1617,7 @@
     <w:p>
       <w:pPr>
         <w:pStyle w:val="NormalWeb"/>
-        <w:spacing w:before="120" w:beforeAutospacing="0" w:after="120" w:afterAutospacing="0"/>
+        <w:spacing w:before="120" w:beforeAutospacing="0" w:after="120" w:afterAutospacing="0" w:line="276" w:lineRule="auto"/>
         <w:rPr>
           <w:rFonts w:asciiTheme="minorHAnsi" w:hAnsiTheme="minorHAnsi"/>
           <w:color w:val="000000"/>
@@ -1602,7 +1638,7 @@
           <w:ilvl w:val="0"/>
           <w:numId w:val="17"/>
         </w:numPr>
-        <w:spacing w:before="0" w:beforeAutospacing="0" w:after="0" w:afterAutospacing="0"/>
+        <w:spacing w:before="0" w:beforeAutospacing="0" w:after="0" w:afterAutospacing="0" w:line="276" w:lineRule="auto"/>
         <w:textAlignment w:val="baseline"/>
         <w:rPr>
           <w:rFonts w:asciiTheme="minorHAnsi" w:hAnsiTheme="minorHAnsi"/>
@@ -1624,7 +1660,7 @@
           <w:ilvl w:val="0"/>
           <w:numId w:val="17"/>
         </w:numPr>
-        <w:spacing w:before="0" w:beforeAutospacing="0" w:after="0" w:afterAutospacing="0"/>
+        <w:spacing w:before="0" w:beforeAutospacing="0" w:after="0" w:afterAutospacing="0" w:line="276" w:lineRule="auto"/>
         <w:textAlignment w:val="baseline"/>
         <w:rPr>
           <w:rFonts w:asciiTheme="minorHAnsi" w:hAnsiTheme="minorHAnsi"/>
@@ -1646,7 +1682,7 @@
           <w:ilvl w:val="0"/>
           <w:numId w:val="17"/>
         </w:numPr>
-        <w:spacing w:before="0" w:beforeAutospacing="0" w:after="0" w:afterAutospacing="0"/>
+        <w:spacing w:before="0" w:beforeAutospacing="0" w:after="0" w:afterAutospacing="0" w:line="276" w:lineRule="auto"/>
         <w:textAlignment w:val="baseline"/>
         <w:rPr>
           <w:rFonts w:asciiTheme="minorHAnsi" w:hAnsiTheme="minorHAnsi"/>
@@ -1664,7 +1700,7 @@
     <w:p>
       <w:pPr>
         <w:pStyle w:val="NormalWeb"/>
-        <w:spacing w:before="120" w:beforeAutospacing="0" w:after="120" w:afterAutospacing="0"/>
+        <w:spacing w:before="120" w:beforeAutospacing="0" w:after="120" w:afterAutospacing="0" w:line="276" w:lineRule="auto"/>
         <w:rPr>
           <w:rFonts w:asciiTheme="minorHAnsi" w:hAnsiTheme="minorHAnsi"/>
           <w:color w:val="000000"/>
@@ -1685,7 +1721,7 @@
           <w:ilvl w:val="0"/>
           <w:numId w:val="18"/>
         </w:numPr>
-        <w:spacing w:before="0" w:beforeAutospacing="0" w:after="0" w:afterAutospacing="0"/>
+        <w:spacing w:before="0" w:beforeAutospacing="0" w:after="0" w:afterAutospacing="0" w:line="276" w:lineRule="auto"/>
         <w:textAlignment w:val="baseline"/>
         <w:rPr>
           <w:rFonts w:asciiTheme="minorHAnsi" w:hAnsiTheme="minorHAnsi"/>
@@ -1707,7 +1743,7 @@
           <w:ilvl w:val="0"/>
           <w:numId w:val="18"/>
         </w:numPr>
-        <w:spacing w:before="0" w:beforeAutospacing="0" w:after="0" w:afterAutospacing="0"/>
+        <w:spacing w:before="0" w:beforeAutospacing="0" w:after="0" w:afterAutospacing="0" w:line="276" w:lineRule="auto"/>
         <w:textAlignment w:val="baseline"/>
         <w:rPr>
           <w:rFonts w:asciiTheme="minorHAnsi" w:hAnsiTheme="minorHAnsi"/>
@@ -1729,7 +1765,7 @@
           <w:ilvl w:val="0"/>
           <w:numId w:val="18"/>
         </w:numPr>
-        <w:spacing w:before="0" w:beforeAutospacing="0" w:after="0" w:afterAutospacing="0"/>
+        <w:spacing w:before="0" w:beforeAutospacing="0" w:after="0" w:afterAutospacing="0" w:line="276" w:lineRule="auto"/>
         <w:textAlignment w:val="baseline"/>
         <w:rPr>
           <w:rFonts w:asciiTheme="minorHAnsi" w:hAnsiTheme="minorHAnsi"/>
@@ -1751,7 +1787,7 @@
           <w:ilvl w:val="0"/>
           <w:numId w:val="18"/>
         </w:numPr>
-        <w:spacing w:before="0" w:beforeAutospacing="0" w:after="0" w:afterAutospacing="0"/>
+        <w:spacing w:before="0" w:beforeAutospacing="0" w:after="0" w:afterAutospacing="0" w:line="276" w:lineRule="auto"/>
         <w:textAlignment w:val="baseline"/>
         <w:rPr>
           <w:rFonts w:asciiTheme="minorHAnsi" w:hAnsiTheme="minorHAnsi"/>
@@ -1766,7 +1802,11 @@
         <w:t>Overall Accuracy: 0.99</w:t>
       </w:r>
     </w:p>
-    <w:p/>
+    <w:p>
+      <w:pPr>
+        <w:spacing w:line="276" w:lineRule="auto"/>
+      </w:pPr>
+    </w:p>
     <w:p>
       <w:pPr>
         <w:pStyle w:val="Heading2"/>
@@ -1774,6 +1814,7 @@
           <w:ilvl w:val="1"/>
           <w:numId w:val="2"/>
         </w:numPr>
+        <w:spacing w:line="276" w:lineRule="auto"/>
       </w:pPr>
       <w:r>
         <w:t>Final Model Evaluation</w:t>
@@ -1781,6 +1822,7 @@
     </w:p>
     <w:p>
       <w:pPr>
+        <w:spacing w:line="276" w:lineRule="auto"/>
         <w:rPr>
           <w:rFonts w:cs="Segoe UI"/>
           <w:spacing w:val="1"/>
@@ -1817,6 +1859,7 @@
           </w:tcPr>
           <w:p>
             <w:pPr>
+              <w:spacing w:line="276" w:lineRule="auto"/>
               <w:rPr>
                 <w:rFonts w:cs="Segoe UI"/>
                 <w:b/>
@@ -1841,6 +1884,7 @@
           </w:tcPr>
           <w:p>
             <w:pPr>
+              <w:spacing w:line="276" w:lineRule="auto"/>
               <w:rPr>
                 <w:rFonts w:cs="Segoe UI"/>
                 <w:b/>
@@ -1865,6 +1909,7 @@
           </w:tcPr>
           <w:p>
             <w:pPr>
+              <w:spacing w:line="276" w:lineRule="auto"/>
               <w:rPr>
                 <w:rFonts w:cs="Segoe UI"/>
                 <w:b/>
@@ -1895,6 +1940,7 @@
           </w:tcPr>
           <w:p>
             <w:pPr>
+              <w:spacing w:line="276" w:lineRule="auto"/>
               <w:rPr>
                 <w:rFonts w:cs="Segoe UI"/>
                 <w:spacing w:val="1"/>
@@ -1922,6 +1968,7 @@
           </w:tcPr>
           <w:p>
             <w:pPr>
+              <w:spacing w:line="276" w:lineRule="auto"/>
               <w:rPr>
                 <w:rFonts w:cs="Segoe UI"/>
                 <w:spacing w:val="1"/>
@@ -1942,6 +1989,7 @@
           </w:tcPr>
           <w:p>
             <w:pPr>
+              <w:spacing w:line="276" w:lineRule="auto"/>
               <w:rPr>
                 <w:rFonts w:cs="Segoe UI"/>
                 <w:spacing w:val="1"/>
@@ -1960,6 +2008,60 @@
     </w:tbl>
     <w:p>
       <w:pPr>
+        <w:spacing w:line="276" w:lineRule="auto"/>
+        <w:rPr>
+          <w:rFonts w:cs="Segoe UI"/>
+          <w:spacing w:val="1"/>
+        </w:rPr>
+      </w:pPr>
+    </w:p>
+    <w:p>
+      <w:pPr>
+        <w:spacing w:line="276" w:lineRule="auto"/>
+        <w:rPr>
+          <w:rFonts w:cs="Times New Roman"/>
+          <w:spacing w:val="1"/>
+        </w:rPr>
+      </w:pPr>
+      <w:r>
+        <w:rPr>
+          <w:rFonts w:cs="Times New Roman"/>
+          <w:spacing w:val="1"/>
+        </w:rPr>
+        <w:t xml:space="preserve">From the result, </w:t>
+      </w:r>
+      <w:r>
+        <w:rPr>
+          <w:rFonts w:cs="Times New Roman"/>
+          <w:spacing w:val="1"/>
+        </w:rPr>
+        <w:t xml:space="preserve">Random Forest </w:t>
+      </w:r>
+      <w:r>
+        <w:rPr>
+          <w:rFonts w:cs="Times New Roman"/>
+          <w:spacing w:val="1"/>
+        </w:rPr>
+        <w:t>is</w:t>
+      </w:r>
+      <w:r>
+        <w:rPr>
+          <w:rFonts w:cs="Times New Roman"/>
+          <w:spacing w:val="1"/>
+        </w:rPr>
+        <w:t xml:space="preserve"> selected as the primary model due to marginally higher F1 score</w:t>
+      </w:r>
+      <w:r>
+        <w:rPr>
+          <w:rFonts w:cs="Times New Roman"/>
+          <w:spacing w:val="1"/>
+        </w:rPr>
+        <w:t>.</w:t>
+      </w:r>
+    </w:p>
+    <w:p>
+      <w:pPr>
+        <w:spacing w:line="276" w:lineRule="auto"/>
         <w:rPr>
           <w:rFonts w:cs="Segoe UI"/>
           <w:spacing w:val="1"/>
@@ -1973,14 +2075,329 @@
           <w:ilvl w:val="1"/>
           <w:numId w:val="2"/>
         </w:numPr>
-      </w:pPr>
-      <w:r>
+        <w:spacing w:line="276" w:lineRule="auto"/>
+      </w:pPr>
+      <w:r>
+        <w:lastRenderedPageBreak/>
         <w:t>Key Findings and Insights</w:t>
       </w:r>
     </w:p>
-    <w:p/>
-    <w:p>
-      <w:pPr>
+    <w:p>
+      <w:pPr>
+        <w:pStyle w:val="Heading3"/>
+        <w:numPr>
+          <w:ilvl w:val="2"/>
+          <w:numId w:val="2"/>
+        </w:numPr>
+        <w:spacing w:line="276" w:lineRule="auto"/>
+      </w:pPr>
+      <w:r>
+        <w:t>Model Performance</w:t>
+      </w:r>
+    </w:p>
+    <w:p>
+      <w:pPr>
+        <w:spacing w:before="120" w:after="120" w:line="276" w:lineRule="auto"/>
+        <w:rPr>
+          <w:color w:val="000000"/>
+        </w:rPr>
+      </w:pPr>
+      <w:r>
+        <w:rPr>
+          <w:b/>
+          <w:bCs/>
+          <w:color w:val="000000"/>
+        </w:rPr>
+        <w:t>Excellent Anomaly Detection</w:t>
+      </w:r>
+      <w:r>
+        <w:rPr>
+          <w:color w:val="000000"/>
+        </w:rPr>
+        <w:t>: Both ensemble methods achieved approximately 90% F1 scores, indicating strong balance between precision and recall for the minority anomalous class.</w:t>
+      </w:r>
+    </w:p>
+    <w:p>
+      <w:pPr>
+        <w:spacing w:before="120" w:after="120" w:line="276" w:lineRule="auto"/>
+        <w:rPr>
+          <w:color w:val="000000"/>
+        </w:rPr>
+      </w:pPr>
+      <w:r>
+        <w:rPr>
+          <w:b/>
+          <w:bCs/>
+          <w:color w:val="000000"/>
+        </w:rPr>
+        <w:t>Ensemble Superiority</w:t>
+      </w:r>
+      <w:r>
+        <w:rPr>
+          <w:color w:val="000000"/>
+        </w:rPr>
+        <w:t>: Ensemble methods substantially outperformed single-classifier approaches, validating the benefit of combining multiple base learners.</w:t>
+      </w:r>
+    </w:p>
+    <w:p>
+      <w:pPr>
+        <w:spacing w:before="120" w:after="120" w:line="276" w:lineRule="auto"/>
+        <w:rPr>
+          <w:rFonts w:eastAsia="Times New Roman" w:cs="Times New Roman"/>
+          <w:color w:val="000000"/>
+          <w:kern w:val="0"/>
+          <w14:ligatures w14:val="none"/>
+        </w:rPr>
+      </w:pPr>
+      <w:r>
+        <w:rPr>
+          <w:b/>
+          <w:bCs/>
+          <w:color w:val="000000"/>
+        </w:rPr>
+        <w:t>Hyperparameter Impact</w:t>
+      </w:r>
+      <w:r>
+        <w:rPr>
+          <w:color w:val="000000"/>
+        </w:rPr>
+        <w:t>: Careful parameter tuning improved model robustness:</w:t>
+      </w:r>
+    </w:p>
+    <w:p>
+      <w:pPr>
+        <w:pStyle w:val="NormalWeb"/>
+        <w:numPr>
+          <w:ilvl w:val="1"/>
+          <w:numId w:val="20"/>
+        </w:numPr>
+        <w:tabs>
+          <w:tab w:val="clear" w:pos="1440"/>
+          <w:tab w:val="num" w:pos="720"/>
+        </w:tabs>
+        <w:spacing w:before="0" w:beforeAutospacing="0" w:after="0" w:afterAutospacing="0" w:line="276" w:lineRule="auto"/>
+        <w:ind w:left="720"/>
+        <w:textAlignment w:val="baseline"/>
+        <w:rPr>
+          <w:rFonts w:asciiTheme="minorHAnsi" w:hAnsiTheme="minorHAnsi"/>
+          <w:color w:val="000000"/>
+        </w:rPr>
+      </w:pPr>
+      <w:r>
+        <w:rPr>
+          <w:rFonts w:asciiTheme="minorHAnsi" w:hAnsiTheme="minorHAnsi"/>
+          <w:color w:val="000000"/>
+        </w:rPr>
+        <w:t>Limiting max_depth to 10 prevented overfitting</w:t>
+      </w:r>
+    </w:p>
+    <w:p>
+      <w:pPr>
+        <w:pStyle w:val="NormalWeb"/>
+        <w:numPr>
+          <w:ilvl w:val="1"/>
+          <w:numId w:val="20"/>
+        </w:numPr>
+        <w:tabs>
+          <w:tab w:val="clear" w:pos="1440"/>
+          <w:tab w:val="num" w:pos="720"/>
+        </w:tabs>
+        <w:spacing w:before="0" w:beforeAutospacing="0" w:after="0" w:afterAutospacing="0" w:line="276" w:lineRule="auto"/>
+        <w:ind w:left="720"/>
+        <w:textAlignment w:val="baseline"/>
+        <w:rPr>
+          <w:rFonts w:asciiTheme="minorHAnsi" w:hAnsiTheme="minorHAnsi"/>
+          <w:color w:val="000000"/>
+        </w:rPr>
+      </w:pPr>
+      <w:r>
+        <w:rPr>
+          <w:rFonts w:asciiTheme="minorHAnsi" w:hAnsiTheme="minorHAnsi"/>
+          <w:color w:val="000000"/>
+        </w:rPr>
+        <w:t>Bagging with bootstrap sampling (max_samples=0.5) enhanced generalization</w:t>
+      </w:r>
+    </w:p>
+    <w:p>
+      <w:pPr>
+        <w:pStyle w:val="NormalWeb"/>
+        <w:numPr>
+          <w:ilvl w:val="1"/>
+          <w:numId w:val="20"/>
+        </w:numPr>
+        <w:tabs>
+          <w:tab w:val="clear" w:pos="1440"/>
+          <w:tab w:val="num" w:pos="720"/>
+        </w:tabs>
+        <w:spacing w:before="0" w:beforeAutospacing="0" w:after="0" w:afterAutospacing="0" w:line="276" w:lineRule="auto"/>
+        <w:ind w:left="720"/>
+        <w:textAlignment w:val="baseline"/>
+        <w:rPr>
+          <w:rFonts w:asciiTheme="minorHAnsi" w:hAnsiTheme="minorHAnsi"/>
+          <w:color w:val="000000"/>
+        </w:rPr>
+      </w:pPr>
+      <w:r>
+        <w:rPr>
+          <w:rFonts w:asciiTheme="minorHAnsi" w:hAnsiTheme="minorHAnsi"/>
+          <w:color w:val="000000"/>
+        </w:rPr>
+        <w:t>Tuning base parameters significantly impacted anomaly detection rat</w:t>
+      </w:r>
+      <w:r>
+        <w:rPr>
+          <w:rFonts w:asciiTheme="minorHAnsi" w:hAnsiTheme="minorHAnsi"/>
+          <w:color w:val="000000"/>
+        </w:rPr>
+        <w:t>e</w:t>
+      </w:r>
+    </w:p>
+    <w:p>
+      <w:pPr>
+        <w:pStyle w:val="NormalWeb"/>
+        <w:spacing w:before="0" w:beforeAutospacing="0" w:after="0" w:afterAutospacing="0" w:line="276" w:lineRule="auto"/>
+        <w:textAlignment w:val="baseline"/>
+        <w:rPr>
+          <w:rFonts w:asciiTheme="minorHAnsi" w:hAnsiTheme="minorHAnsi"/>
+          <w:color w:val="000000"/>
+        </w:rPr>
+      </w:pPr>
+    </w:p>
+    <w:p>
+      <w:pPr>
+        <w:pStyle w:val="Heading3"/>
+        <w:numPr>
+          <w:ilvl w:val="2"/>
+          <w:numId w:val="2"/>
+        </w:numPr>
+        <w:spacing w:line="276" w:lineRule="auto"/>
+      </w:pPr>
+      <w:r>
+        <w:t xml:space="preserve">Class Imbalance Handling </w:t>
+      </w:r>
+    </w:p>
+    <w:p>
+      <w:pPr>
+        <w:pStyle w:val="NormalWeb"/>
+        <w:spacing w:before="0" w:beforeAutospacing="0" w:after="0" w:afterAutospacing="0" w:line="276" w:lineRule="auto"/>
+        <w:textAlignment w:val="baseline"/>
+        <w:rPr>
+          <w:rFonts w:asciiTheme="minorHAnsi" w:hAnsiTheme="minorHAnsi"/>
+          <w:color w:val="000000"/>
+        </w:rPr>
+      </w:pPr>
+      <w:r>
+        <w:rPr>
+          <w:rFonts w:asciiTheme="minorHAnsi" w:hAnsiTheme="minorHAnsi"/>
+          <w:color w:val="000000"/>
+        </w:rPr>
+        <w:t>The d</w:t>
+      </w:r>
+      <w:r>
+        <w:rPr>
+          <w:rFonts w:asciiTheme="minorHAnsi" w:hAnsiTheme="minorHAnsi"/>
+          <w:color w:val="000000"/>
+        </w:rPr>
+        <w:t>ataset contained only 3.01% anomalous transactions</w:t>
+      </w:r>
+    </w:p>
+    <w:p>
+      <w:pPr>
+        <w:pStyle w:val="NormalWeb"/>
+        <w:spacing w:before="0" w:beforeAutospacing="0" w:after="0" w:afterAutospacing="0" w:line="276" w:lineRule="auto"/>
+        <w:textAlignment w:val="baseline"/>
+        <w:rPr>
+          <w:rFonts w:asciiTheme="minorHAnsi" w:hAnsiTheme="minorHAnsi"/>
+          <w:color w:val="000000"/>
+        </w:rPr>
+      </w:pPr>
+      <w:r>
+        <w:rPr>
+          <w:rFonts w:asciiTheme="minorHAnsi" w:hAnsiTheme="minorHAnsi"/>
+          <w:color w:val="000000"/>
+        </w:rPr>
+        <w:t>Standard accuracy (99%+) would be misleading for imbalanced data</w:t>
+      </w:r>
+    </w:p>
+    <w:p>
+      <w:pPr>
+        <w:pStyle w:val="NormalWeb"/>
+        <w:spacing w:before="0" w:beforeAutospacing="0" w:after="0" w:afterAutospacing="0" w:line="276" w:lineRule="auto"/>
+        <w:textAlignment w:val="baseline"/>
+        <w:rPr>
+          <w:rFonts w:asciiTheme="minorHAnsi" w:hAnsiTheme="minorHAnsi"/>
+          <w:color w:val="000000"/>
+        </w:rPr>
+      </w:pPr>
+      <w:r>
+        <w:rPr>
+          <w:rFonts w:asciiTheme="minorHAnsi" w:hAnsiTheme="minorHAnsi"/>
+          <w:color w:val="000000"/>
+        </w:rPr>
+        <w:t>F1 score effectively balanced precision-recall trade-off</w:t>
+      </w:r>
+    </w:p>
+    <w:p>
+      <w:pPr>
+        <w:pStyle w:val="NormalWeb"/>
+        <w:spacing w:before="0" w:beforeAutospacing="0" w:after="0" w:afterAutospacing="0" w:line="276" w:lineRule="auto"/>
+        <w:textAlignment w:val="baseline"/>
+        <w:rPr>
+          <w:rFonts w:asciiTheme="minorHAnsi" w:hAnsiTheme="minorHAnsi"/>
+          <w:color w:val="000000"/>
+        </w:rPr>
+      </w:pPr>
+      <w:r>
+        <w:rPr>
+          <w:rFonts w:asciiTheme="minorHAnsi" w:hAnsiTheme="minorHAnsi"/>
+          <w:color w:val="000000"/>
+        </w:rPr>
+        <w:t>No SMOTE or class weights necessary given ensemble method robustness</w:t>
+      </w:r>
+    </w:p>
+    <w:p>
+      <w:pPr>
+        <w:spacing w:line="276" w:lineRule="auto"/>
+      </w:pPr>
+    </w:p>
+    <w:p>
+      <w:pPr>
+        <w:pStyle w:val="Heading3"/>
+        <w:numPr>
+          <w:ilvl w:val="2"/>
+          <w:numId w:val="2"/>
+        </w:numPr>
+        <w:spacing w:line="276" w:lineRule="auto"/>
+      </w:pPr>
+      <w:r>
+        <w:t>Feature Importance</w:t>
+      </w:r>
+    </w:p>
+    <w:p>
+      <w:pPr>
+        <w:spacing w:line="276" w:lineRule="auto"/>
+      </w:pPr>
+      <w:r>
+        <w:rPr>
+          <w:rFonts w:cs="Segoe UI"/>
+          <w:spacing w:val="1"/>
+        </w:rPr>
+        <w:t>The Random Forest model leveraged all 30 features, with ensemble voting providing robust decision-making across diverse feature patterns underlying transaction anomalies.</w:t>
+      </w:r>
+    </w:p>
+    <w:p>
+      <w:pPr>
+        <w:spacing w:line="276" w:lineRule="auto"/>
+      </w:pPr>
+    </w:p>
+    <w:p>
+      <w:pPr>
+        <w:spacing w:line="276" w:lineRule="auto"/>
+      </w:pPr>
+    </w:p>
+    <w:p>
+      <w:pPr>
+        <w:spacing w:line="276" w:lineRule="auto"/>
         <w:rPr>
           <w:rFonts w:asciiTheme="majorHAnsi" w:eastAsiaTheme="majorEastAsia" w:hAnsiTheme="majorHAnsi" w:cstheme="majorBidi"/>
           <w:b/>
@@ -2005,6 +2422,7 @@
           <w:ilvl w:val="0"/>
           <w:numId w:val="1"/>
         </w:numPr>
+        <w:spacing w:line="276" w:lineRule="auto"/>
         <w:ind w:left="426" w:hanging="426"/>
         <w:rPr>
           <w:b/>
@@ -2034,6 +2452,7 @@
           <w:ilvl w:val="0"/>
           <w:numId w:val="5"/>
         </w:numPr>
+        <w:spacing w:line="276" w:lineRule="auto"/>
         <w:rPr>
           <w:b/>
           <w:bCs/>
@@ -2047,7 +2466,11 @@
         <w:t>Overview</w:t>
       </w:r>
     </w:p>
-    <w:p/>
+    <w:p>
+      <w:pPr>
+        <w:spacing w:line="276" w:lineRule="auto"/>
+      </w:pPr>
+    </w:p>
     <w:p>
       <w:pPr>
         <w:pStyle w:val="Heading2"/>
@@ -2055,6 +2478,7 @@
           <w:ilvl w:val="0"/>
           <w:numId w:val="5"/>
         </w:numPr>
+        <w:spacing w:line="276" w:lineRule="auto"/>
         <w:rPr>
           <w:b/>
           <w:bCs/>
@@ -2070,6 +2494,7 @@
     </w:p>
     <w:p>
       <w:pPr>
+        <w:spacing w:line="276" w:lineRule="auto"/>
         <w:rPr>
           <w:rFonts w:asciiTheme="majorHAnsi" w:eastAsiaTheme="majorEastAsia" w:hAnsiTheme="majorHAnsi" w:cstheme="majorBidi"/>
           <w:color w:val="0F4761" w:themeColor="accent1" w:themeShade="BF"/>
@@ -2084,6 +2509,7 @@
     <w:p>
       <w:pPr>
         <w:pStyle w:val="Heading1"/>
+        <w:spacing w:line="276" w:lineRule="auto"/>
       </w:pPr>
       <w:r>
         <w:lastRenderedPageBreak/>
@@ -2091,6 +2517,9 @@
       </w:r>
     </w:p>
     <w:p>
+      <w:pPr>
+        <w:spacing w:line="276" w:lineRule="auto"/>
+      </w:pPr>
       <w:r>
         <w:t xml:space="preserve">Source code: </w:t>
       </w:r>
@@ -2106,8 +2535,16 @@
         <w:t xml:space="preserve"> </w:t>
       </w:r>
     </w:p>
-    <w:p/>
-    <w:p/>
+    <w:p>
+      <w:pPr>
+        <w:spacing w:line="276" w:lineRule="auto"/>
+      </w:pPr>
+    </w:p>
+    <w:p>
+      <w:pPr>
+        <w:spacing w:line="276" w:lineRule="auto"/>
+      </w:pPr>
+    </w:p>
     <w:sectPr>
       <w:footerReference w:type="even" r:id="rId9"/>
       <w:footerReference w:type="default" r:id="rId10"/>
@@ -2963,6 +3400,155 @@
     </w:lvl>
   </w:abstractNum>
   <w:abstractNum w:abstractNumId="5" w15:restartNumberingAfterBreak="0">
+    <w:nsid w:val="31A40DB3"/>
+    <w:multiLevelType w:val="multilevel"/>
+    <w:tmpl w:val="894474F8"/>
+    <w:lvl w:ilvl="0">
+      <w:start w:val="1"/>
+      <w:numFmt w:val="bullet"/>
+      <w:lvlText w:val=""/>
+      <w:lvlJc w:val="left"/>
+      <w:pPr>
+        <w:tabs>
+          <w:tab w:val="num" w:pos="720"/>
+        </w:tabs>
+        <w:ind w:left="720" w:hanging="360"/>
+      </w:pPr>
+      <w:rPr>
+        <w:rFonts w:ascii="Symbol" w:hAnsi="Symbol" w:hint="default"/>
+        <w:sz w:val="20"/>
+      </w:rPr>
+    </w:lvl>
+    <w:lvl w:ilvl="1" w:tentative="1">
+      <w:start w:val="1"/>
+      <w:numFmt w:val="bullet"/>
+      <w:lvlText w:val="o"/>
+      <w:lvlJc w:val="left"/>
+      <w:pPr>
+        <w:tabs>
+          <w:tab w:val="num" w:pos="1440"/>
+        </w:tabs>
+        <w:ind w:left="1440" w:hanging="360"/>
+      </w:pPr>
+      <w:rPr>
+        <w:rFonts w:ascii="Courier New" w:hAnsi="Courier New" w:hint="default"/>
+        <w:sz w:val="20"/>
+      </w:rPr>
+    </w:lvl>
+    <w:lvl w:ilvl="2" w:tentative="1">
+      <w:start w:val="1"/>
+      <w:numFmt w:val="bullet"/>
+      <w:lvlText w:val=""/>
+      <w:lvlJc w:val="left"/>
+      <w:pPr>
+        <w:tabs>
+          <w:tab w:val="num" w:pos="2160"/>
+        </w:tabs>
+        <w:ind w:left="2160" w:hanging="360"/>
+      </w:pPr>
+      <w:rPr>
+        <w:rFonts w:ascii="Wingdings" w:hAnsi="Wingdings" w:hint="default"/>
+        <w:sz w:val="20"/>
+      </w:rPr>
+    </w:lvl>
+    <w:lvl w:ilvl="3" w:tentative="1">
+      <w:start w:val="1"/>
+      <w:numFmt w:val="bullet"/>
+      <w:lvlText w:val=""/>
+      <w:lvlJc w:val="left"/>
+      <w:pPr>
+        <w:tabs>
+          <w:tab w:val="num" w:pos="2880"/>
+        </w:tabs>
+        <w:ind w:left="2880" w:hanging="360"/>
+      </w:pPr>
+      <w:rPr>
+        <w:rFonts w:ascii="Wingdings" w:hAnsi="Wingdings" w:hint="default"/>
+        <w:sz w:val="20"/>
+      </w:rPr>
+    </w:lvl>
+    <w:lvl w:ilvl="4" w:tentative="1">
+      <w:start w:val="1"/>
+      <w:numFmt w:val="bullet"/>
+      <w:lvlText w:val=""/>
+      <w:lvlJc w:val="left"/>
+      <w:pPr>
+        <w:tabs>
+          <w:tab w:val="num" w:pos="3600"/>
+        </w:tabs>
+        <w:ind w:left="3600" w:hanging="360"/>
+      </w:pPr>
+      <w:rPr>
+        <w:rFonts w:ascii="Wingdings" w:hAnsi="Wingdings" w:hint="default"/>
+        <w:sz w:val="20"/>
+      </w:rPr>
+    </w:lvl>
+    <w:lvl w:ilvl="5" w:tentative="1">
+      <w:start w:val="1"/>
+      <w:numFmt w:val="bullet"/>
+      <w:lvlText w:val=""/>
+      <w:lvlJc w:val="left"/>
+      <w:pPr>
+        <w:tabs>
+          <w:tab w:val="num" w:pos="4320"/>
+        </w:tabs>
+        <w:ind w:left="4320" w:hanging="360"/>
+      </w:pPr>
+      <w:rPr>
+        <w:rFonts w:ascii="Wingdings" w:hAnsi="Wingdings" w:hint="default"/>
+        <w:sz w:val="20"/>
+      </w:rPr>
+    </w:lvl>
+    <w:lvl w:ilvl="6" w:tentative="1">
+      <w:start w:val="1"/>
+      <w:numFmt w:val="bullet"/>
+      <w:lvlText w:val=""/>
+      <w:lvlJc w:val="left"/>
+      <w:pPr>
+        <w:tabs>
+          <w:tab w:val="num" w:pos="5040"/>
+        </w:tabs>
+        <w:ind w:left="5040" w:hanging="360"/>
+      </w:pPr>
+      <w:rPr>
+        <w:rFonts w:ascii="Wingdings" w:hAnsi="Wingdings" w:hint="default"/>
+        <w:sz w:val="20"/>
+      </w:rPr>
+    </w:lvl>
+    <w:lvl w:ilvl="7" w:tentative="1">
+      <w:start w:val="1"/>
+      <w:numFmt w:val="bullet"/>
+      <w:lvlText w:val=""/>
+      <w:lvlJc w:val="left"/>
+      <w:pPr>
+        <w:tabs>
+          <w:tab w:val="num" w:pos="5760"/>
+        </w:tabs>
+        <w:ind w:left="5760" w:hanging="360"/>
+      </w:pPr>
+      <w:rPr>
+        <w:rFonts w:ascii="Wingdings" w:hAnsi="Wingdings" w:hint="default"/>
+        <w:sz w:val="20"/>
+      </w:rPr>
+    </w:lvl>
+    <w:lvl w:ilvl="8" w:tentative="1">
+      <w:start w:val="1"/>
+      <w:numFmt w:val="bullet"/>
+      <w:lvlText w:val=""/>
+      <w:lvlJc w:val="left"/>
+      <w:pPr>
+        <w:tabs>
+          <w:tab w:val="num" w:pos="6480"/>
+        </w:tabs>
+        <w:ind w:left="6480" w:hanging="360"/>
+      </w:pPr>
+      <w:rPr>
+        <w:rFonts w:ascii="Wingdings" w:hAnsi="Wingdings" w:hint="default"/>
+        <w:sz w:val="20"/>
+      </w:rPr>
+    </w:lvl>
+  </w:abstractNum>
+  <w:abstractNum w:abstractNumId="6" w15:restartNumberingAfterBreak="0">
     <w:nsid w:val="34671D46"/>
     <w:multiLevelType w:val="multilevel"/>
     <w:tmpl w:val="6DC46018"/>
@@ -3111,7 +3697,7 @@
       </w:rPr>
     </w:lvl>
   </w:abstractNum>
-  <w:abstractNum w:abstractNumId="6" w15:restartNumberingAfterBreak="0">
+  <w:abstractNum w:abstractNumId="7" w15:restartNumberingAfterBreak="0">
     <w:nsid w:val="3A593743"/>
     <w:multiLevelType w:val="hybridMultilevel"/>
     <w:tmpl w:val="94867160"/>
@@ -3224,7 +3810,7 @@
       </w:rPr>
     </w:lvl>
   </w:abstractNum>
-  <w:abstractNum w:abstractNumId="7" w15:restartNumberingAfterBreak="0">
+  <w:abstractNum w:abstractNumId="8" w15:restartNumberingAfterBreak="0">
     <w:nsid w:val="3C66665F"/>
     <w:multiLevelType w:val="multilevel"/>
     <w:tmpl w:val="520E569A"/>
@@ -3373,7 +3959,124 @@
       </w:rPr>
     </w:lvl>
   </w:abstractNum>
-  <w:abstractNum w:abstractNumId="8" w15:restartNumberingAfterBreak="0">
+  <w:abstractNum w:abstractNumId="9" w15:restartNumberingAfterBreak="0">
+    <w:nsid w:val="3FC656EB"/>
+    <w:multiLevelType w:val="multilevel"/>
+    <w:tmpl w:val="8C02A030"/>
+    <w:lvl w:ilvl="0">
+      <w:start w:val="1"/>
+      <w:numFmt w:val="decimal"/>
+      <w:lvlText w:val="%1."/>
+      <w:lvlJc w:val="left"/>
+      <w:pPr>
+        <w:tabs>
+          <w:tab w:val="num" w:pos="720"/>
+        </w:tabs>
+        <w:ind w:left="720" w:hanging="360"/>
+      </w:pPr>
+    </w:lvl>
+    <w:lvl w:ilvl="1">
+      <w:start w:val="1"/>
+      <w:numFmt w:val="bullet"/>
+      <w:lvlText w:val="o"/>
+      <w:lvlJc w:val="left"/>
+      <w:pPr>
+        <w:tabs>
+          <w:tab w:val="num" w:pos="1440"/>
+        </w:tabs>
+        <w:ind w:left="1440" w:hanging="360"/>
+      </w:pPr>
+      <w:rPr>
+        <w:rFonts w:ascii="Courier New" w:hAnsi="Courier New" w:hint="default"/>
+        <w:sz w:val="20"/>
+      </w:rPr>
+    </w:lvl>
+    <w:lvl w:ilvl="2" w:tentative="1">
+      <w:start w:val="1"/>
+      <w:numFmt w:val="decimal"/>
+      <w:lvlText w:val="%3."/>
+      <w:lvlJc w:val="left"/>
+      <w:pPr>
+        <w:tabs>
+          <w:tab w:val="num" w:pos="2160"/>
+        </w:tabs>
+        <w:ind w:left="2160" w:hanging="360"/>
+      </w:pPr>
+    </w:lvl>
+    <w:lvl w:ilvl="3" w:tentative="1">
+      <w:start w:val="1"/>
+      <w:numFmt w:val="decimal"/>
+      <w:lvlText w:val="%4."/>
+      <w:lvlJc w:val="left"/>
+      <w:pPr>
+        <w:tabs>
+          <w:tab w:val="num" w:pos="2880"/>
+        </w:tabs>
+        <w:ind w:left="2880" w:hanging="360"/>
+      </w:pPr>
+    </w:lvl>
+    <w:lvl w:ilvl="4" w:tentative="1">
+      <w:start w:val="1"/>
+      <w:numFmt w:val="decimal"/>
+      <w:lvlText w:val="%5."/>
+      <w:lvlJc w:val="left"/>
+      <w:pPr>
+        <w:tabs>
+          <w:tab w:val="num" w:pos="3600"/>
+        </w:tabs>
+        <w:ind w:left="3600" w:hanging="360"/>
+      </w:pPr>
+    </w:lvl>
+    <w:lvl w:ilvl="5" w:tentative="1">
+      <w:start w:val="1"/>
+      <w:numFmt w:val="decimal"/>
+      <w:lvlText w:val="%6."/>
+      <w:lvlJc w:val="left"/>
+      <w:pPr>
+        <w:tabs>
+          <w:tab w:val="num" w:pos="4320"/>
+        </w:tabs>
+        <w:ind w:left="4320" w:hanging="360"/>
+      </w:pPr>
+    </w:lvl>
+    <w:lvl w:ilvl="6" w:tentative="1">
+      <w:start w:val="1"/>
+      <w:numFmt w:val="decimal"/>
+      <w:lvlText w:val="%7."/>
+      <w:lvlJc w:val="left"/>
+      <w:pPr>
+        <w:tabs>
+          <w:tab w:val="num" w:pos="5040"/>
+        </w:tabs>
+        <w:ind w:left="5040" w:hanging="360"/>
+      </w:pPr>
+    </w:lvl>
+    <w:lvl w:ilvl="7" w:tentative="1">
+      <w:start w:val="1"/>
+      <w:numFmt w:val="decimal"/>
+      <w:lvlText w:val="%8."/>
+      <w:lvlJc w:val="left"/>
+      <w:pPr>
+        <w:tabs>
+          <w:tab w:val="num" w:pos="5760"/>
+        </w:tabs>
+        <w:ind w:left="5760" w:hanging="360"/>
+      </w:pPr>
+    </w:lvl>
+    <w:lvl w:ilvl="8" w:tentative="1">
+      <w:start w:val="1"/>
+      <w:numFmt w:val="decimal"/>
+      <w:lvlText w:val="%9."/>
+      <w:lvlJc w:val="left"/>
+      <w:pPr>
+        <w:tabs>
+          <w:tab w:val="num" w:pos="6480"/>
+        </w:tabs>
+        <w:ind w:left="6480" w:hanging="360"/>
+      </w:pPr>
+    </w:lvl>
+  </w:abstractNum>
+  <w:abstractNum w:abstractNumId="10" w15:restartNumberingAfterBreak="0">
     <w:nsid w:val="46BF3F49"/>
     <w:multiLevelType w:val="multilevel"/>
     <w:tmpl w:val="98209440"/>
@@ -3519,7 +4222,7 @@
       </w:rPr>
     </w:lvl>
   </w:abstractNum>
-  <w:abstractNum w:abstractNumId="9" w15:restartNumberingAfterBreak="0">
+  <w:abstractNum w:abstractNumId="11" w15:restartNumberingAfterBreak="0">
     <w:nsid w:val="5D250D15"/>
     <w:multiLevelType w:val="multilevel"/>
     <w:tmpl w:val="3B603456"/>
@@ -3636,7 +4339,7 @@
       </w:pPr>
     </w:lvl>
   </w:abstractNum>
-  <w:abstractNum w:abstractNumId="10" w15:restartNumberingAfterBreak="0">
+  <w:abstractNum w:abstractNumId="12" w15:restartNumberingAfterBreak="0">
     <w:nsid w:val="5F1D173C"/>
     <w:multiLevelType w:val="hybridMultilevel"/>
     <w:tmpl w:val="3474A73E"/>
@@ -3725,7 +4428,7 @@
       </w:pPr>
     </w:lvl>
   </w:abstractNum>
-  <w:abstractNum w:abstractNumId="11" w15:restartNumberingAfterBreak="0">
+  <w:abstractNum w:abstractNumId="13" w15:restartNumberingAfterBreak="0">
     <w:nsid w:val="647231A7"/>
     <w:multiLevelType w:val="multilevel"/>
     <w:tmpl w:val="0FBCF56C"/>
@@ -3874,7 +4577,7 @@
       </w:rPr>
     </w:lvl>
   </w:abstractNum>
-  <w:abstractNum w:abstractNumId="12" w15:restartNumberingAfterBreak="0">
+  <w:abstractNum w:abstractNumId="14" w15:restartNumberingAfterBreak="0">
     <w:nsid w:val="6C247A5B"/>
     <w:multiLevelType w:val="multilevel"/>
     <w:tmpl w:val="8A30DFC0"/>
@@ -4023,7 +4726,7 @@
       </w:rPr>
     </w:lvl>
   </w:abstractNum>
-  <w:abstractNum w:abstractNumId="13" w15:restartNumberingAfterBreak="0">
+  <w:abstractNum w:abstractNumId="15" w15:restartNumberingAfterBreak="0">
     <w:nsid w:val="6E061A34"/>
     <w:multiLevelType w:val="multilevel"/>
     <w:tmpl w:val="C9BCE976"/>
@@ -4172,7 +4875,7 @@
       </w:rPr>
     </w:lvl>
   </w:abstractNum>
-  <w:abstractNum w:abstractNumId="14" w15:restartNumberingAfterBreak="0">
+  <w:abstractNum w:abstractNumId="16" w15:restartNumberingAfterBreak="0">
     <w:nsid w:val="74925221"/>
     <w:multiLevelType w:val="multilevel"/>
     <w:tmpl w:val="0B66B136"/>
@@ -4288,7 +4991,7 @@
       </w:pPr>
     </w:lvl>
   </w:abstractNum>
-  <w:abstractNum w:abstractNumId="15" w15:restartNumberingAfterBreak="0">
+  <w:abstractNum w:abstractNumId="17" w15:restartNumberingAfterBreak="0">
     <w:nsid w:val="771A5FD7"/>
     <w:multiLevelType w:val="hybridMultilevel"/>
     <w:tmpl w:val="E996D414"/>
@@ -4384,18 +5087,91 @@
     <w:abstractNumId w:val="0"/>
   </w:num>
   <w:num w:numId="3" w16cid:durableId="1958441245">
-    <w:abstractNumId w:val="5"/>
+    <w:abstractNumId w:val="6"/>
   </w:num>
   <w:num w:numId="4" w16cid:durableId="1193811638">
+    <w:abstractNumId w:val="17"/>
+  </w:num>
+  <w:num w:numId="5" w16cid:durableId="1490900217">
+    <w:abstractNumId w:val="12"/>
+  </w:num>
+  <w:num w:numId="6" w16cid:durableId="631012462">
+    <w:abstractNumId w:val="11"/>
+  </w:num>
+  <w:num w:numId="7" w16cid:durableId="108552247">
+    <w:abstractNumId w:val="11"/>
+    <w:lvlOverride w:ilvl="1">
+      <w:lvl w:ilvl="1">
+        <w:numFmt w:val="bullet"/>
+        <w:lvlText w:val=""/>
+        <w:lvlJc w:val="left"/>
+        <w:pPr>
+          <w:tabs>
+            <w:tab w:val="num" w:pos="1440"/>
+          </w:tabs>
+          <w:ind w:left="1440" w:hanging="360"/>
+        </w:pPr>
+        <w:rPr>
+          <w:rFonts w:ascii="Symbol" w:hAnsi="Symbol" w:hint="default"/>
+          <w:sz w:val="20"/>
+        </w:rPr>
+      </w:lvl>
+    </w:lvlOverride>
+  </w:num>
+  <w:num w:numId="8" w16cid:durableId="1587349411">
+    <w:abstractNumId w:val="11"/>
+    <w:lvlOverride w:ilvl="1">
+      <w:lvl w:ilvl="1">
+        <w:numFmt w:val="bullet"/>
+        <w:lvlText w:val=""/>
+        <w:lvlJc w:val="left"/>
+        <w:pPr>
+          <w:tabs>
+            <w:tab w:val="num" w:pos="1440"/>
+          </w:tabs>
+          <w:ind w:left="1440" w:hanging="360"/>
+        </w:pPr>
+        <w:rPr>
+          <w:rFonts w:ascii="Symbol" w:hAnsi="Symbol" w:hint="default"/>
+          <w:sz w:val="20"/>
+        </w:rPr>
+      </w:lvl>
+    </w:lvlOverride>
+  </w:num>
+  <w:num w:numId="9" w16cid:durableId="607004662">
+    <w:abstractNumId w:val="4"/>
+  </w:num>
+  <w:num w:numId="10" w16cid:durableId="987396586">
+    <w:abstractNumId w:val="16"/>
+  </w:num>
+  <w:num w:numId="11" w16cid:durableId="1334188021">
+    <w:abstractNumId w:val="7"/>
+  </w:num>
+  <w:num w:numId="12" w16cid:durableId="183787868">
+    <w:abstractNumId w:val="1"/>
+  </w:num>
+  <w:num w:numId="13" w16cid:durableId="2022930733">
+    <w:abstractNumId w:val="13"/>
+  </w:num>
+  <w:num w:numId="14" w16cid:durableId="591358420">
+    <w:abstractNumId w:val="2"/>
+  </w:num>
+  <w:num w:numId="15" w16cid:durableId="565651853">
+    <w:abstractNumId w:val="10"/>
+  </w:num>
+  <w:num w:numId="16" w16cid:durableId="1746878343">
+    <w:abstractNumId w:val="8"/>
+  </w:num>
+  <w:num w:numId="17" w16cid:durableId="1131482859">
+    <w:abstractNumId w:val="14"/>
+  </w:num>
+  <w:num w:numId="18" w16cid:durableId="2038000584">
     <w:abstractNumId w:val="15"/>
   </w:num>
-  <w:num w:numId="5" w16cid:durableId="1490900217">
-    <w:abstractNumId w:val="10"/>
-  </w:num>
-  <w:num w:numId="6" w16cid:durableId="631012462">
+  <w:num w:numId="19" w16cid:durableId="1645230703">
     <w:abstractNumId w:val="9"/>
   </w:num>
-  <w:num w:numId="7" w16cid:durableId="108552247">
+  <w:num w:numId="20" w16cid:durableId="1035882733">
     <w:abstractNumId w:val="9"/>
     <w:lvlOverride w:ilvl="1">
       <w:lvl w:ilvl="1">
@@ -4415,7 +5191,7 @@
       </w:lvl>
     </w:lvlOverride>
   </w:num>
-  <w:num w:numId="8" w16cid:durableId="1587349411">
+  <w:num w:numId="21" w16cid:durableId="1475679022">
     <w:abstractNumId w:val="9"/>
     <w:lvlOverride w:ilvl="1">
       <w:lvl w:ilvl="1">
@@ -4435,35 +5211,28 @@
       </w:lvl>
     </w:lvlOverride>
   </w:num>
-  <w:num w:numId="9" w16cid:durableId="607004662">
-    <w:abstractNumId w:val="4"/>
+  <w:num w:numId="22" w16cid:durableId="1070343533">
+    <w:abstractNumId w:val="9"/>
+    <w:lvlOverride w:ilvl="1">
+      <w:lvl w:ilvl="1">
+        <w:numFmt w:val="bullet"/>
+        <w:lvlText w:val=""/>
+        <w:lvlJc w:val="left"/>
+        <w:pPr>
+          <w:tabs>
+            <w:tab w:val="num" w:pos="1440"/>
+          </w:tabs>
+          <w:ind w:left="1440" w:hanging="360"/>
+        </w:pPr>
+        <w:rPr>
+          <w:rFonts w:ascii="Symbol" w:hAnsi="Symbol" w:hint="default"/>
+          <w:sz w:val="20"/>
+        </w:rPr>
+      </w:lvl>
+    </w:lvlOverride>
   </w:num>
-  <w:num w:numId="10" w16cid:durableId="987396586">
-    <w:abstractNumId w:val="14"/>
-  </w:num>
-  <w:num w:numId="11" w16cid:durableId="1334188021">
-    <w:abstractNumId w:val="6"/>
-  </w:num>
-  <w:num w:numId="12" w16cid:durableId="183787868">
-    <w:abstractNumId w:val="1"/>
-  </w:num>
-  <w:num w:numId="13" w16cid:durableId="2022930733">
-    <w:abstractNumId w:val="11"/>
-  </w:num>
-  <w:num w:numId="14" w16cid:durableId="591358420">
-    <w:abstractNumId w:val="2"/>
-  </w:num>
-  <w:num w:numId="15" w16cid:durableId="565651853">
-    <w:abstractNumId w:val="8"/>
-  </w:num>
-  <w:num w:numId="16" w16cid:durableId="1746878343">
-    <w:abstractNumId w:val="7"/>
-  </w:num>
-  <w:num w:numId="17" w16cid:durableId="1131482859">
-    <w:abstractNumId w:val="12"/>
-  </w:num>
-  <w:num w:numId="18" w16cid:durableId="2038000584">
-    <w:abstractNumId w:val="13"/>
+  <w:num w:numId="23" w16cid:durableId="1968926336">
+    <w:abstractNumId w:val="5"/>
   </w:num>
 </w:numbering>
 </file>

</xml_diff>